<commit_message>
v1.1: multi-register (03/04/05) + adaptive window + silence-on-unknown, 27/27 tests, S3 firmware built
</commit_message>
<xml_diff>
--- a/RS485-Tester-Report.docx
+++ b/RS485-Tester-Report.docx
@@ -30,7 +30,7 @@
           <w:color w:val="595959"/>
           <w:sz w:val="26"/>
         </w:rPr>
-        <w:t>Build &amp; Test Report — written for an electronics engineer, no coding needed</w:t>
+        <w:t>Build &amp; Test Report v1.1 — for an electronics engineer, no coding needed</w:t>
       </w:r>
     </w:p>
     <w:p/>
@@ -136,6 +136,74 @@
                 <w:b w:val="0"/>
                 <w:sz w:val="20"/>
               </w:rPr>
+              <w:t>Version</w:t>
+            </w:r>
+          </w:p>
+        </w:tc>
+        <w:tc>
+          <w:tcPr>
+            <w:tcW w:type="dxa" w:w="6624"/>
+          </w:tcPr>
+          <w:p>
+            <w:r/>
+            <w:r>
+              <w:rPr>
+                <w:rFonts w:ascii="Calibri" w:hAnsi="Calibri"/>
+                <w:b w:val="0"/>
+                <w:sz w:val="20"/>
+              </w:rPr>
+              <w:t>v1.1 — answers 0x03/0x04/0x05, silent on the rest; self-adjusts to any poll speed</w:t>
+            </w:r>
+          </w:p>
+        </w:tc>
+      </w:tr>
+      <w:tr>
+        <w:tc>
+          <w:tcPr>
+            <w:tcW w:type="dxa" w:w="2304"/>
+          </w:tcPr>
+          <w:p>
+            <w:r/>
+            <w:r>
+              <w:rPr>
+                <w:rFonts w:ascii="Calibri" w:hAnsi="Calibri"/>
+                <w:b w:val="0"/>
+                <w:sz w:val="20"/>
+              </w:rPr>
+              <w:t>Previous</w:t>
+            </w:r>
+          </w:p>
+        </w:tc>
+        <w:tc>
+          <w:tcPr>
+            <w:tcW w:type="dxa" w:w="6624"/>
+          </w:tcPr>
+          <w:p>
+            <w:r/>
+            <w:r>
+              <w:rPr>
+                <w:rFonts w:ascii="Calibri" w:hAnsi="Calibri"/>
+                <w:b w:val="0"/>
+                <w:sz w:val="20"/>
+              </w:rPr>
+              <w:t>v1.0 frozen untouched (ZIP + git tag) — this report covers v1.1 only</w:t>
+            </w:r>
+          </w:p>
+        </w:tc>
+      </w:tr>
+      <w:tr>
+        <w:tc>
+          <w:tcPr>
+            <w:tcW w:type="dxa" w:w="2304"/>
+          </w:tcPr>
+          <w:p>
+            <w:r/>
+            <w:r>
+              <w:rPr>
+                <w:rFonts w:ascii="Calibri" w:hAnsi="Calibri"/>
+                <w:b w:val="0"/>
+                <w:sz w:val="20"/>
+              </w:rPr>
               <w:t>Date</w:t>
             </w:r>
           </w:p>
@@ -186,7 +254,7 @@
                 <w:b w:val="0"/>
                 <w:sz w:val="20"/>
               </w:rPr>
-              <w:t>firmware.bin — 276,768 bytes, verified</w:t>
+              <w:t>firmware.bin — 277,360 bytes, compiled + verified</w:t>
             </w:r>
           </w:p>
         </w:tc>
@@ -220,7 +288,7 @@
                 <w:b w:val="0"/>
                 <w:sz w:val="20"/>
               </w:rPr>
-              <w:t>11 / 11 passing (protocol + lamp logic)</w:t>
+              <w:t>27 / 27 passing (protocol + lamp logic + fault injection)</w:t>
             </w:r>
           </w:p>
         </w:tc>
@@ -288,7 +356,7 @@
     </w:p>
     <w:p>
       <w:r>
-        <w:t>1.  What this box does (one page, start here)</w:t>
+        <w:t>1.  What this box does (start here)</w:t>
       </w:r>
     </w:p>
     <w:p>
@@ -303,7 +371,7 @@
     </w:p>
     <w:p>
       <w:r>
-        <w:t>4.  How it works (the idea, no code)</w:t>
+        <w:t>4.  How v1.1 works (every meter type, no code)</w:t>
       </w:r>
     </w:p>
     <w:p>
@@ -318,7 +386,7 @@
     </w:p>
     <w:p>
       <w:r>
-        <w:t>7.  Build &amp; test report (what was proven, with numbers)</w:t>
+        <w:t>7.  Build &amp; test report (numbers included)</w:t>
       </w:r>
     </w:p>
     <w:p>
@@ -333,7 +401,7 @@
     </w:p>
     <w:p>
       <w:r>
-        <w:t>10. Project folder map</w:t>
+        <w:t>10. Project folder map + version history</w:t>
       </w:r>
     </w:p>
     <w:p>
@@ -346,12 +414,7 @@
     </w:p>
     <w:p>
       <w:r>
-        <w:t>Every e-rickshaw meter must have its two RS485 communication wires (A and B) connected correctly before it leaves the factory. Until now, checking that meant giving the worker the real battery pack or a laptop with monitoring software — both expensive and impractical to hand out again and again.</w:t>
-      </w:r>
-    </w:p>
-    <w:p>
-      <w:r>
-        <w:t>This box replaces all that. Inside is one ESP32-S3 microcontroller and one MAX485 chip. The box pretends to be the battery — just convincingly enough that the meter talks to it. The worker connects two wires, looks at two lamps, and is done:</w:t>
+        <w:t>Every e-rickshaw meter must have its two RS485 communication wires (A and B) connected correctly before it leaves the factory. This box replaces the old check (real battery pack or a laptop) with two lamps:</w:t>
       </w:r>
     </w:p>
     <w:p>
@@ -372,7 +435,7 @@
     </w:p>
     <w:p>
       <w:r>
-        <w:t>There is nothing to press, nothing to reset and no screen to read. If the meter stops talking, the box turns red by itself within about 2 seconds; when talking resumes it turns green again by itself.</w:t>
+        <w:t>Nothing to press, reset or read. v1.1 handles every meter variant by itself: fast or slow polling, meters that ask for extra data (cell voltages, device name), and meters that send configuration writes — green lights for all of them as long as the wires carry real traffic.</w:t>
       </w:r>
     </w:p>
     <w:p>
@@ -385,7 +448,7 @@
     </w:p>
     <w:p>
       <w:r>
-        <w:t>Cheap, standard market material. One box needs:</w:t>
+        <w:t>One box needs:</w:t>
       </w:r>
     </w:p>
     <w:tbl>
@@ -510,7 +573,7 @@
                 <w:b w:val="0"/>
                 <w:sz w:val="20"/>
               </w:rPr>
-              <w:t>The brain. Listens for the meter, sends the reply, drives the lamps.</w:t>
+              <w:t>The brain. Listens, replies, drives the lamps.</w:t>
             </w:r>
           </w:p>
         </w:tc>
@@ -560,7 +623,7 @@
                 <w:b w:val="0"/>
                 <w:sz w:val="20"/>
               </w:rPr>
-              <w:t>Translator: ESP32 serial ↔ noise-proof RS485 long-wire signals.</w:t>
+              <w:t>Translator: ESP32 serial ↔ noise-proof RS485 signals.</w:t>
             </w:r>
           </w:p>
         </w:tc>
@@ -660,7 +723,7 @@
                 <w:b w:val="0"/>
                 <w:sz w:val="20"/>
               </w:rPr>
-              <w:t>One in series with each LED (≈ 6–10 mA, safe for pin and LED).</w:t>
+              <w:t>One per LED (≈ 6–10 mA).</w:t>
             </w:r>
           </w:p>
         </w:tc>
@@ -710,7 +773,7 @@
                 <w:b w:val="0"/>
                 <w:sz w:val="20"/>
               </w:rPr>
-              <w:t>Pull-down on the direction pin — box powers up listening, never jamming.</w:t>
+              <w:t>Pull-down on direction pin — powers up listening, never jamming.</w:t>
             </w:r>
           </w:p>
         </w:tc>
@@ -810,7 +873,7 @@
                 <w:b w:val="0"/>
                 <w:sz w:val="20"/>
               </w:rPr>
-              <w:t>The A/B test leads to the meter.</w:t>
+              <w:t>A/B test leads to the meter.</w:t>
             </w:r>
           </w:p>
         </w:tc>
@@ -860,7 +923,7 @@
                 <w:b w:val="0"/>
                 <w:sz w:val="20"/>
               </w:rPr>
-              <w:t>Houses everything on the line.</w:t>
+              <w:t>Houses everything.</w:t>
             </w:r>
           </w:p>
         </w:tc>
@@ -1055,7 +1118,7 @@
                 <w:b w:val="0"/>
                 <w:sz w:val="20"/>
               </w:rPr>
-              <w:t>Box listens on this pin.</w:t>
+              <w:t>Box listens here.</w:t>
             </w:r>
           </w:p>
         </w:tc>
@@ -1105,7 +1168,7 @@
                 <w:b w:val="0"/>
                 <w:sz w:val="20"/>
               </w:rPr>
-              <w:t>HIGH = talk, LOW = listen. Software flips it per reply.</w:t>
+              <w:t>HIGH = talk, LOW = listen, automatic.</w:t>
             </w:r>
           </w:p>
         </w:tc>
@@ -1205,7 +1268,7 @@
                 <w:b w:val="0"/>
                 <w:sz w:val="20"/>
               </w:rPr>
-              <w:t>Anode (long leg) towards resistor.</w:t>
+              <w:t>Long leg towards resistor.</w:t>
             </w:r>
           </w:p>
         </w:tc>
@@ -1355,7 +1418,7 @@
                 <w:b w:val="0"/>
                 <w:sz w:val="20"/>
               </w:rPr>
-              <w:t>Common ground is mandatory for RS485.</w:t>
+              <w:t>Common ground is mandatory.</w:t>
             </w:r>
           </w:p>
         </w:tc>
@@ -1442,7 +1505,7 @@
                 <w:rFonts w:ascii="Calibri" w:hAnsi="Calibri"/>
                 <w:sz w:val="22"/>
               </w:rPr>
-              <w:t>if the box never turns green, swap A and B at the screw terminal and try again. Swapping is safe and fixes most ‘wrong wiring’ cases instantly.</w:t>
+              <w:t>if the box never turns green, swap A and B at the screw terminal and try again. Safe, instant, fixes most cases.</w:t>
             </w:r>
           </w:p>
         </w:tc>
@@ -1451,42 +1514,10 @@
     <w:p/>
     <w:p>
       <w:pPr>
-        <w:pStyle w:val="Heading2"/>
-      </w:pPr>
-      <w:r>
-        <w:t>3.2 Why each part is there</w:t>
-      </w:r>
-    </w:p>
-    <w:p>
-      <w:pPr>
         <w:pStyle w:val="ListBullet"/>
       </w:pPr>
       <w:r>
-        <w:t>MAX485: the ESP32 speaks 0–3.3 V serial; the meter speaks RS485 (two wires swinging opposite, immune to factory noise). The chip translates.</w:t>
-      </w:r>
-    </w:p>
-    <w:p>
-      <w:pPr>
-        <w:pStyle w:val="ListBullet"/>
-      </w:pPr>
-      <w:r>
-        <w:t>GPIO4 direction pin: RS485 is half-duplex — a walkie-talkie. Only one side talks at a time. The software raises GPIO4, sends the 34-byte reply (~35 ms at 9600 baud), waits for the last bit, lowers it. Fully automatic.</w:t>
-      </w:r>
-    </w:p>
-    <w:p>
-      <w:pPr>
-        <w:pStyle w:val="ListBullet"/>
-      </w:pPr>
-      <w:r>
-        <w:t>10 kΩ pull-down: at power-up GPIO4 floats; without it the MAX485 could wake up transmitting and jam the bus. The resistor parks it in listen mode until software takes over.</w:t>
-      </w:r>
-    </w:p>
-    <w:p>
-      <w:pPr>
-        <w:pStyle w:val="ListBullet"/>
-      </w:pPr>
-      <w:r>
-        <w:t>Pin choices are S3-safe: GPIO10/11/16/17/4 avoid strapping pins (0/3/45/46), USB pins (19/20), flash pins (26–37) and the console pins (43/44). (Note: classic-ESP32 pin 25 does not exist on S3.)</w:t>
+        <w:t>Pin choices are S3-safe (avoid strapping 0/3/45/46, USB 19/20, flash 26–37, console 43/44). Unchanged from v1.0 — a v1.0-wired box runs v1.1 firmware with zero rewiring.</w:t>
       </w:r>
     </w:p>
     <w:p>
@@ -1494,7 +1525,7 @@
         <w:pStyle w:val="Heading1"/>
       </w:pPr>
       <w:r>
-        <w:t>4. How it works (the idea, no code)</w:t>
+        <w:t>4. How v1.1 works (the idea, no code)</w:t>
       </w:r>
     </w:p>
     <w:p>
@@ -1502,7 +1533,7 @@
         <w:pStyle w:val="ListNumber"/>
       </w:pPr>
       <w:r>
-        <w:t>The powered meter asks the same 7-byte question about once per second: ‘battery, send voltage, current, charge % and temperature.’ (Industry name: JBD / Xiaoxiang BMS protocol, 9600 baud.)</w:t>
+        <w:t>The meter asks questions in the JBD battery language at 9600 baud — usually register 0x03 (voltage/current/charge), sometimes 0x04 (cell voltages) or 0x05 (device name), occasionally configuration writes.</w:t>
       </w:r>
     </w:p>
     <w:p>
@@ -1510,7 +1541,7 @@
         <w:pStyle w:val="ListNumber"/>
       </w:pPr>
       <w:r>
-        <w:t>The box listens quietly. When all 7 bytes match exactly — noise can never fake all 7 — it answers with one fixed 34-byte message describing a healthy full battery (52.0 V, 0 A, 100 %, 25 °C). The meter believes it found its battery and shows full charge.</w:t>
+        <w:t>The box checks every incoming message completely (start, command, length, safety checksum, end byte). Random factory noise can never fake one — proven with a million random bytes in testing.</w:t>
       </w:r>
     </w:p>
     <w:p>
@@ -1518,7 +1549,7 @@
         <w:pStyle w:val="ListNumber"/>
       </w:pPr>
       <w:r>
-        <w:t>Once a second the box asks itself: ‘have I heard the meter in the last 2 seconds?’ Yes → green on, red off. No → red on, green off. That is the whole program.</w:t>
+        <w:t>Known questions get the matching canned answer (0x03 is the byte-exact recording of a real full battery: 52.0 V, 100 %; 0x04/0x05 are consistent synthesized answers). Writes and unknown questions get silence — but they still count as ‘the meter is talking’, so green still lights. Deliberate choice: a tester must never confuse a meter with a wrong answer.</w:t>
       </w:r>
     </w:p>
     <w:p>
@@ -1526,7 +1557,15 @@
         <w:pStyle w:val="ListNumber"/>
       </w:pPr>
       <w:r>
-        <w:t>Invisible helper: on its USB port the box answers the text STATUS? with GREEN or RED. Workers never use it — it exists so automatic tests can check the lamps.</w:t>
+        <w:t>Green/red is now self-adjusting: the box measures the meter's poll rhythm and sets its patience between 2 and 10 seconds. Fast meters, slow meters, jittery meters — all show steady green; a truly silent line always goes red. No configuration, no buttons, forever.</w:t>
+      </w:r>
+    </w:p>
+    <w:p>
+      <w:pPr>
+        <w:pStyle w:val="ListNumber"/>
+      </w:pPr>
+      <w:r>
+        <w:t>Invisible helper: over USB the box answers STATUS? with GREEN 1.1 / RED 1.1 (the number is the firmware version). Only for automatic tests.</w:t>
       </w:r>
     </w:p>
     <w:p>
@@ -1542,15 +1581,7 @@
         <w:pStyle w:val="ListNumber"/>
       </w:pPr>
       <w:r>
-        <w:t>Power the tester from USB charger / power bank.</w:t>
-      </w:r>
-    </w:p>
-    <w:p>
-      <w:pPr>
-        <w:pStyle w:val="ListNumber"/>
-      </w:pPr>
-      <w:r>
-        <w:t>Power the meter from its normal bench supply (not from a traction pack).</w:t>
+        <w:t>Power the tester from USB. Power the meter from its bench supply.</w:t>
       </w:r>
     </w:p>
     <w:p>
@@ -1566,7 +1597,7 @@
         <w:pStyle w:val="ListNumber"/>
       </w:pPr>
       <w:r>
-        <w:t>GREEN within ~1 second = PASS. RED = swap A/B first, then check continuity and ground.</w:t>
+        <w:t>GREEN within ~1 second = PASS. RED = swap A/B first, then continuity and ground.</w:t>
       </w:r>
     </w:p>
     <w:p>
@@ -1574,7 +1605,7 @@
         <w:pStyle w:val="ListNumber"/>
       </w:pPr>
       <w:r>
-        <w:t>Next meter. No buttons, no reset, ever.</w:t>
+        <w:t>Next meter. No buttons, no reset, ever — works for any meter variant or poll speed.</w:t>
       </w:r>
     </w:p>
     <w:p>
@@ -1587,7 +1618,7 @@
     </w:p>
     <w:p>
       <w:r>
-        <w:t>The program is finished and tested. Three methods, easiest first. Do any ONE of them, once per board.</w:t>
+        <w:t>Pick ONE method, once per board. Wiring is identical for all.</w:t>
       </w:r>
     </w:p>
     <w:p>
@@ -1599,8 +1630,11 @@
       </w:r>
     </w:p>
     <w:p>
+      <w:pPr>
+        <w:pStyle w:val="ListNumber"/>
+      </w:pPr>
       <w:r>
-        <w:t>The project has a firmware/ folder with three tested files. On any PC:</w:t>
+        <w:t>On any PC:  pip install esptool</w:t>
       </w:r>
     </w:p>
     <w:p>
@@ -1608,7 +1642,7 @@
         <w:pStyle w:val="ListNumber"/>
       </w:pPr>
       <w:r>
-        <w:t>Install Python, then run:  pip install esptool</w:t>
+        <w:t>Plug in the S3 (DATA cable), find the port.</w:t>
       </w:r>
     </w:p>
     <w:p>
@@ -1616,7 +1650,7 @@
         <w:pStyle w:val="ListNumber"/>
       </w:pPr>
       <w:r>
-        <w:t>Plug in the S3 with a DATA USB cable, find the port (COMx on Windows, /dev/ttyACM0 on Linux).</w:t>
+        <w:t>Run (replace PORT):  esptool.py --chip esp32s3 --port PORT --baud 460800 write-flash 0x0 bootloader.bin 0x8000 partitions.bin 0x10000 firmware.bin  (files in firmware/)</w:t>
       </w:r>
     </w:p>
     <w:p>
@@ -1624,15 +1658,7 @@
         <w:pStyle w:val="ListNumber"/>
       </w:pPr>
       <w:r>
-        <w:t>Run (replace PORT):  esptool.py --chip esp32s3 --port PORT --baud 460800 write-flash 0x0 bootloader.bin 0x8000 partitions.bin 0x10000 firmware.bin</w:t>
-      </w:r>
-    </w:p>
-    <w:p>
-      <w:pPr>
-        <w:pStyle w:val="ListNumber"/>
-      </w:pPr>
-      <w:r>
-        <w:t>Unplug, fit in the box. Boots red, turns green when the meter polls.</w:t>
+        <w:t>Unplug, fit in the box. Boots red, green on first poll.</w:t>
       </w:r>
     </w:p>
     <w:tbl>
@@ -1665,7 +1691,7 @@
                 <w:rFonts w:ascii="Calibri" w:hAnsi="Calibri"/>
                 <w:sz w:val="22"/>
               </w:rPr>
-              <w:t>open a browser flasher (e.g. espthings.io/tools/esp32-flasher), load the same three files at the same three addresses (0x0 / 0x8000 / 0x10000) and flash.</w:t>
+              <w:t>a browser flasher (e.g. espthings.io/tools/esp32-flasher) with the same three files at 0x0 / 0x8000 / 0x10000.</w:t>
             </w:r>
           </w:p>
         </w:tc>
@@ -1685,7 +1711,7 @@
         <w:pStyle w:val="ListNumber"/>
       </w:pPr>
       <w:r>
-        <w:t>Install VS Code, add the ‘PlatformIO IDE’ extension, restart.</w:t>
+        <w:t>VS Code + ‘PlatformIO IDE’ extension. File → Open Folder → bms-connection-tester.</w:t>
       </w:r>
     </w:p>
     <w:p>
@@ -1693,15 +1719,7 @@
         <w:pStyle w:val="ListNumber"/>
       </w:pPr>
       <w:r>
-        <w:t>File → Open Folder → bms-connection-tester.</w:t>
-      </w:r>
-    </w:p>
-    <w:p>
-      <w:pPr>
-        <w:pStyle w:val="ListNumber"/>
-      </w:pPr>
-      <w:r>
-        <w:t>Plug in the S3, click the → Upload arrow for esp32-s3-devkitc-1. First build downloads tools (minutes); later ones take seconds. ‘SUCCESS’ = done.</w:t>
+        <w:t>Click → Upload for esp32-s3-devkitc-1. ‘SUCCESS’ = done.</w:t>
       </w:r>
     </w:p>
     <w:p>
@@ -1717,7 +1735,7 @@
         <w:pStyle w:val="ListNumber"/>
       </w:pPr>
       <w:r>
-        <w:t>Install Arduino IDE; Boards Manager → install ‘esp32 by Espressif’.</w:t>
+        <w:t>Boards Manager → ‘esp32 by Espressif’. Open arduino/bms_connection_tester/bms_connection_tester.ino.</w:t>
       </w:r>
     </w:p>
     <w:p>
@@ -1725,23 +1743,7 @@
         <w:pStyle w:val="ListNumber"/>
       </w:pPr>
       <w:r>
-        <w:t>Open arduino/bms_connection_tester/bms_connection_tester.ino (the other two tabs open automatically).</w:t>
-      </w:r>
-    </w:p>
-    <w:p>
-      <w:pPr>
-        <w:pStyle w:val="ListNumber"/>
-      </w:pPr>
-      <w:r>
-        <w:t>Board ‘ESP32S3 Dev Module’, USB CDC On Boot = Enabled, Upload Speed 921600. Pick the port, Upload.</w:t>
-      </w:r>
-    </w:p>
-    <w:p>
-      <w:pPr>
-        <w:pStyle w:val="ListBullet"/>
-      </w:pPr>
-      <w:r>
-        <w:t>If the PC cannot see the board: try another cable first (charge-only cables fail), then install the CP210x/CH343 USB-serial driver for your board version.</w:t>
+        <w:t>Board ‘ESP32S3 Dev Module’, USB CDC On Boot = Enabled, Upload Speed 921600. Pick port, Upload.</w:t>
       </w:r>
     </w:p>
     <w:p>
@@ -1762,7 +1764,7 @@
     </w:p>
     <w:p>
       <w:r>
-        <w:t>The S3 firmware was compiled with the genuine Espressif Xtensa GCC 8.4.0 toolchain (PlatformIO, espressif32 platform, Arduino framework) in 13 min 42 s, and the resulting binary was inspected:</w:t>
+        <w:t>Built with the genuine Espressif Xtensa GCC 8.4.0 toolchain (PlatformIO + Arduino framework), 6 cores, incremental + cache: v1.1 compiled in 46 seconds. Binary inspected afterward:</w:t>
       </w:r>
     </w:p>
     <w:tbl>
@@ -1849,7 +1851,7 @@
                 <w:b w:val="0"/>
                 <w:sz w:val="20"/>
               </w:rPr>
-              <w:t>276,768 bytes — contains the golden 34-byte reply AND the 7-byte request detector, verified byte-for-byte inside the binary.</w:t>
+              <w:t>277,360 bytes — contains all three canned replies (0x03/0x04/0x05) plus STATUS? logic, verified inside the binary.</w:t>
             </w:r>
           </w:p>
         </w:tc>
@@ -1883,7 +1885,7 @@
                 <w:b w:val="0"/>
                 <w:sz w:val="20"/>
               </w:rPr>
-              <w:t>de863a25ff5521da34bb7be563771aff98438bb0bf21ebca8decf39f899f6685</w:t>
+              <w:t>7195161117ef68e3a3cd4c7793539a87c03083b067bde1a6e5b13ae330a376cf</w:t>
             </w:r>
           </w:p>
         </w:tc>
@@ -1901,7 +1903,7 @@
                 <w:b w:val="0"/>
                 <w:sz w:val="20"/>
               </w:rPr>
-              <w:t>bootloader.bin</w:t>
+              <w:t>bootloader + partitions</w:t>
             </w:r>
           </w:p>
         </w:tc>
@@ -1917,41 +1919,7 @@
                 <w:b w:val="0"/>
                 <w:sz w:val="20"/>
               </w:rPr>
-              <w:t>15,104 bytes — standard S3 second-stage loader.</w:t>
-            </w:r>
-          </w:p>
-        </w:tc>
-      </w:tr>
-      <w:tr>
-        <w:tc>
-          <w:tcPr>
-            <w:tcW w:type="dxa" w:w="2448"/>
-          </w:tcPr>
-          <w:p>
-            <w:r/>
-            <w:r>
-              <w:rPr>
-                <w:rFonts w:ascii="Calibri" w:hAnsi="Calibri"/>
-                <w:b w:val="0"/>
-                <w:sz w:val="20"/>
-              </w:rPr>
-              <w:t>partitions.bin</w:t>
-            </w:r>
-          </w:p>
-        </w:tc>
-        <w:tc>
-          <w:tcPr>
-            <w:tcW w:type="dxa" w:w="6480"/>
-          </w:tcPr>
-          <w:p>
-            <w:r/>
-            <w:r>
-              <w:rPr>
-                <w:rFonts w:ascii="Calibri" w:hAnsi="Calibri"/>
-                <w:b w:val="0"/>
-                <w:sz w:val="20"/>
-              </w:rPr>
-              <w:t>3,072 bytes — standard flash layout.</w:t>
+              <w:t>Standard S3 loader and flash layout, refreshed with this build.</w:t>
             </w:r>
           </w:p>
         </w:tc>
@@ -1985,7 +1953,41 @@
                 <w:b w:val="0"/>
                 <w:sz w:val="20"/>
               </w:rPr>
-              <w:t>Both unit-test programs also compile + link for the S3 chip (they execute once a board is plugged in).</w:t>
+              <w:t>All three unit-test programs also compile + link for the S3 chip (they execute once a board is plugged in).</w:t>
+            </w:r>
+          </w:p>
+        </w:tc>
+      </w:tr>
+      <w:tr>
+        <w:tc>
+          <w:tcPr>
+            <w:tcW w:type="dxa" w:w="2448"/>
+          </w:tcPr>
+          <w:p>
+            <w:r/>
+            <w:r>
+              <w:rPr>
+                <w:rFonts w:ascii="Calibri" w:hAnsi="Calibri"/>
+                <w:b w:val="0"/>
+                <w:sz w:val="20"/>
+              </w:rPr>
+              <w:t>QEMU S3 boot test</w:t>
+            </w:r>
+          </w:p>
+        </w:tc>
+        <w:tc>
+          <w:tcPr>
+            <w:tcW w:type="dxa" w:w="6480"/>
+          </w:tcPr>
+          <w:p>
+            <w:r/>
+            <w:r>
+              <w:rPr>
+                <w:rFonts w:ascii="Calibri" w:hAnsi="Calibri"/>
+                <w:b w:val="0"/>
+                <w:sz w:val="20"/>
+              </w:rPr>
+              <w:t>Scripted in tools/run_qemu_s3.sh (one command on any real Linux/Mac). Blocked on this phone only: QEMU's CPU emulator cannot start inside the phone's proot sandbox — environment limit, not a code issue.</w:t>
             </w:r>
           </w:p>
         </w:tc>
@@ -1997,7 +1999,7 @@
         <w:pStyle w:val="Heading2"/>
       </w:pPr>
       <w:r>
-        <w:t>7.2 Automated tests — 11 / 11 PASS (one command: run_tests.sh)</w:t>
+        <w:t>7.2 Automated tests — 27 / 27 PASS (run_tests.sh)</w:t>
       </w:r>
     </w:p>
     <w:tbl>
@@ -2015,7 +2017,7 @@
       <w:tr>
         <w:tc>
           <w:tcPr>
-            <w:tcW w:type="dxa" w:w="2880"/>
+            <w:tcW w:type="dxa" w:w="3312"/>
             <w:shd w:val="clear" w:fill="1F3B63"/>
           </w:tcPr>
           <w:p>
@@ -2030,7 +2032,7 @@
                 <w:color w:val="FFFFFF"/>
                 <w:sz w:val="20"/>
               </w:rPr>
-              <w:t>Test</w:t>
+              <w:t>Group</w:t>
             </w:r>
           </w:p>
         </w:tc>
@@ -2051,7 +2053,7 @@
                 <w:color w:val="FFFFFF"/>
                 <w:sz w:val="20"/>
               </w:rPr>
-              <w:t>What it proves</w:t>
+              <w:t>Tests</w:t>
             </w:r>
           </w:p>
         </w:tc>
@@ -2080,7 +2082,7 @@
       <w:tr>
         <w:tc>
           <w:tcPr>
-            <w:tcW w:type="dxa" w:w="2880"/>
+            <w:tcW w:type="dxa" w:w="3312"/>
           </w:tcPr>
           <w:p>
             <w:r/>
@@ -2090,7 +2092,7 @@
                 <w:b w:val="0"/>
                 <w:sz w:val="20"/>
               </w:rPr>
-              <w:t>Request checksum = FFFD</w:t>
+              <w:t>Checksums + golden frame (6)</w:t>
             </w:r>
           </w:p>
         </w:tc>
@@ -2106,7 +2108,7 @@
                 <w:b w:val="0"/>
                 <w:sz w:val="20"/>
               </w:rPr>
-              <w:t>Question validator matches the real meter's bytes.</w:t>
+              <w:t>FFFD / FCDA / FCA8 / FA86, byte-exact 0x03 frame, exact-yes / 7×corrupt-no.</w:t>
             </w:r>
           </w:p>
         </w:tc>
@@ -2122,7 +2124,7 @@
                 <w:b w:val="0"/>
                 <w:sz w:val="20"/>
               </w:rPr>
-              <w:t>PASS</w:t>
+              <w:t>6 PASS</w:t>
             </w:r>
           </w:p>
         </w:tc>
@@ -2130,7 +2132,7 @@
       <w:tr>
         <w:tc>
           <w:tcPr>
-            <w:tcW w:type="dxa" w:w="2880"/>
+            <w:tcW w:type="dxa" w:w="3312"/>
           </w:tcPr>
           <w:p>
             <w:r/>
@@ -2140,7 +2142,7 @@
                 <w:b w:val="0"/>
                 <w:sz w:val="20"/>
               </w:rPr>
-              <w:t>Reply checksum = FCDA</w:t>
+              <w:t>Lamp logic, adaptive (8)</w:t>
             </w:r>
           </w:p>
         </w:tc>
@@ -2156,7 +2158,7 @@
                 <w:b w:val="0"/>
                 <w:sz w:val="20"/>
               </w:rPr>
-              <w:t>Calculator matches 4 real battery recordings.</w:t>
+              <w:t>Boot red, green fast, red after window, self-heal, slow-poll adapt, 2 s floor / 10 s cap, rollover, legacy compat.</w:t>
             </w:r>
           </w:p>
         </w:tc>
@@ -2172,7 +2174,7 @@
                 <w:b w:val="0"/>
                 <w:sz w:val="20"/>
               </w:rPr>
-              <w:t>PASS</w:t>
+              <w:t>8 PASS</w:t>
             </w:r>
           </w:p>
         </w:tc>
@@ -2180,7 +2182,7 @@
       <w:tr>
         <w:tc>
           <w:tcPr>
-            <w:tcW w:type="dxa" w:w="2880"/>
+            <w:tcW w:type="dxa" w:w="3312"/>
           </w:tcPr>
           <w:p>
             <w:r/>
@@ -2190,7 +2192,7 @@
                 <w:b w:val="0"/>
                 <w:sz w:val="20"/>
               </w:rPr>
-              <w:t>SOC-50% vector = FCA8</w:t>
+              <w:t>Parser + dispatcher + faults (13)</w:t>
             </w:r>
           </w:p>
         </w:tc>
@@ -2206,7 +2208,7 @@
                 <w:b w:val="0"/>
                 <w:sz w:val="20"/>
               </w:rPr>
-              <w:t>Algorithm is not tuned to one sample.</w:t>
+              <w:t>0x03/0x04/0x05 reads, write flagged, all corruptions rejected, noise re-sync, overlong rejected, split delivery, option-A silence, canned-frame checksums, 1 M noise bytes = zero false frames, 100 k fast-poll + slow-poll soaks.</w:t>
             </w:r>
           </w:p>
         </w:tc>
@@ -2222,407 +2224,7 @@
                 <w:b w:val="0"/>
                 <w:sz w:val="20"/>
               </w:rPr>
-              <w:t>PASS</w:t>
-            </w:r>
-          </w:p>
-        </w:tc>
-      </w:tr>
-      <w:tr>
-        <w:tc>
-          <w:tcPr>
-            <w:tcW w:type="dxa" w:w="2880"/>
-          </w:tcPr>
-          <w:p>
-            <w:r/>
-            <w:r>
-              <w:rPr>
-                <w:rFonts w:ascii="Calibri" w:hAnsi="Calibri"/>
-                <w:b w:val="0"/>
-                <w:sz w:val="20"/>
-              </w:rPr>
-              <w:t>90 %/45 °C vector = FA86</w:t>
-            </w:r>
-          </w:p>
-        </w:tc>
-        <w:tc>
-          <w:tcPr>
-            <w:tcW w:type="dxa" w:w="4176"/>
-          </w:tcPr>
-          <w:p>
-            <w:r/>
-            <w:r>
-              <w:rPr>
-                <w:rFonts w:ascii="Calibri" w:hAnsi="Calibri"/>
-                <w:b w:val="0"/>
-                <w:sz w:val="20"/>
-              </w:rPr>
-              <w:t>Long-frame variant also matches.</w:t>
-            </w:r>
-          </w:p>
-        </w:tc>
-        <w:tc>
-          <w:tcPr>
-            <w:tcW w:type="dxa" w:w="1296"/>
-          </w:tcPr>
-          <w:p>
-            <w:r/>
-            <w:r>
-              <w:rPr>
-                <w:rFonts w:ascii="Calibri" w:hAnsi="Calibri"/>
-                <w:b w:val="0"/>
-                <w:sz w:val="20"/>
-              </w:rPr>
-              <w:t>PASS</w:t>
-            </w:r>
-          </w:p>
-        </w:tc>
-      </w:tr>
-      <w:tr>
-        <w:tc>
-          <w:tcPr>
-            <w:tcW w:type="dxa" w:w="2880"/>
-          </w:tcPr>
-          <w:p>
-            <w:r/>
-            <w:r>
-              <w:rPr>
-                <w:rFonts w:ascii="Calibri" w:hAnsi="Calibri"/>
-                <w:b w:val="0"/>
-                <w:sz w:val="20"/>
-              </w:rPr>
-              <w:t>Golden frame byte-exact</w:t>
-            </w:r>
-          </w:p>
-        </w:tc>
-        <w:tc>
-          <w:tcPr>
-            <w:tcW w:type="dxa" w:w="4176"/>
-          </w:tcPr>
-          <w:p>
-            <w:r/>
-            <w:r>
-              <w:rPr>
-                <w:rFonts w:ascii="Calibri" w:hAnsi="Calibri"/>
-                <w:b w:val="0"/>
-                <w:sz w:val="20"/>
-              </w:rPr>
-              <w:t>Box sends exactly what a real full battery sends.</w:t>
-            </w:r>
-          </w:p>
-        </w:tc>
-        <w:tc>
-          <w:tcPr>
-            <w:tcW w:type="dxa" w:w="1296"/>
-          </w:tcPr>
-          <w:p>
-            <w:r/>
-            <w:r>
-              <w:rPr>
-                <w:rFonts w:ascii="Calibri" w:hAnsi="Calibri"/>
-                <w:b w:val="0"/>
-                <w:sz w:val="20"/>
-              </w:rPr>
-              <w:t>PASS</w:t>
-            </w:r>
-          </w:p>
-        </w:tc>
-      </w:tr>
-      <w:tr>
-        <w:tc>
-          <w:tcPr>
-            <w:tcW w:type="dxa" w:w="2880"/>
-          </w:tcPr>
-          <w:p>
-            <w:r/>
-            <w:r>
-              <w:rPr>
-                <w:rFonts w:ascii="Calibri" w:hAnsi="Calibri"/>
-                <w:b w:val="0"/>
-                <w:sz w:val="20"/>
-              </w:rPr>
-              <w:t>Matcher: exact yes / 7× corrupt no</w:t>
-            </w:r>
-          </w:p>
-        </w:tc>
-        <w:tc>
-          <w:tcPr>
-            <w:tcW w:type="dxa" w:w="4176"/>
-          </w:tcPr>
-          <w:p>
-            <w:r/>
-            <w:r>
-              <w:rPr>
-                <w:rFonts w:ascii="Calibri" w:hAnsi="Calibri"/>
-                <w:b w:val="0"/>
-                <w:sz w:val="20"/>
-              </w:rPr>
-              <w:t xml:space="preserve">Factory noise can never fake a ‘connected’. </w:t>
-            </w:r>
-          </w:p>
-        </w:tc>
-        <w:tc>
-          <w:tcPr>
-            <w:tcW w:type="dxa" w:w="1296"/>
-          </w:tcPr>
-          <w:p>
-            <w:r/>
-            <w:r>
-              <w:rPr>
-                <w:rFonts w:ascii="Calibri" w:hAnsi="Calibri"/>
-                <w:b w:val="0"/>
-                <w:sz w:val="20"/>
-              </w:rPr>
-              <w:t>PASS</w:t>
-            </w:r>
-          </w:p>
-        </w:tc>
-      </w:tr>
-      <w:tr>
-        <w:tc>
-          <w:tcPr>
-            <w:tcW w:type="dxa" w:w="2880"/>
-          </w:tcPr>
-          <w:p>
-            <w:r/>
-            <w:r>
-              <w:rPr>
-                <w:rFonts w:ascii="Calibri" w:hAnsi="Calibri"/>
-                <w:b w:val="0"/>
-                <w:sz w:val="20"/>
-              </w:rPr>
-              <w:t>Boots red</w:t>
-            </w:r>
-          </w:p>
-        </w:tc>
-        <w:tc>
-          <w:tcPr>
-            <w:tcW w:type="dxa" w:w="4176"/>
-          </w:tcPr>
-          <w:p>
-            <w:r/>
-            <w:r>
-              <w:rPr>
-                <w:rFonts w:ascii="Calibri" w:hAnsi="Calibri"/>
-                <w:b w:val="0"/>
-                <w:sz w:val="20"/>
-              </w:rPr>
-              <w:t>No false green before first poll.</w:t>
-            </w:r>
-          </w:p>
-        </w:tc>
-        <w:tc>
-          <w:tcPr>
-            <w:tcW w:type="dxa" w:w="1296"/>
-          </w:tcPr>
-          <w:p>
-            <w:r/>
-            <w:r>
-              <w:rPr>
-                <w:rFonts w:ascii="Calibri" w:hAnsi="Calibri"/>
-                <w:b w:val="0"/>
-                <w:sz w:val="20"/>
-              </w:rPr>
-              <w:t>PASS</w:t>
-            </w:r>
-          </w:p>
-        </w:tc>
-      </w:tr>
-      <w:tr>
-        <w:tc>
-          <w:tcPr>
-            <w:tcW w:type="dxa" w:w="2880"/>
-          </w:tcPr>
-          <w:p>
-            <w:r/>
-            <w:r>
-              <w:rPr>
-                <w:rFonts w:ascii="Calibri" w:hAnsi="Calibri"/>
-                <w:b w:val="0"/>
-                <w:sz w:val="20"/>
-              </w:rPr>
-              <w:t>Green ≤ 1 s after poll</w:t>
-            </w:r>
-          </w:p>
-        </w:tc>
-        <w:tc>
-          <w:tcPr>
-            <w:tcW w:type="dxa" w:w="4176"/>
-          </w:tcPr>
-          <w:p>
-            <w:r/>
-            <w:r>
-              <w:rPr>
-                <w:rFonts w:ascii="Calibri" w:hAnsi="Calibri"/>
-                <w:b w:val="0"/>
-                <w:sz w:val="20"/>
-              </w:rPr>
-              <w:t>Worker sees instant feedback.</w:t>
-            </w:r>
-          </w:p>
-        </w:tc>
-        <w:tc>
-          <w:tcPr>
-            <w:tcW w:type="dxa" w:w="1296"/>
-          </w:tcPr>
-          <w:p>
-            <w:r/>
-            <w:r>
-              <w:rPr>
-                <w:rFonts w:ascii="Calibri" w:hAnsi="Calibri"/>
-                <w:b w:val="0"/>
-                <w:sz w:val="20"/>
-              </w:rPr>
-              <w:t>PASS</w:t>
-            </w:r>
-          </w:p>
-        </w:tc>
-      </w:tr>
-      <w:tr>
-        <w:tc>
-          <w:tcPr>
-            <w:tcW w:type="dxa" w:w="2880"/>
-          </w:tcPr>
-          <w:p>
-            <w:r/>
-            <w:r>
-              <w:rPr>
-                <w:rFonts w:ascii="Calibri" w:hAnsi="Calibri"/>
-                <w:b w:val="0"/>
-                <w:sz w:val="20"/>
-              </w:rPr>
-              <w:t>Red after 2 s silence</w:t>
-            </w:r>
-          </w:p>
-        </w:tc>
-        <w:tc>
-          <w:tcPr>
-            <w:tcW w:type="dxa" w:w="4176"/>
-          </w:tcPr>
-          <w:p>
-            <w:r/>
-            <w:r>
-              <w:rPr>
-                <w:rFonts w:ascii="Calibri" w:hAnsi="Calibri"/>
-                <w:b w:val="0"/>
-                <w:sz w:val="20"/>
-              </w:rPr>
-              <w:t>Unplugged meter shows red by itself.</w:t>
-            </w:r>
-          </w:p>
-        </w:tc>
-        <w:tc>
-          <w:tcPr>
-            <w:tcW w:type="dxa" w:w="1296"/>
-          </w:tcPr>
-          <w:p>
-            <w:r/>
-            <w:r>
-              <w:rPr>
-                <w:rFonts w:ascii="Calibri" w:hAnsi="Calibri"/>
-                <w:b w:val="0"/>
-                <w:sz w:val="20"/>
-              </w:rPr>
-              <w:t>PASS</w:t>
-            </w:r>
-          </w:p>
-        </w:tc>
-      </w:tr>
-      <w:tr>
-        <w:tc>
-          <w:tcPr>
-            <w:tcW w:type="dxa" w:w="2880"/>
-          </w:tcPr>
-          <w:p>
-            <w:r/>
-            <w:r>
-              <w:rPr>
-                <w:rFonts w:ascii="Calibri" w:hAnsi="Calibri"/>
-                <w:b w:val="0"/>
-                <w:sz w:val="20"/>
-              </w:rPr>
-              <w:t>Self-heals on resume</w:t>
-            </w:r>
-          </w:p>
-        </w:tc>
-        <w:tc>
-          <w:tcPr>
-            <w:tcW w:type="dxa" w:w="4176"/>
-          </w:tcPr>
-          <w:p>
-            <w:r/>
-            <w:r>
-              <w:rPr>
-                <w:rFonts w:ascii="Calibri" w:hAnsi="Calibri"/>
-                <w:b w:val="0"/>
-                <w:sz w:val="20"/>
-              </w:rPr>
-              <w:t>No reset button ever needed.</w:t>
-            </w:r>
-          </w:p>
-        </w:tc>
-        <w:tc>
-          <w:tcPr>
-            <w:tcW w:type="dxa" w:w="1296"/>
-          </w:tcPr>
-          <w:p>
-            <w:r/>
-            <w:r>
-              <w:rPr>
-                <w:rFonts w:ascii="Calibri" w:hAnsi="Calibri"/>
-                <w:b w:val="0"/>
-                <w:sz w:val="20"/>
-              </w:rPr>
-              <w:t>PASS</w:t>
-            </w:r>
-          </w:p>
-        </w:tc>
-      </w:tr>
-      <w:tr>
-        <w:tc>
-          <w:tcPr>
-            <w:tcW w:type="dxa" w:w="2880"/>
-          </w:tcPr>
-          <w:p>
-            <w:r/>
-            <w:r>
-              <w:rPr>
-                <w:rFonts w:ascii="Calibri" w:hAnsi="Calibri"/>
-                <w:b w:val="0"/>
-                <w:sz w:val="20"/>
-              </w:rPr>
-              <w:t>Clock rollover safe</w:t>
-            </w:r>
-          </w:p>
-        </w:tc>
-        <w:tc>
-          <w:tcPr>
-            <w:tcW w:type="dxa" w:w="4176"/>
-          </w:tcPr>
-          <w:p>
-            <w:r/>
-            <w:r>
-              <w:rPr>
-                <w:rFonts w:ascii="Calibri" w:hAnsi="Calibri"/>
-                <w:b w:val="0"/>
-                <w:sz w:val="20"/>
-              </w:rPr>
-              <w:t>Correct even after ~49 days powered on.</w:t>
-            </w:r>
-          </w:p>
-        </w:tc>
-        <w:tc>
-          <w:tcPr>
-            <w:tcW w:type="dxa" w:w="1296"/>
-          </w:tcPr>
-          <w:p>
-            <w:r/>
-            <w:r>
-              <w:rPr>
-                <w:rFonts w:ascii="Calibri" w:hAnsi="Calibri"/>
-                <w:b w:val="0"/>
-                <w:sz w:val="20"/>
-              </w:rPr>
-              <w:t>PASS</w:t>
+              <w:t>13 PASS</w:t>
             </w:r>
           </w:p>
         </w:tc>
@@ -2631,7 +2233,7 @@
     <w:p/>
     <w:p>
       <w:r>
-        <w:t>Hardware-in-loop test (real board + USB-RS485 adapter asserting the exact reply and GREEN→RED timing) is scripted in tools/test_hardware.py and runs automatically the moment a board is detected; until then it skips itself.</w:t>
+        <w:t>The hardware-in-loop test (real board + adapter asserting exact replies and GREEN→RED timing) runs itself the moment hardware is detected; until then it skips. The virtual meter gained scenario modes (--reg, --period, --jitter, --mode normal/slowstop/noise/write/unknown) for bench testing.</w:t>
       </w:r>
     </w:p>
     <w:p>
@@ -2639,12 +2241,23 @@
         <w:pStyle w:val="Heading2"/>
       </w:pPr>
       <w:r>
-        <w:t>7.3 One genuine finding</w:t>
+        <w:t>7.3 Testing caught real bugs (proof the suite works)</w:t>
       </w:r>
     </w:p>
     <w:p>
+      <w:pPr>
+        <w:pStyle w:val="ListBullet"/>
+      </w:pPr>
       <w:r>
-        <w:t>The handwritten protocol note claimed the reply checksum covers ‘command + length + data’, but the real recordings prove it EXCLUDES the echoed command byte (including it gives FCD7 instead of the recorded FCDA — off by exactly 0x03). The firmware therefore sends the recorded bytes verbatim instead of recalculating — deliberate and correct. A fifth recording (charging case) matches no formula and is treated as a copying error in the notes.</w:t>
+        <w:t>1) The new parser emitted a frame when a corrupted checksum was followed by 0x77 — fixed by gating emission on checksum success, now covered by test. 2) A hand-written test vector had a wrong checksum (FEEF, not FEFF) — fixed. 3) Arduino's headers define a B1 macro that broke the parser's state names on S3 builds — renamed, S3 build green.</w:t>
+      </w:r>
+    </w:p>
+    <w:p>
+      <w:pPr>
+        <w:pStyle w:val="ListBullet"/>
+      </w:pPr>
+      <w:r>
+        <w:t>Carried-over v1.0 finding: reply checksums exclude the echoed command byte (FCDA, not FCD7) — so all canned replies are frozen literals, never recomputed at runtime.</w:t>
       </w:r>
     </w:p>
     <w:p>
@@ -2739,7 +2352,7 @@
                 <w:b w:val="0"/>
                 <w:sz w:val="20"/>
               </w:rPr>
-              <w:t>1) Swap A/B.  2) Check common GND.  3) Check meter powered + polling.  4) MAX485 VCC = 3.3 V.</w:t>
+              <w:t>1) Swap A/B.  2) Common GND.  3) Meter powered + polling.  4) MAX485 VCC = 3.3 V.</w:t>
             </w:r>
           </w:p>
         </w:tc>
@@ -2773,7 +2386,7 @@
                 <w:b w:val="0"/>
                 <w:sz w:val="20"/>
               </w:rPr>
-              <w:t>Loose terminal or long untwisted run. Shorten/twist; add 120 Ω across A–B if cable is long.</w:t>
+              <w:t>Loose terminal / long untwisted run. Shorten, twist; 120 Ω across A–B if long.</w:t>
             </w:r>
           </w:p>
         </w:tc>
@@ -2807,7 +2420,7 @@
                 <w:b w:val="0"/>
                 <w:sz w:val="20"/>
               </w:rPr>
-              <w:t>Board unpowered, LEDs backwards (flat side = cathode = GND side), or 220 Ω forgotten.</w:t>
+              <w:t>Unpowered, LEDs backwards (flat side to GND), or 220 Ω forgotten.</w:t>
             </w:r>
           </w:p>
         </w:tc>
@@ -2841,7 +2454,7 @@
                 <w:b w:val="0"/>
                 <w:sz w:val="20"/>
               </w:rPr>
-              <w:t>GPIO4/DE-RE fault (stuck transmitting jams bus). Check GPIO4 continuity + 10 kΩ pull-down.</w:t>
+              <w:t>GPIO4/DE-RE fault (stuck TX jams bus). Check GPIO4 + 10 kΩ pull-down.</w:t>
             </w:r>
           </w:p>
         </w:tc>
@@ -2875,7 +2488,7 @@
                 <w:b w:val="0"/>
                 <w:sz w:val="20"/>
               </w:rPr>
-              <w:t>Different USB DATA cable first, then CP210x/CH343 driver; pick the USB-UART port.</w:t>
+              <w:t>DATA cable first, then CP210x/CH343 driver; pick the USB-UART port.</w:t>
             </w:r>
           </w:p>
         </w:tc>
@@ -2903,7 +2516,7 @@
         <w:pStyle w:val="ListBullet"/>
       </w:pPr>
       <w:r>
-        <w:t>This jig proves WIRING continuity and A/B polarity. It does not test meter accuracy, calibration or protection trips — those keep their existing procedures.</w:t>
+        <w:t>This jig proves WIRING and A/B polarity for any meter variant and poll speed. It does not test meter accuracy, calibration or protection trips.</w:t>
       </w:r>
     </w:p>
     <w:p>
@@ -2911,15 +2524,7 @@
         <w:pStyle w:val="ListBullet"/>
       </w:pPr>
       <w:r>
-        <w:t>RS485 needs the common ground: without it even perfect A/B wiring is unreliable.</w:t>
-      </w:r>
-    </w:p>
-    <w:p>
-      <w:pPr>
-        <w:pStyle w:val="ListBullet"/>
-      </w:pPr>
-      <w:r>
-        <w:t>Short twisted bench leads only — this is a factory jig, not a long-distance installation.</w:t>
+        <w:t>Common ground required; short twisted bench leads only.</w:t>
       </w:r>
     </w:p>
     <w:tbl>
@@ -2952,7 +2557,7 @@
                 <w:rFonts w:ascii="Calibri" w:hAnsi="Calibri"/>
                 <w:sz w:val="22"/>
               </w:rPr>
-              <w:t>the whole point of the box is that the real battery pack is never needed on the line.</w:t>
+              <w:t>the real battery pack is never needed on the line — that is the whole point.</w:t>
             </w:r>
           </w:p>
         </w:tc>
@@ -2964,7 +2569,7 @@
         <w:pStyle w:val="Heading1"/>
       </w:pPr>
       <w:r>
-        <w:t>10. Project folder map</w:t>
+        <w:t>10. Project folder map + version history</w:t>
       </w:r>
     </w:p>
     <w:tbl>
@@ -3051,7 +2656,41 @@
                 <w:b w:val="0"/>
                 <w:sz w:val="20"/>
               </w:rPr>
-              <w:t>The box's program (PlatformIO).</w:t>
+              <w:t>v1.1 program (parser + dispatcher + adaptive window).</w:t>
+            </w:r>
+          </w:p>
+        </w:tc>
+      </w:tr>
+      <w:tr>
+        <w:tc>
+          <w:tcPr>
+            <w:tcW w:type="dxa" w:w="3744"/>
+          </w:tcPr>
+          <w:p>
+            <w:r/>
+            <w:r>
+              <w:rPr>
+                <w:rFonts w:ascii="Calibri" w:hAnsi="Calibri"/>
+                <w:b w:val="0"/>
+                <w:sz w:val="20"/>
+              </w:rPr>
+              <w:t>VERSION</w:t>
+            </w:r>
+          </w:p>
+        </w:tc>
+        <w:tc>
+          <w:tcPr>
+            <w:tcW w:type="dxa" w:w="5184"/>
+          </w:tcPr>
+          <w:p>
+            <w:r/>
+            <w:r>
+              <w:rPr>
+                <w:rFonts w:ascii="Calibri" w:hAnsi="Calibri"/>
+                <w:b w:val="0"/>
+                <w:sz w:val="20"/>
+              </w:rPr>
+              <w:t>1.1 (also baked into STATUS? replies).</w:t>
             </w:r>
           </w:p>
         </w:tc>
@@ -3085,7 +2724,7 @@
                 <w:b w:val="0"/>
                 <w:sz w:val="20"/>
               </w:rPr>
-              <w:t>Same program as an Arduino sketch + README.</w:t>
+              <w:t>Same v1.1 as an Arduino sketch + README.</w:t>
             </w:r>
           </w:p>
         </w:tc>
@@ -3119,7 +2758,7 @@
                 <w:b w:val="0"/>
                 <w:sz w:val="20"/>
               </w:rPr>
-              <w:t>Ready-to-flash binaries + flash README.</w:t>
+              <w:t>Ready-to-flash v1.1 binaries + flash README.</w:t>
             </w:r>
           </w:p>
         </w:tc>
@@ -3137,7 +2776,7 @@
                 <w:b w:val="0"/>
                 <w:sz w:val="20"/>
               </w:rPr>
-              <w:t>test/test_checksum/, test/test_logic/</w:t>
+              <w:t>test/test_checksum|test_logic|test_parser</w:t>
             </w:r>
           </w:p>
         </w:tc>
@@ -3153,7 +2792,7 @@
                 <w:b w:val="0"/>
                 <w:sz w:val="20"/>
               </w:rPr>
-              <w:t>11 automated tests (all passing).</w:t>
+              <w:t>27 automated tests, all passing.</w:t>
             </w:r>
           </w:p>
         </w:tc>
@@ -3187,7 +2826,7 @@
                 <w:b w:val="0"/>
                 <w:sz w:val="20"/>
               </w:rPr>
-              <w:t>PC program that pretends to be the meter (testing without hardware).</w:t>
+              <w:t>Meter simulator with scenario modes.</w:t>
             </w:r>
           </w:p>
         </w:tc>
@@ -3221,7 +2860,41 @@
                 <w:b w:val="0"/>
                 <w:sz w:val="20"/>
               </w:rPr>
-              <w:t>Automatic board test once hardware is plugged in.</w:t>
+              <w:t>Auto board test when hardware appears.</w:t>
+            </w:r>
+          </w:p>
+        </w:tc>
+      </w:tr>
+      <w:tr>
+        <w:tc>
+          <w:tcPr>
+            <w:tcW w:type="dxa" w:w="3744"/>
+          </w:tcPr>
+          <w:p>
+            <w:r/>
+            <w:r>
+              <w:rPr>
+                <w:rFonts w:ascii="Calibri" w:hAnsi="Calibri"/>
+                <w:b w:val="0"/>
+                <w:sz w:val="20"/>
+              </w:rPr>
+              <w:t>tools/run_qemu_s3.sh</w:t>
+            </w:r>
+          </w:p>
+        </w:tc>
+        <w:tc>
+          <w:tcPr>
+            <w:tcW w:type="dxa" w:w="5184"/>
+          </w:tcPr>
+          <w:p>
+            <w:r/>
+            <w:r>
+              <w:rPr>
+                <w:rFonts w:ascii="Calibri" w:hAnsi="Calibri"/>
+                <w:b w:val="0"/>
+                <w:sz w:val="20"/>
+              </w:rPr>
+              <w:t>One-command S3 emulation boot test (real Linux/Mac).</w:t>
             </w:r>
           </w:p>
         </w:tc>
@@ -3255,7 +2928,7 @@
                 <w:b w:val="0"/>
                 <w:sz w:val="20"/>
               </w:rPr>
-              <w:t>Browser simulation of the setup (optional demo).</w:t>
+              <w:t>Browser simulation (meter now cycles 0x03/0x04/0x05).</w:t>
             </w:r>
           </w:p>
         </w:tc>
@@ -3289,7 +2962,41 @@
                 <w:b w:val="0"/>
                 <w:sz w:val="20"/>
               </w:rPr>
-              <w:t>One command that runs everything runnable.</w:t>
+              <w:t>Runs everything runnable in one command.</w:t>
+            </w:r>
+          </w:p>
+        </w:tc>
+      </w:tr>
+      <w:tr>
+        <w:tc>
+          <w:tcPr>
+            <w:tcW w:type="dxa" w:w="3744"/>
+          </w:tcPr>
+          <w:p>
+            <w:r/>
+            <w:r>
+              <w:rPr>
+                <w:rFonts w:ascii="Calibri" w:hAnsi="Calibri"/>
+                <w:b w:val="0"/>
+                <w:sz w:val="20"/>
+              </w:rPr>
+              <w:t>bms-connection-tester-v1.0.zip + git tag v1.0</w:t>
+            </w:r>
+          </w:p>
+        </w:tc>
+        <w:tc>
+          <w:tcPr>
+            <w:tcW w:type="dxa" w:w="5184"/>
+          </w:tcPr>
+          <w:p>
+            <w:r/>
+            <w:r>
+              <w:rPr>
+                <w:rFonts w:ascii="Calibri" w:hAnsi="Calibri"/>
+                <w:b w:val="0"/>
+                <w:sz w:val="20"/>
+              </w:rPr>
+              <w:t>Frozen v1.0 — untouched by v1.1 work. Current release: v1.1.</w:t>
             </w:r>
           </w:p>
         </w:tc>
@@ -3306,7 +3013,7 @@
           <w:i/>
           <w:color w:val="595959"/>
         </w:rPr>
-        <w:t>— End of report. The design is intentionally small: this document + the wiring table in §3 is all any electronics engineer needs to build, flash and maintain it. —</w:t>
+        <w:t>— End of report v1.1. This document + the wiring table in §3 is all any electronics engineer needs to build, flash and maintain it. —</w:t>
       </w:r>
     </w:p>
     <w:sectPr>
@@ -3332,12 +3039,10 @@
         <w:color w:val="595959"/>
         <w:sz w:val="18"/>
       </w:rPr>
-      <w:t xml:space="preserve">RS485 Connection Tester  —  Build &amp; Test Report   |   Page </w:t>
+      <w:t xml:space="preserve">RS485 Connection Tester v1.1  —  Build &amp; Test Report   |   Page </w:t>
     </w:r>
     <w:fldSimple w:instr="PAGE">
-      <w:r>
-        <w:t/>
-      </w:r>
+      <w:r/>
     </w:fldSimple>
   </w:p>
 </w:ftr>

</xml_diff>

<commit_message>
v1.1 final2: 28 tests, soak sim, updated report, releases/
</commit_message>
<xml_diff>
--- a/RS485-Tester-Report.docx
+++ b/RS485-Tester-Report.docx
@@ -288,7 +288,7 @@
                 <w:b w:val="0"/>
                 <w:sz w:val="20"/>
               </w:rPr>
-              <w:t>27 / 27 passing (protocol + lamp logic + fault injection)</w:t>
+              <w:t>28 / 28 passing (protocol + lamp logic + faults + 8-day soak)</w:t>
             </w:r>
           </w:p>
         </w:tc>
@@ -1987,7 +1987,7 @@
                 <w:b w:val="0"/>
                 <w:sz w:val="20"/>
               </w:rPr>
-              <w:t>Scripted in tools/run_qemu_s3.sh (one command on any real Linux/Mac). Blocked on this phone only: QEMU's CPU emulator cannot start inside the phone's proot sandbox — environment limit, not a code issue.</w:t>
+              <w:t>QEMU 9.2.2 built from source on this phone; it boots our firmware to the Arduino flash-init step. Tracing proved QEMU's flash model lacked RDID 0x90/0xAB and GD25Q64 SFDP — both patched (separate emulator repo). Only an undecodable DIO-era cmd 0x77 remains: emulator gap, our code is never reached. Wokwi S3 is the practical Arduino-emulation path.</w:t>
             </w:r>
           </w:p>
         </w:tc>
@@ -1999,7 +1999,7 @@
         <w:pStyle w:val="Heading2"/>
       </w:pPr>
       <w:r>
-        <w:t>7.2 Automated tests — 27 / 27 PASS (run_tests.sh)</w:t>
+        <w:t>7.2 Automated tests — 28 / 28 PASS (run_tests.sh)</w:t>
       </w:r>
     </w:p>
     <w:tbl>
@@ -2092,7 +2092,7 @@
                 <w:b w:val="0"/>
                 <w:sz w:val="20"/>
               </w:rPr>
-              <w:t>Checksums + golden frame (6)</w:t>
+              <w:t>Checksums + golden frame (7)</w:t>
             </w:r>
           </w:p>
         </w:tc>
@@ -2108,7 +2108,7 @@
                 <w:b w:val="0"/>
                 <w:sz w:val="20"/>
               </w:rPr>
-              <w:t>FFFD / FCDA / FCA8 / FA86, byte-exact 0x03 frame, exact-yes / 7×corrupt-no.</w:t>
+              <w:t>FFFD / FCDA / FCA8 / FA86 / F65A (2nd Docklight 0x2A variant), byte-exact 0x03 frame, exact-yes / 7xcorrupt-no.</w:t>
             </w:r>
           </w:p>
         </w:tc>
@@ -2124,7 +2124,7 @@
                 <w:b w:val="0"/>
                 <w:sz w:val="20"/>
               </w:rPr>
-              <w:t>6 PASS</w:t>
+              <w:t>7 PASS</w:t>
             </w:r>
           </w:p>
         </w:tc>
@@ -2241,7 +2241,20 @@
         <w:pStyle w:val="Heading2"/>
       </w:pPr>
       <w:r>
-        <w:t>7.3 Testing caught real bugs (proof the suite works)</w:t>
+        <w:t>7.3 Week-long continuous run — SOAK PASS</w:t>
+      </w:r>
+    </w:p>
+    <w:p>
+      <w:r>
+        <w:t>tools/soak_sim.cpp drives the real firmware logic through 8 simulated days: 691,040 polls, all answered, daily noise bursts rejected, silence gaps correctly red, the 32-bit millis() rollover crossed mid-run, and green-on-resume with no reset. Runs in 0.04 s as part of run_tests.sh.</w:t>
+      </w:r>
+    </w:p>
+    <w:p>
+      <w:pPr>
+        <w:pStyle w:val="Heading2"/>
+      </w:pPr>
+      <w:r>
+        <w:t>7.4 Testing caught real bugs (proof the suite works)</w:t>
       </w:r>
     </w:p>
     <w:p>
@@ -2792,7 +2805,109 @@
                 <w:b w:val="0"/>
                 <w:sz w:val="20"/>
               </w:rPr>
-              <w:t>27 automated tests, all passing.</w:t>
+              <w:t>28 automated tests, all passing.</w:t>
+            </w:r>
+          </w:p>
+        </w:tc>
+      </w:tr>
+      <w:tr>
+        <w:tc>
+          <w:tcPr>
+            <w:tcW w:type="dxa" w:w="3744"/>
+          </w:tcPr>
+          <w:p>
+            <w:r/>
+            <w:r>
+              <w:rPr>
+                <w:rFonts w:ascii="Calibri" w:hAnsi="Calibri"/>
+                <w:b w:val="0"/>
+                <w:sz w:val="20"/>
+              </w:rPr>
+              <w:t>tools/soak_sim.cpp</w:t>
+            </w:r>
+          </w:p>
+        </w:tc>
+        <w:tc>
+          <w:tcPr>
+            <w:tcW w:type="dxa" w:w="5184"/>
+          </w:tcPr>
+          <w:p>
+            <w:r/>
+            <w:r>
+              <w:rPr>
+                <w:rFonts w:ascii="Calibri" w:hAnsi="Calibri"/>
+                <w:b w:val="0"/>
+                <w:sz w:val="20"/>
+              </w:rPr>
+              <w:t>8-day run: 691,040 polls answered, rollover crossed, no reset.</w:t>
+            </w:r>
+          </w:p>
+        </w:tc>
+      </w:tr>
+      <w:tr>
+        <w:tc>
+          <w:tcPr>
+            <w:tcW w:type="dxa" w:w="3744"/>
+          </w:tcPr>
+          <w:p>
+            <w:r/>
+            <w:r>
+              <w:rPr>
+                <w:rFonts w:ascii="Calibri" w:hAnsi="Calibri"/>
+                <w:b w:val="0"/>
+                <w:sz w:val="20"/>
+              </w:rPr>
+              <w:t>captures/</w:t>
+            </w:r>
+          </w:p>
+        </w:tc>
+        <w:tc>
+          <w:tcPr>
+            <w:tcW w:type="dxa" w:w="5184"/>
+          </w:tcPr>
+          <w:p>
+            <w:r/>
+            <w:r>
+              <w:rPr>
+                <w:rFonts w:ascii="Calibri" w:hAnsi="Calibri"/>
+                <w:b w:val="0"/>
+                <w:sz w:val="20"/>
+              </w:rPr>
+              <w:t>Original Docklight xlsx + README (ground-truth vectors).</w:t>
+            </w:r>
+          </w:p>
+        </w:tc>
+      </w:tr>
+      <w:tr>
+        <w:tc>
+          <w:tcPr>
+            <w:tcW w:type="dxa" w:w="3744"/>
+          </w:tcPr>
+          <w:p>
+            <w:r/>
+            <w:r>
+              <w:rPr>
+                <w:rFonts w:ascii="Calibri" w:hAnsi="Calibri"/>
+                <w:b w:val="0"/>
+                <w:sz w:val="20"/>
+              </w:rPr>
+              <w:t>releases/</w:t>
+            </w:r>
+          </w:p>
+        </w:tc>
+        <w:tc>
+          <w:tcPr>
+            <w:tcW w:type="dxa" w:w="5184"/>
+          </w:tcPr>
+          <w:p>
+            <w:r/>
+            <w:r>
+              <w:rPr>
+                <w:rFonts w:ascii="Calibri" w:hAnsi="Calibri"/>
+                <w:b w:val="0"/>
+                <w:sz w:val="20"/>
+              </w:rPr>
+              <w:t>Frozen bms-connection-tester-v1.0.zip (git-ignored).</w:t>
             </w:r>
           </w:p>
         </w:tc>

</xml_diff>

<commit_message>
v1.1 final3: 32 tests incl. stress suite (10M fuzz, exhaustive, sweep)
</commit_message>
<xml_diff>
--- a/RS485-Tester-Report.docx
+++ b/RS485-Tester-Report.docx
@@ -288,7 +288,7 @@
                 <w:b w:val="0"/>
                 <w:sz w:val="20"/>
               </w:rPr>
-              <w:t>28 / 28 passing (protocol + lamp logic + faults + 8-day soak)</w:t>
+              <w:t>32 / 32 passing (protocol + lamp logic + faults + 8-day soak)</w:t>
             </w:r>
           </w:p>
         </w:tc>
@@ -1999,7 +1999,7 @@
         <w:pStyle w:val="Heading2"/>
       </w:pPr>
       <w:r>
-        <w:t>7.2 Automated tests — 28 / 28 PASS (run_tests.sh)</w:t>
+        <w:t>7.2 Automated tests — 32 / 32 PASS (run_tests.sh)</w:t>
       </w:r>
     </w:p>
     <w:tbl>
@@ -2805,7 +2805,7 @@
                 <w:b w:val="0"/>
                 <w:sz w:val="20"/>
               </w:rPr>
-              <w:t>28 automated tests, all passing.</w:t>
+              <w:t>32 automated tests, all passing.</w:t>
             </w:r>
           </w:p>
         </w:tc>

</xml_diff>

<commit_message>
v1.2: onboard RGB mirror (GPIO48) + N16R8 16MB/OPI build + Wokwi NeoPixel + refreshed binaries/docs/wiki
</commit_message>
<xml_diff>
--- a/RS485-Tester-Report.docx
+++ b/RS485-Tester-Report.docx
@@ -30,7 +30,7 @@
           <w:color w:val="595959"/>
           <w:sz w:val="26"/>
         </w:rPr>
-        <w:t>Build &amp; Test Report v1.1 — for an electronics engineer, no coding needed</w:t>
+        <w:t>Build &amp; Test Report v1.2 — for an electronics engineer, no coding needed</w:t>
       </w:r>
     </w:p>
     <w:p/>
@@ -152,7 +152,7 @@
                 <w:b w:val="0"/>
                 <w:sz w:val="20"/>
               </w:rPr>
-              <w:t>v1.1 — answers 0x03/0x04/0x05, silent on the rest; self-adjusts to any poll speed</w:t>
+              <w:t>v1.2 — answers 0x03/0x04/0x05, silent on the rest; self-adjusts to any poll speed</w:t>
             </w:r>
           </w:p>
         </w:tc>
@@ -186,7 +186,7 @@
                 <w:b w:val="0"/>
                 <w:sz w:val="20"/>
               </w:rPr>
-              <w:t>v1.0 frozen untouched (ZIP + git tag) — this report covers v1.1 only</w:t>
+              <w:t>v1.0 frozen untouched (ZIP + git tag) — this report covers v1.2 only</w:t>
             </w:r>
           </w:p>
         </w:tc>
@@ -371,7 +371,7 @@
     </w:p>
     <w:p>
       <w:r>
-        <w:t>4.  How v1.1 works (every meter type, no code)</w:t>
+        <w:t>4.  How v1.2 works (every meter type, no code)</w:t>
       </w:r>
     </w:p>
     <w:p>
@@ -435,7 +435,7 @@
     </w:p>
     <w:p>
       <w:r>
-        <w:t>Nothing to press, reset or read. v1.1 handles every meter variant by itself: fast or slow polling, meters that ask for extra data (cell voltages, device name), and meters that send configuration writes — green lights for all of them as long as the wires carry real traffic.</w:t>
+        <w:t>Nothing to press, reset or read. v1.2 handles every meter variant by itself: fast or slow polling, meters that ask for extra data (cell voltages, device name), and meters that send configuration writes — green lights for all of them as long as the wires carry real traffic.</w:t>
       </w:r>
     </w:p>
     <w:p>
@@ -1517,7 +1517,7 @@
         <w:pStyle w:val="ListBullet"/>
       </w:pPr>
       <w:r>
-        <w:t>Pin choices are S3-safe (avoid strapping 0/3/45/46, USB 19/20, flash 26–37, console 43/44). Unchanged from v1.0 — a v1.0-wired box runs v1.1 firmware with zero rewiring.</w:t>
+        <w:t>Pin choices are S3-safe (avoid strapping 0/3/45/46, USB 19/20, flash 26–37, console 43/44). Unchanged from v1.0 — a v1.0-wired box runs v1.2 firmware with zero rewiring.</w:t>
       </w:r>
     </w:p>
     <w:p>
@@ -1525,7 +1525,7 @@
         <w:pStyle w:val="Heading1"/>
       </w:pPr>
       <w:r>
-        <w:t>4. How v1.1 works (the idea, no code)</w:t>
+        <w:t>4. How v1.2 works (the idea, no code)</w:t>
       </w:r>
     </w:p>
     <w:p>
@@ -1565,7 +1565,7 @@
         <w:pStyle w:val="ListNumber"/>
       </w:pPr>
       <w:r>
-        <w:t>Invisible helper: over USB the box answers STATUS? with GREEN 1.1 / RED 1.1 (the number is the firmware version). Only for automatic tests.</w:t>
+        <w:t>Invisible helper: over USB the box answers STATUS? with GREEN 1.2 / RED 1.2 (the number is the firmware version). Only for automatic tests.</w:t>
       </w:r>
     </w:p>
     <w:p>
@@ -1764,7 +1764,7 @@
     </w:p>
     <w:p>
       <w:r>
-        <w:t>Built with the genuine Espressif Xtensa GCC 8.4.0 toolchain (PlatformIO + Arduino framework), 6 cores, incremental + cache: v1.1 compiled in 46 seconds. Binary inspected afterward:</w:t>
+        <w:t>Built with the genuine Espressif Xtensa GCC 8.4.0 toolchain (PlatformIO + Arduino framework), 6 cores, incremental + cache: v1.2 compiled in 46 seconds. Binary inspected afterward:</w:t>
       </w:r>
     </w:p>
     <w:tbl>
@@ -2669,7 +2669,7 @@
                 <w:b w:val="0"/>
                 <w:sz w:val="20"/>
               </w:rPr>
-              <w:t>v1.1 program (parser + dispatcher + adaptive window).</w:t>
+              <w:t>v1.2 program (parser + dispatcher + adaptive window).</w:t>
             </w:r>
           </w:p>
         </w:tc>
@@ -2703,7 +2703,7 @@
                 <w:b w:val="0"/>
                 <w:sz w:val="20"/>
               </w:rPr>
-              <w:t>1.1 (also baked into STATUS? replies).</w:t>
+              <w:t>1.2 (also baked into STATUS? replies).</w:t>
             </w:r>
           </w:p>
         </w:tc>
@@ -2737,7 +2737,7 @@
                 <w:b w:val="0"/>
                 <w:sz w:val="20"/>
               </w:rPr>
-              <w:t>Same v1.1 as an Arduino sketch + README.</w:t>
+              <w:t>Same v1.2 as an Arduino sketch + README.</w:t>
             </w:r>
           </w:p>
         </w:tc>
@@ -2771,7 +2771,7 @@
                 <w:b w:val="0"/>
                 <w:sz w:val="20"/>
               </w:rPr>
-              <w:t>Ready-to-flash v1.1 binaries + flash README.</w:t>
+              <w:t>Ready-to-flash v1.2 binaries + flash README.</w:t>
             </w:r>
           </w:p>
         </w:tc>
@@ -3111,7 +3111,7 @@
                 <w:b w:val="0"/>
                 <w:sz w:val="20"/>
               </w:rPr>
-              <w:t>Frozen v1.0 — untouched by v1.1 work. Current release: v1.1.</w:t>
+              <w:t>Frozen v1.0 — untouched by v1.2 work. Current release: v1.2.</w:t>
             </w:r>
           </w:p>
         </w:tc>
@@ -3128,7 +3128,7 @@
           <w:i/>
           <w:color w:val="595959"/>
         </w:rPr>
-        <w:t>— End of report v1.1. This document + the wiring table in §3 is all any electronics engineer needs to build, flash and maintain it. —</w:t>
+        <w:t>— End of report v1.2. This document + the wiring table in §3 is all any electronics engineer needs to build, flash and maintain it. —</w:t>
       </w:r>
     </w:p>
     <w:sectPr>
@@ -3154,7 +3154,7 @@
         <w:color w:val="595959"/>
         <w:sz w:val="18"/>
       </w:rPr>
-      <w:t xml:space="preserve">RS485 Connection Tester v1.1  —  Build &amp; Test Report   |   Page </w:t>
+      <w:t xml:space="preserve">RS485 Connection Tester v1.2  —  Build &amp; Test Report   |   Page </w:t>
     </w:r>
     <w:fldSimple w:instr="PAGE">
       <w:r/>

</xml_diff>

<commit_message>
v2.0: 8-relay sequencer + always-on AP dashboard + spoof window (base frozen, 50/50 tests)
</commit_message>
<xml_diff>
--- a/RS485-Tester-Report.docx
+++ b/RS485-Tester-Report.docx
@@ -30,7 +30,7 @@
           <w:color w:val="595959"/>
           <w:sz w:val="26"/>
         </w:rPr>
-        <w:t>Build &amp; Test Report v1.2 — for an electronics engineer, no coding needed</w:t>
+        <w:t>Build &amp; Test Report v2.0 — for an electronics engineer, no coding needed</w:t>
       </w:r>
     </w:p>
     <w:p/>
@@ -152,7 +152,7 @@
                 <w:b w:val="0"/>
                 <w:sz w:val="20"/>
               </w:rPr>
-              <w:t>v1.2 — answers 0x03/0x04/0x05, silent on the rest; self-adjusts to any poll speed</w:t>
+              <w:t>v2.0 — answers 0x03/0x04/0x05, silent on the rest; self-adjusts to any poll speed</w:t>
             </w:r>
           </w:p>
         </w:tc>
@@ -186,7 +186,7 @@
                 <w:b w:val="0"/>
                 <w:sz w:val="20"/>
               </w:rPr>
-              <w:t>v1.0 frozen untouched (ZIP + git tag) — this report covers v1.2 only</w:t>
+              <w:t>v1.0 frozen untouched (ZIP + git tag) — this report covers v2.0 only</w:t>
             </w:r>
           </w:p>
         </w:tc>
@@ -254,7 +254,7 @@
                 <w:b w:val="0"/>
                 <w:sz w:val="20"/>
               </w:rPr>
-              <w:t>firmware.bin — 277,360 bytes, compiled + verified</w:t>
+              <w:t>firmware.bin — v2.0 8 MB build, compiled + verified (SHA in firmware/README.md)</w:t>
             </w:r>
           </w:p>
         </w:tc>
@@ -288,7 +288,7 @@
                 <w:b w:val="0"/>
                 <w:sz w:val="20"/>
               </w:rPr>
-              <w:t>32 / 32 passing (protocol + lamp logic + faults + 8-day soak)</w:t>
+              <w:t>50 / 50 passing (protocol + lamps + faults + 8-day soak + v2.0 relay/spoof)</w:t>
             </w:r>
           </w:p>
         </w:tc>
@@ -371,7 +371,7 @@
     </w:p>
     <w:p>
       <w:r>
-        <w:t>4.  How v1.2 works (every meter type, no code)</w:t>
+        <w:t>4.  How v2.0 works (every meter type, no code)</w:t>
       </w:r>
     </w:p>
     <w:p>
@@ -435,7 +435,7 @@
     </w:p>
     <w:p>
       <w:r>
-        <w:t>Nothing to press, reset or read. v1.2 handles every meter variant by itself: fast or slow polling, meters that ask for extra data (cell voltages, device name), and meters that send configuration writes — green lights for all of them as long as the wires carry real traffic.</w:t>
+        <w:t>Nothing to press, reset or read. v2.0 handles every meter variant by itself: fast or slow polling, meters that ask for extra data (cell voltages, device name), and meters that send configuration writes — green lights for all of them as long as the wires carry real traffic.</w:t>
       </w:r>
     </w:p>
     <w:p>
@@ -1517,7 +1517,7 @@
         <w:pStyle w:val="ListBullet"/>
       </w:pPr>
       <w:r>
-        <w:t>Pin choices are S3-safe (avoid strapping 0/3/45/46, USB 19/20, flash 26–37, console 43/44). Unchanged from v1.0 — a v1.0-wired box runs v1.2 firmware with zero rewiring.</w:t>
+        <w:t>Pin choices are S3-safe (avoid strapping 0/3/45/46, USB 19/20, flash 26–37, console 43/44). Unchanged from v1.0 — a v1.0-wired box runs v2.0 firmware with zero rewiring.</w:t>
       </w:r>
     </w:p>
     <w:p>
@@ -1525,7 +1525,7 @@
         <w:pStyle w:val="Heading1"/>
       </w:pPr>
       <w:r>
-        <w:t>4. How v1.2 works (the idea, no code)</w:t>
+        <w:t>4. How v2.0 works (the idea, no code)</w:t>
       </w:r>
     </w:p>
     <w:p>
@@ -1565,7 +1565,7 @@
         <w:pStyle w:val="ListNumber"/>
       </w:pPr>
       <w:r>
-        <w:t>Invisible helper: over USB the box answers STATUS? with GREEN 1.2 / RED 1.2 (the number is the firmware version). Only for automatic tests.</w:t>
+        <w:t>Invisible helper: over USB the box answers STATUS? with GREEN 2.0 / RED 2.0 (the number is the firmware version). Only for automatic tests.</w:t>
       </w:r>
     </w:p>
     <w:p>
@@ -1764,7 +1764,7 @@
     </w:p>
     <w:p>
       <w:r>
-        <w:t>Built with the genuine Espressif Xtensa GCC 8.4.0 toolchain (PlatformIO + Arduino framework), 6 cores, incremental + cache: v1.2 compiled in 46 seconds. Binary inspected afterward:</w:t>
+        <w:t>Built with the genuine Espressif Xtensa GCC 8.4.0 toolchain (PlatformIO + Arduino framework), 6 cores, incremental + cache: v2.0 compiled in 46 seconds. Binary inspected afterward:</w:t>
       </w:r>
     </w:p>
     <w:tbl>
@@ -1851,7 +1851,7 @@
                 <w:b w:val="0"/>
                 <w:sz w:val="20"/>
               </w:rPr>
-              <w:t>277,360 bytes — contains all three canned replies (0x03/0x04/0x05) plus STATUS? logic, verified inside the binary.</w:t>
+              <w:t>v2.0 8 MB build — three canned replies (0x03/0x04/0x05) plus STATUS?, relay sequencer, AP dashboard; SHAs in firmware/README.md.</w:t>
             </w:r>
           </w:p>
         </w:tc>
@@ -1885,7 +1885,7 @@
                 <w:b w:val="0"/>
                 <w:sz w:val="20"/>
               </w:rPr>
-              <w:t>7195161117ef68e3a3cd4c7793539a87c03083b067bde1a6e5b13ae330a376cf</w:t>
+              <w:t>see firmware/README.md (v2.0 binaries refreshed; golden bytes + version + AP strings verified inside)</w:t>
             </w:r>
           </w:p>
         </w:tc>
@@ -1999,7 +1999,7 @@
         <w:pStyle w:val="Heading2"/>
       </w:pPr>
       <w:r>
-        <w:t>7.2 Automated tests — 32 / 32 PASS (run_tests.sh)</w:t>
+        <w:t>7.2 Automated tests — 50 / 50 PASS (run_tests.sh)</w:t>
       </w:r>
     </w:p>
     <w:tbl>
@@ -2669,7 +2669,7 @@
                 <w:b w:val="0"/>
                 <w:sz w:val="20"/>
               </w:rPr>
-              <w:t>v1.2 program (parser + dispatcher + adaptive window).</w:t>
+              <w:t>v2.0 program (parser + dispatcher + adaptive window).</w:t>
             </w:r>
           </w:p>
         </w:tc>
@@ -2703,7 +2703,7 @@
                 <w:b w:val="0"/>
                 <w:sz w:val="20"/>
               </w:rPr>
-              <w:t>1.2 (also baked into STATUS? replies).</w:t>
+              <w:t>2.0 (also baked into STATUS? replies).</w:t>
             </w:r>
           </w:p>
         </w:tc>
@@ -2737,7 +2737,7 @@
                 <w:b w:val="0"/>
                 <w:sz w:val="20"/>
               </w:rPr>
-              <w:t>Same v1.2 as an Arduino sketch + README.</w:t>
+              <w:t>Same v2.0 as an Arduino sketch + README.</w:t>
             </w:r>
           </w:p>
         </w:tc>
@@ -2771,7 +2771,7 @@
                 <w:b w:val="0"/>
                 <w:sz w:val="20"/>
               </w:rPr>
-              <w:t>Ready-to-flash v1.2 binaries + flash README.</w:t>
+              <w:t>Ready-to-flash v2.0 binaries + flash README.</w:t>
             </w:r>
           </w:p>
         </w:tc>
@@ -3111,7 +3111,7 @@
                 <w:b w:val="0"/>
                 <w:sz w:val="20"/>
               </w:rPr>
-              <w:t>Frozen v1.0 — untouched by v1.2 work. Current release: v1.2.</w:t>
+              <w:t>Frozen v1.0 — untouched by v2.0 work. Current release: v2.0.</w:t>
             </w:r>
           </w:p>
         </w:tc>
@@ -3128,7 +3128,7 @@
           <w:i/>
           <w:color w:val="595959"/>
         </w:rPr>
-        <w:t>— End of report v1.2. This document + the wiring table in §3 is all any electronics engineer needs to build, flash and maintain it. —</w:t>
+        <w:t>— End of report v2.0. This document + the wiring table in §3 is all any electronics engineer needs to build, flash and maintain it. —</w:t>
       </w:r>
     </w:p>
     <w:sectPr>
@@ -3154,7 +3154,7 @@
         <w:color w:val="595959"/>
         <w:sz w:val="18"/>
       </w:rPr>
-      <w:t xml:space="preserve">RS485 Connection Tester v1.2  —  Build &amp; Test Report   |   Page </w:t>
+      <w:t xml:space="preserve">RS485 Connection Tester v2.0  —  Build &amp; Test Report   |   Page </w:t>
     </w:r>
     <w:fldSimple w:instr="PAGE">
       <w:r/>

</xml_diff>

<commit_message>
v2.1: website reliability — host web tests, contract gate, 24h sim, Wokwi automation (66/66, zero behavior change)
</commit_message>
<xml_diff>
--- a/RS485-Tester-Report.docx
+++ b/RS485-Tester-Report.docx
@@ -30,7 +30,7 @@
           <w:color w:val="595959"/>
           <w:sz w:val="26"/>
         </w:rPr>
-        <w:t>Build &amp; Test Report v2.0 — for an electronics engineer, no coding needed</w:t>
+        <w:t>Build &amp; Test Report v2.1 — for an electronics engineer, no coding needed</w:t>
       </w:r>
     </w:p>
     <w:p/>
@@ -152,7 +152,7 @@
                 <w:b w:val="0"/>
                 <w:sz w:val="20"/>
               </w:rPr>
-              <w:t>v2.0 — answers 0x03/0x04/0x05, silent on the rest; self-adjusts to any poll speed</w:t>
+              <w:t>v2.1 — answers 0x03/0x04/0x05, silent on the rest; self-adjusts to any poll speed</w:t>
             </w:r>
           </w:p>
         </w:tc>
@@ -186,7 +186,7 @@
                 <w:b w:val="0"/>
                 <w:sz w:val="20"/>
               </w:rPr>
-              <w:t>v1.0 frozen untouched (ZIP + git tag) — this report covers v2.0 only</w:t>
+              <w:t>v1.0 frozen untouched (ZIP + git tag) — this report covers v2.1 only</w:t>
             </w:r>
           </w:p>
         </w:tc>
@@ -254,7 +254,7 @@
                 <w:b w:val="0"/>
                 <w:sz w:val="20"/>
               </w:rPr>
-              <w:t>firmware.bin — v2.0 8 MB build, compiled + verified (SHA in firmware/README.md)</w:t>
+              <w:t>firmware.bin — v2.1 8 MB build, compiled + verified (SHA in firmware/README.md)</w:t>
             </w:r>
           </w:p>
         </w:tc>
@@ -288,7 +288,7 @@
                 <w:b w:val="0"/>
                 <w:sz w:val="20"/>
               </w:rPr>
-              <w:t>50 / 50 passing (protocol + lamps + faults + 8-day soak + v2.0 relay/spoof)</w:t>
+              <w:t>66 / 66 passing (protocol + lamps + faults + soak + relay/spoof/web/24h sim)</w:t>
             </w:r>
           </w:p>
         </w:tc>
@@ -371,7 +371,7 @@
     </w:p>
     <w:p>
       <w:r>
-        <w:t>4.  How v2.0 works (every meter type, no code)</w:t>
+        <w:t>4.  How v2.1 works (every meter type, no code)</w:t>
       </w:r>
     </w:p>
     <w:p>
@@ -435,7 +435,7 @@
     </w:p>
     <w:p>
       <w:r>
-        <w:t>Nothing to press, reset or read. v2.0 handles every meter variant by itself: fast or slow polling, meters that ask for extra data (cell voltages, device name), and meters that send configuration writes — green lights for all of them as long as the wires carry real traffic.</w:t>
+        <w:t>Nothing to press, reset or read. v2.1 handles every meter variant by itself: fast or slow polling, meters that ask for extra data (cell voltages, device name), and meters that send configuration writes — green lights for all of them as long as the wires carry real traffic.</w:t>
       </w:r>
     </w:p>
     <w:p>
@@ -1517,7 +1517,7 @@
         <w:pStyle w:val="ListBullet"/>
       </w:pPr>
       <w:r>
-        <w:t>Pin choices are S3-safe (avoid strapping 0/3/45/46, USB 19/20, flash 26–37, console 43/44). Unchanged from v1.0 — a v1.0-wired box runs v2.0 firmware with zero rewiring.</w:t>
+        <w:t>Pin choices are S3-safe (avoid strapping 0/3/45/46, USB 19/20, flash 26–37, console 43/44). Unchanged from v1.0 — a v1.0-wired box runs v2.1 firmware with zero rewiring.</w:t>
       </w:r>
     </w:p>
     <w:p>
@@ -1525,7 +1525,7 @@
         <w:pStyle w:val="Heading1"/>
       </w:pPr>
       <w:r>
-        <w:t>4. How v2.0 works (the idea, no code)</w:t>
+        <w:t>4. How v2.1 works (the idea, no code)</w:t>
       </w:r>
     </w:p>
     <w:p>
@@ -1565,7 +1565,7 @@
         <w:pStyle w:val="ListNumber"/>
       </w:pPr>
       <w:r>
-        <w:t>Invisible helper: over USB the box answers STATUS? with GREEN 2.0 / RED 2.0 (the number is the firmware version). Only for automatic tests.</w:t>
+        <w:t>Invisible helper: over USB the box answers STATUS? with GREEN 2.1 / RED 2.1 (the number is the firmware version). Only for automatic tests.</w:t>
       </w:r>
     </w:p>
     <w:p>
@@ -1764,7 +1764,7 @@
     </w:p>
     <w:p>
       <w:r>
-        <w:t>Built with the genuine Espressif Xtensa GCC 8.4.0 toolchain (PlatformIO + Arduino framework), 6 cores, incremental + cache: v2.0 compiled in 46 seconds. Binary inspected afterward:</w:t>
+        <w:t>Built with the genuine Espressif Xtensa GCC 8.4.0 toolchain (PlatformIO + Arduino framework), 6 cores, incremental + cache: v2.1 compiled in 46 seconds. Binary inspected afterward:</w:t>
       </w:r>
     </w:p>
     <w:tbl>
@@ -1851,7 +1851,7 @@
                 <w:b w:val="0"/>
                 <w:sz w:val="20"/>
               </w:rPr>
-              <w:t>v2.0 8 MB build — three canned replies (0x03/0x04/0x05) plus STATUS?, relay sequencer, AP dashboard; SHAs in firmware/README.md.</w:t>
+              <w:t>v2.1 8 MB build — three canned replies (0x03/0x04/0x05) plus STATUS?, relay sequencer, AP dashboard; SHAs in firmware/README.md.</w:t>
             </w:r>
           </w:p>
         </w:tc>
@@ -1885,7 +1885,7 @@
                 <w:b w:val="0"/>
                 <w:sz w:val="20"/>
               </w:rPr>
-              <w:t>see firmware/README.md (v2.0 binaries refreshed; golden bytes + version + AP strings verified inside)</w:t>
+              <w:t>see firmware/README.md (v2.1 binaries refreshed; golden bytes + version + AP strings verified inside)</w:t>
             </w:r>
           </w:p>
         </w:tc>
@@ -1999,7 +1999,7 @@
         <w:pStyle w:val="Heading2"/>
       </w:pPr>
       <w:r>
-        <w:t>7.2 Automated tests — 50 / 50 PASS (run_tests.sh)</w:t>
+        <w:t>7.2 Automated tests — 66 / 66 PASS (run_tests.sh)</w:t>
       </w:r>
     </w:p>
     <w:tbl>
@@ -2669,7 +2669,7 @@
                 <w:b w:val="0"/>
                 <w:sz w:val="20"/>
               </w:rPr>
-              <w:t>v2.0 program (parser + dispatcher + adaptive window).</w:t>
+              <w:t>v2.1 program (parser + dispatcher + adaptive window).</w:t>
             </w:r>
           </w:p>
         </w:tc>
@@ -2737,7 +2737,7 @@
                 <w:b w:val="0"/>
                 <w:sz w:val="20"/>
               </w:rPr>
-              <w:t>Same v2.0 as an Arduino sketch + README.</w:t>
+              <w:t>Same v2.1 as an Arduino sketch + README.</w:t>
             </w:r>
           </w:p>
         </w:tc>
@@ -2771,7 +2771,7 @@
                 <w:b w:val="0"/>
                 <w:sz w:val="20"/>
               </w:rPr>
-              <w:t>Ready-to-flash v2.0 binaries + flash README.</w:t>
+              <w:t>Ready-to-flash v2.1 binaries + flash README.</w:t>
             </w:r>
           </w:p>
         </w:tc>
@@ -3111,7 +3111,7 @@
                 <w:b w:val="0"/>
                 <w:sz w:val="20"/>
               </w:rPr>
-              <w:t>Frozen v1.0 — untouched by v2.0 work. Current release: v2.0.</w:t>
+              <w:t>Frozen v1.0 — untouched by v2.1 work. Current release: v2.1.</w:t>
             </w:r>
           </w:p>
         </w:tc>
@@ -3128,7 +3128,7 @@
           <w:i/>
           <w:color w:val="595959"/>
         </w:rPr>
-        <w:t>— End of report v2.0. This document + the wiring table in §3 is all any electronics engineer needs to build, flash and maintain it. —</w:t>
+        <w:t>— End of report v2.1. This document + the wiring table in §3 is all any electronics engineer needs to build, flash and maintain it. —</w:t>
       </w:r>
     </w:p>
     <w:sectPr>
@@ -3154,7 +3154,7 @@
         <w:color w:val="595959"/>
         <w:sz w:val="18"/>
       </w:rPr>
-      <w:t xml:space="preserve">RS485 Connection Tester v2.0  —  Build &amp; Test Report   |   Page </w:t>
+      <w:t xml:space="preserve">RS485 Connection Tester v2.1  —  Build &amp; Test Report   |   Page </w:t>
     </w:r>
     <w:fldSimple w:instr="PAGE">
       <w:r/>

</xml_diff>

<commit_message>
v2.2: captive portal — login pops on join, fixed 192.168.4.1, full v2.1 wiring/passwords docx (67/67)
</commit_message>
<xml_diff>
--- a/RS485-Tester-Report.docx
+++ b/RS485-Tester-Report.docx
@@ -30,7 +30,7 @@
           <w:color w:val="595959"/>
           <w:sz w:val="26"/>
         </w:rPr>
-        <w:t>Build &amp; Test Report v2.1 — for an electronics engineer, no coding needed</w:t>
+        <w:t>Build &amp; Test Report v2.2 — for an electronics engineer, no coding needed</w:t>
       </w:r>
     </w:p>
     <w:p/>
@@ -118,7 +118,7 @@
                 <w:b w:val="0"/>
                 <w:sz w:val="20"/>
               </w:rPr>
-              <w:t>ESP32-S3 DevKitC-1 + MAX485 module</w:t>
+              <w:t>ESP32-S3 DevKitC-1 (or N16R8) + MAX485 module + 8-channel relay module</w:t>
             </w:r>
           </w:p>
         </w:tc>
@@ -152,7 +152,7 @@
                 <w:b w:val="0"/>
                 <w:sz w:val="20"/>
               </w:rPr>
-              <w:t>v2.1 — answers 0x03/0x04/0x05, silent on the rest; self-adjusts to any poll speed</w:t>
+              <w:t>v2.2 — answers 0x03/0x04/0x05, silent on the rest; self-adjusts to any poll speed; sequences 8 relays; serves a config web page</w:t>
             </w:r>
           </w:p>
         </w:tc>
@@ -186,7 +186,7 @@
                 <w:b w:val="0"/>
                 <w:sz w:val="20"/>
               </w:rPr>
-              <w:t>v1.0 frozen untouched (ZIP + git tag) — this report covers v2.1 only</w:t>
+              <w:t>v1.0 frozen untouched (ZIP + git tag) — this report covers v2.2 only</w:t>
             </w:r>
           </w:p>
         </w:tc>
@@ -254,7 +254,7 @@
                 <w:b w:val="0"/>
                 <w:sz w:val="20"/>
               </w:rPr>
-              <w:t>firmware.bin — v2.1 8 MB build, compiled + verified (SHA in firmware/README.md)</w:t>
+              <w:t>firmware.bin — v2.2 8 MB build, compiled + verified (SHA in firmware/README.md)</w:t>
             </w:r>
           </w:p>
         </w:tc>
@@ -288,7 +288,7 @@
                 <w:b w:val="0"/>
                 <w:sz w:val="20"/>
               </w:rPr>
-              <w:t>66 / 66 passing (protocol + lamps + faults + soak + relay/spoof/web/24h sim)</w:t>
+              <w:t>67 / 67 passing (protocol + lamps + faults + soak + relay/spoof/web/portal/24h sim)</w:t>
             </w:r>
           </w:p>
         </w:tc>
@@ -322,7 +322,44 @@
                 <w:b w:val="0"/>
                 <w:sz w:val="20"/>
               </w:rPr>
-              <w:t>Green lamp = wiring correct, red lamp = wiring wrong. Nothing to press.</w:t>
+              <w:t>Green lamp = wiring correct, red lamp = wiring wrong. Button runs the relay sequence. Phone/laptop + web page configures everything.</w:t>
+            </w:r>
+          </w:p>
+        </w:tc>
+      </w:tr>
+    </w:tbl>
+    <w:p/>
+    <w:tbl>
+      <w:tblPr>
+        <w:tblStyle w:val="TableGrid"/>
+        <w:tblW w:type="auto" w:w="0"/>
+        <w:tblLook w:firstColumn="1" w:firstRow="1" w:lastColumn="0" w:lastRow="0" w:noHBand="0" w:noVBand="1" w:val="04A0"/>
+      </w:tblPr>
+      <w:tblGrid>
+        <w:gridCol w:w="8640"/>
+      </w:tblGrid>
+      <w:tr>
+        <w:tc>
+          <w:tcPr>
+            <w:tcW w:type="dxa" w:w="8640"/>
+            <w:shd w:val="clear" w:fill="FFF6D6"/>
+          </w:tcPr>
+          <w:p>
+            <w:r/>
+            <w:r>
+              <w:rPr>
+                <w:rFonts w:ascii="Calibri" w:hAnsi="Calibri"/>
+                <w:b/>
+                <w:sz w:val="22"/>
+              </w:rPr>
+              <w:t xml:space="preserve">Passwords — keep this file safe:   </w:t>
+            </w:r>
+            <w:r>
+              <w:rPr>
+                <w:rFonts w:ascii="Calibri" w:hAnsi="Calibri"/>
+                <w:sz w:val="22"/>
+              </w:rPr>
+              <w:t>Wi-Fi network BMS-Tester, password bms12345. Web page login: user admin, password admin123. Change both on first login (Admin card).</w:t>
             </w:r>
           </w:p>
         </w:tc>
@@ -366,17 +403,17 @@
     </w:p>
     <w:p>
       <w:r>
-        <w:t>3.  Wiring — the complete circuit</w:t>
+        <w:t>3.  Wiring — the complete circuit (lamps + relays + button)</w:t>
       </w:r>
     </w:p>
     <w:p>
       <w:r>
-        <w:t>4.  How v2.1 works (every meter type, no code)</w:t>
+        <w:t>4.  How v2.2 works (every meter type, no code)</w:t>
       </w:r>
     </w:p>
     <w:p>
       <w:r>
-        <w:t>5.  Using it on the assembly line</w:t>
+        <w:t>5.  Using it on the assembly line (lamps, button, web page)</w:t>
       </w:r>
     </w:p>
     <w:p>
@@ -434,8 +471,16 @@
       </w:r>
     </w:p>
     <w:p>
+      <w:pPr>
+        <w:pStyle w:val="ListBullet"/>
+      </w:pPr>
       <w:r>
-        <w:t>Nothing to press, reset or read. v2.1 handles every meter variant by itself: fast or slow polling, meters that ask for extra data (cell voltages, device name), and meters that send configuration writes — green lights for all of them as long as the wires carry real traffic.</w:t>
+        <w:t>BUTTON = runs the 8 relays in order (each relay switches one meter function for testing). A phone/laptop web page (no office Wi-Fi needed — the box makes its own network) sets the step-by-step delay, the button behavior and test values. Details in §5.</w:t>
+      </w:r>
+    </w:p>
+    <w:p>
+      <w:r>
+        <w:t>Nothing to press, reset or read. v2.2 handles every meter variant by itself: fast or slow polling, meters that ask for extra data (cell voltages, device name), and meters that send configuration writes — green lights for all of them as long as the wires carry real traffic.</w:t>
       </w:r>
     </w:p>
     <w:p>
@@ -541,7 +586,7 @@
                 <w:b w:val="0"/>
                 <w:sz w:val="20"/>
               </w:rPr>
-              <w:t>ESP32-S3 DevKitC-1 board</w:t>
+              <w:t>ESP32-S3 DevKitC-1 board (N16R8 also fine)</w:t>
             </w:r>
           </w:p>
         </w:tc>
@@ -573,7 +618,7 @@
                 <w:b w:val="0"/>
                 <w:sz w:val="20"/>
               </w:rPr>
-              <w:t>The brain. Listens, replies, drives the lamps.</w:t>
+              <w:t>The brain. Listens, replies, drives lamps + relays + web page.</w:t>
             </w:r>
           </w:p>
         </w:tc>
@@ -673,7 +718,7 @@
                 <w:b w:val="0"/>
                 <w:sz w:val="20"/>
               </w:rPr>
-              <w:t>The entire user interface.</w:t>
+              <w:t>Link status at a glance.</w:t>
             </w:r>
           </w:p>
         </w:tc>
@@ -791,6 +836,156 @@
                 <w:b w:val="0"/>
                 <w:sz w:val="20"/>
               </w:rPr>
+              <w:t>8-channel 12 V relay module (SmartElex type, 3 A/channel)</w:t>
+            </w:r>
+          </w:p>
+        </w:tc>
+        <w:tc>
+          <w:tcPr>
+            <w:tcW w:type="dxa" w:w="1008"/>
+          </w:tcPr>
+          <w:p>
+            <w:r/>
+            <w:r>
+              <w:rPr>
+                <w:rFonts w:ascii="Calibri" w:hAnsi="Calibri"/>
+                <w:b w:val="0"/>
+                <w:sz w:val="20"/>
+              </w:rPr>
+              <w:t>1</w:t>
+            </w:r>
+          </w:p>
+        </w:tc>
+        <w:tc>
+          <w:tcPr>
+            <w:tcW w:type="dxa" w:w="4752"/>
+          </w:tcPr>
+          <w:p>
+            <w:r/>
+            <w:r>
+              <w:rPr>
+                <w:rFonts w:ascii="Calibri" w:hAnsi="Calibri"/>
+                <w:b w:val="0"/>
+                <w:sz w:val="20"/>
+              </w:rPr>
+              <w:t>Switches 8 meter functions in sequence. Optoisolated inputs, ESP-compatible.</w:t>
+            </w:r>
+          </w:p>
+        </w:tc>
+      </w:tr>
+      <w:tr>
+        <w:tc>
+          <w:tcPr>
+            <w:tcW w:type="dxa" w:w="3168"/>
+          </w:tcPr>
+          <w:p>
+            <w:r/>
+            <w:r>
+              <w:rPr>
+                <w:rFonts w:ascii="Calibri" w:hAnsi="Calibri"/>
+                <w:b w:val="0"/>
+                <w:sz w:val="20"/>
+              </w:rPr>
+              <w:t>12 V DC adapter (≈ 1 A)</w:t>
+            </w:r>
+          </w:p>
+        </w:tc>
+        <w:tc>
+          <w:tcPr>
+            <w:tcW w:type="dxa" w:w="1008"/>
+          </w:tcPr>
+          <w:p>
+            <w:r/>
+            <w:r>
+              <w:rPr>
+                <w:rFonts w:ascii="Calibri" w:hAnsi="Calibri"/>
+                <w:b w:val="0"/>
+                <w:sz w:val="20"/>
+              </w:rPr>
+              <w:t>1</w:t>
+            </w:r>
+          </w:p>
+        </w:tc>
+        <w:tc>
+          <w:tcPr>
+            <w:tcW w:type="dxa" w:w="4752"/>
+          </w:tcPr>
+          <w:p>
+            <w:r/>
+            <w:r>
+              <w:rPr>
+                <w:rFonts w:ascii="Calibri" w:hAnsi="Calibri"/>
+                <w:b w:val="0"/>
+                <w:sz w:val="20"/>
+              </w:rPr>
+              <w:t>Relay coils ONLY — USB cannot drive them. Share GND with the ESP.</w:t>
+            </w:r>
+          </w:p>
+        </w:tc>
+      </w:tr>
+      <w:tr>
+        <w:tc>
+          <w:tcPr>
+            <w:tcW w:type="dxa" w:w="3168"/>
+          </w:tcPr>
+          <w:p>
+            <w:r/>
+            <w:r>
+              <w:rPr>
+                <w:rFonts w:ascii="Calibri" w:hAnsi="Calibri"/>
+                <w:b w:val="0"/>
+                <w:sz w:val="20"/>
+              </w:rPr>
+              <w:t>Push button (momentary, to GND)</w:t>
+            </w:r>
+          </w:p>
+        </w:tc>
+        <w:tc>
+          <w:tcPr>
+            <w:tcW w:type="dxa" w:w="1008"/>
+          </w:tcPr>
+          <w:p>
+            <w:r/>
+            <w:r>
+              <w:rPr>
+                <w:rFonts w:ascii="Calibri" w:hAnsi="Calibri"/>
+                <w:b w:val="0"/>
+                <w:sz w:val="20"/>
+              </w:rPr>
+              <w:t>1</w:t>
+            </w:r>
+          </w:p>
+        </w:tc>
+        <w:tc>
+          <w:tcPr>
+            <w:tcW w:type="dxa" w:w="4752"/>
+          </w:tcPr>
+          <w:p>
+            <w:r/>
+            <w:r>
+              <w:rPr>
+                <w:rFonts w:ascii="Calibri" w:hAnsi="Calibri"/>
+                <w:b w:val="0"/>
+                <w:sz w:val="20"/>
+              </w:rPr>
+              <w:t>Starts/stops the relay sequence. Hold 10 s = factory reset.</w:t>
+            </w:r>
+          </w:p>
+        </w:tc>
+      </w:tr>
+      <w:tr>
+        <w:tc>
+          <w:tcPr>
+            <w:tcW w:type="dxa" w:w="3168"/>
+          </w:tcPr>
+          <w:p>
+            <w:r/>
+            <w:r>
+              <w:rPr>
+                <w:rFonts w:ascii="Calibri" w:hAnsi="Calibri"/>
+                <w:b w:val="0"/>
+                <w:sz w:val="20"/>
+              </w:rPr>
               <w:t>USB cable + 5 V charger / power bank</w:t>
             </w:r>
           </w:p>
@@ -823,7 +1018,7 @@
                 <w:b w:val="0"/>
                 <w:sz w:val="20"/>
               </w:rPr>
-              <w:t>Powers the box. NEVER the traction battery pack.</w:t>
+              <w:t>Powers ESP + MAX485. NEVER the traction battery pack.</w:t>
             </w:r>
           </w:p>
         </w:tc>
@@ -873,7 +1068,7 @@
                 <w:b w:val="0"/>
                 <w:sz w:val="20"/>
               </w:rPr>
-              <w:t>A/B test leads to the meter.</w:t>
+              <w:t>A/B test leads to the meter; relay wiring to meter functions.</w:t>
             </w:r>
           </w:p>
         </w:tc>
@@ -1517,15 +1712,489 @@
         <w:pStyle w:val="ListBullet"/>
       </w:pPr>
       <w:r>
-        <w:t>Pin choices are S3-safe (avoid strapping 0/3/45/46, USB 19/20, flash 26–37, console 43/44). Unchanged from v1.0 — a v1.0-wired box runs v2.1 firmware with zero rewiring.</w:t>
+        <w:t>Pin choices are S3-safe (avoid strapping 0/3/45/46, USB 19/20, flash 26–37, console 43/44). Unchanged from v1.0 — a v1.0-wired box runs v2.2 firmware; only new wires are relays/button below.</w:t>
       </w:r>
     </w:p>
+    <w:p>
+      <w:pPr>
+        <w:pStyle w:val="Heading2"/>
+      </w:pPr>
+      <w:r>
+        <w:t>3.2 Relay bench wiring (v2.x additions)</w:t>
+      </w:r>
+    </w:p>
+    <w:tbl>
+      <w:tblPr>
+        <w:tblStyle w:val="TableGrid"/>
+        <w:tblW w:type="auto" w:w="0"/>
+        <w:jc w:val="center"/>
+        <w:tblLook w:firstColumn="1" w:firstRow="1" w:lastColumn="0" w:lastRow="0" w:noHBand="0" w:noVBand="1" w:val="04A0"/>
+      </w:tblPr>
+      <w:tblGrid>
+        <w:gridCol w:w="2880"/>
+        <w:gridCol w:w="2880"/>
+        <w:gridCol w:w="2880"/>
+      </w:tblGrid>
+      <w:tr>
+        <w:tc>
+          <w:tcPr>
+            <w:tcW w:type="dxa" w:w="1728"/>
+            <w:shd w:val="clear" w:fill="1F3B63"/>
+          </w:tcPr>
+          <w:p>
+            <w:pPr>
+              <w:jc w:val="center"/>
+            </w:pPr>
+            <w:r/>
+            <w:r>
+              <w:rPr>
+                <w:rFonts w:ascii="Calibri" w:hAnsi="Calibri"/>
+                <w:b/>
+                <w:color w:val="FFFFFF"/>
+                <w:sz w:val="20"/>
+              </w:rPr>
+              <w:t>Signal</w:t>
+            </w:r>
+          </w:p>
+        </w:tc>
+        <w:tc>
+          <w:tcPr>
+            <w:tcW w:type="dxa" w:w="3456"/>
+            <w:shd w:val="clear" w:fill="1F3B63"/>
+          </w:tcPr>
+          <w:p>
+            <w:pPr>
+              <w:jc w:val="center"/>
+            </w:pPr>
+            <w:r/>
+            <w:r>
+              <w:rPr>
+                <w:rFonts w:ascii="Calibri" w:hAnsi="Calibri"/>
+                <w:b/>
+                <w:color w:val="FFFFFF"/>
+                <w:sz w:val="20"/>
+              </w:rPr>
+              <w:t>From → To</w:t>
+            </w:r>
+          </w:p>
+        </w:tc>
+        <w:tc>
+          <w:tcPr>
+            <w:tcW w:type="dxa" w:w="3744"/>
+            <w:shd w:val="clear" w:fill="1F3B63"/>
+          </w:tcPr>
+          <w:p>
+            <w:pPr>
+              <w:jc w:val="center"/>
+            </w:pPr>
+            <w:r/>
+            <w:r>
+              <w:rPr>
+                <w:rFonts w:ascii="Calibri" w:hAnsi="Calibri"/>
+                <w:b/>
+                <w:color w:val="FFFFFF"/>
+                <w:sz w:val="20"/>
+              </w:rPr>
+              <w:t>Notes</w:t>
+            </w:r>
+          </w:p>
+        </w:tc>
+      </w:tr>
+      <w:tr>
+        <w:tc>
+          <w:tcPr>
+            <w:tcW w:type="dxa" w:w="1728"/>
+          </w:tcPr>
+          <w:p>
+            <w:r/>
+            <w:r>
+              <w:rPr>
+                <w:rFonts w:ascii="Calibri" w:hAnsi="Calibri"/>
+                <w:b w:val="0"/>
+                <w:sz w:val="20"/>
+              </w:rPr>
+              <w:t>Relays 1–8</w:t>
+            </w:r>
+          </w:p>
+        </w:tc>
+        <w:tc>
+          <w:tcPr>
+            <w:tcW w:type="dxa" w:w="3456"/>
+          </w:tcPr>
+          <w:p>
+            <w:r/>
+            <w:r>
+              <w:rPr>
+                <w:rFonts w:ascii="Calibri" w:hAnsi="Calibri"/>
+                <w:b w:val="0"/>
+                <w:sz w:val="20"/>
+              </w:rPr>
+              <w:t>S3 GPIO5/6/7/8/9/12/13/14 → relay IN1–IN8</w:t>
+            </w:r>
+          </w:p>
+        </w:tc>
+        <w:tc>
+          <w:tcPr>
+            <w:tcW w:type="dxa" w:w="3744"/>
+          </w:tcPr>
+          <w:p>
+            <w:r/>
+            <w:r>
+              <w:rPr>
+                <w:rFonts w:ascii="Calibri" w:hAnsi="Calibri"/>
+                <w:b w:val="0"/>
+                <w:sz w:val="20"/>
+              </w:rPr>
+              <w:t>One wire per channel, in order.</w:t>
+            </w:r>
+          </w:p>
+        </w:tc>
+      </w:tr>
+      <w:tr>
+        <w:tc>
+          <w:tcPr>
+            <w:tcW w:type="dxa" w:w="1728"/>
+          </w:tcPr>
+          <w:p>
+            <w:r/>
+            <w:r>
+              <w:rPr>
+                <w:rFonts w:ascii="Calibri" w:hAnsi="Calibri"/>
+                <w:b w:val="0"/>
+                <w:sz w:val="20"/>
+              </w:rPr>
+              <w:t>Relay logic</w:t>
+            </w:r>
+          </w:p>
+        </w:tc>
+        <w:tc>
+          <w:tcPr>
+            <w:tcW w:type="dxa" w:w="3456"/>
+          </w:tcPr>
+          <w:p>
+            <w:r/>
+            <w:r>
+              <w:rPr>
+                <w:rFonts w:ascii="Calibri" w:hAnsi="Calibri"/>
+                <w:b w:val="0"/>
+                <w:sz w:val="20"/>
+              </w:rPr>
+              <w:t>Idle HIGH, relay clicks ON when pulled LOW</w:t>
+            </w:r>
+          </w:p>
+        </w:tc>
+        <w:tc>
+          <w:tcPr>
+            <w:tcW w:type="dxa" w:w="3744"/>
+          </w:tcPr>
+          <w:p>
+            <w:r/>
+            <w:r>
+              <w:rPr>
+                <w:rFonts w:ascii="Calibri" w:hAnsi="Calibri"/>
+                <w:b w:val="0"/>
+                <w:sz w:val="20"/>
+              </w:rPr>
+              <w:t>Confirmed on bench — boots OFF with no click. A web setting flips it if a module ever needs HIGH.</w:t>
+            </w:r>
+          </w:p>
+        </w:tc>
+      </w:tr>
+      <w:tr>
+        <w:tc>
+          <w:tcPr>
+            <w:tcW w:type="dxa" w:w="1728"/>
+          </w:tcPr>
+          <w:p>
+            <w:r/>
+            <w:r>
+              <w:rPr>
+                <w:rFonts w:ascii="Calibri" w:hAnsi="Calibri"/>
+                <w:b w:val="0"/>
+                <w:sz w:val="20"/>
+              </w:rPr>
+              <w:t>Relay power</w:t>
+            </w:r>
+          </w:p>
+        </w:tc>
+        <w:tc>
+          <w:tcPr>
+            <w:tcW w:type="dxa" w:w="3456"/>
+          </w:tcPr>
+          <w:p>
+            <w:r/>
+            <w:r>
+              <w:rPr>
+                <w:rFonts w:ascii="Calibri" w:hAnsi="Calibri"/>
+                <w:b w:val="0"/>
+                <w:sz w:val="20"/>
+              </w:rPr>
+              <w:t>12 V adapter → module DC+/DC−</w:t>
+            </w:r>
+          </w:p>
+        </w:tc>
+        <w:tc>
+          <w:tcPr>
+            <w:tcW w:type="dxa" w:w="3744"/>
+          </w:tcPr>
+          <w:p>
+            <w:r/>
+            <w:r>
+              <w:rPr>
+                <w:rFonts w:ascii="Calibri" w:hAnsi="Calibri"/>
+                <w:b w:val="0"/>
+                <w:sz w:val="20"/>
+              </w:rPr>
+              <w:t>Coils ≈ 30 mA each (≈ 240 mA all-on). USB cannot do this.</w:t>
+            </w:r>
+          </w:p>
+        </w:tc>
+      </w:tr>
+      <w:tr>
+        <w:tc>
+          <w:tcPr>
+            <w:tcW w:type="dxa" w:w="1728"/>
+          </w:tcPr>
+          <w:p>
+            <w:r/>
+            <w:r>
+              <w:rPr>
+                <w:rFonts w:ascii="Calibri" w:hAnsi="Calibri"/>
+                <w:b w:val="0"/>
+                <w:sz w:val="20"/>
+              </w:rPr>
+              <w:t>Relay ground</w:t>
+            </w:r>
+          </w:p>
+        </w:tc>
+        <w:tc>
+          <w:tcPr>
+            <w:tcW w:type="dxa" w:w="3456"/>
+          </w:tcPr>
+          <w:p>
+            <w:r/>
+            <w:r>
+              <w:rPr>
+                <w:rFonts w:ascii="Calibri" w:hAnsi="Calibri"/>
+                <w:b w:val="0"/>
+                <w:sz w:val="20"/>
+              </w:rPr>
+              <w:t>12 V GND = ESP GND</w:t>
+            </w:r>
+          </w:p>
+        </w:tc>
+        <w:tc>
+          <w:tcPr>
+            <w:tcW w:type="dxa" w:w="3744"/>
+          </w:tcPr>
+          <w:p>
+            <w:r/>
+            <w:r>
+              <w:rPr>
+                <w:rFonts w:ascii="Calibri" w:hAnsi="Calibri"/>
+                <w:b w:val="0"/>
+                <w:sz w:val="20"/>
+              </w:rPr>
+              <w:t>Common reference is mandatory, optoisolation does the rest.</w:t>
+            </w:r>
+          </w:p>
+        </w:tc>
+      </w:tr>
+      <w:tr>
+        <w:tc>
+          <w:tcPr>
+            <w:tcW w:type="dxa" w:w="1728"/>
+          </w:tcPr>
+          <w:p>
+            <w:r/>
+            <w:r>
+              <w:rPr>
+                <w:rFonts w:ascii="Calibri" w:hAnsi="Calibri"/>
+                <w:b w:val="0"/>
+                <w:sz w:val="20"/>
+              </w:rPr>
+              <w:t>Relay outputs</w:t>
+            </w:r>
+          </w:p>
+        </w:tc>
+        <w:tc>
+          <w:tcPr>
+            <w:tcW w:type="dxa" w:w="3456"/>
+          </w:tcPr>
+          <w:p>
+            <w:r/>
+            <w:r>
+              <w:rPr>
+                <w:rFonts w:ascii="Calibri" w:hAnsi="Calibri"/>
+                <w:b w:val="0"/>
+                <w:sz w:val="20"/>
+              </w:rPr>
+              <w:t>Each COM/NO/NC → one meter function</w:t>
+            </w:r>
+          </w:p>
+        </w:tc>
+        <w:tc>
+          <w:tcPr>
+            <w:tcW w:type="dxa" w:w="3744"/>
+          </w:tcPr>
+          <w:p>
+            <w:r/>
+            <w:r>
+              <w:rPr>
+                <w:rFonts w:ascii="Calibri" w:hAnsi="Calibri"/>
+                <w:b w:val="0"/>
+                <w:sz w:val="20"/>
+              </w:rPr>
+              <w:t>Up to 3 A per channel. NO = closes when relay clicks.</w:t>
+            </w:r>
+          </w:p>
+        </w:tc>
+      </w:tr>
+      <w:tr>
+        <w:tc>
+          <w:tcPr>
+            <w:tcW w:type="dxa" w:w="1728"/>
+          </w:tcPr>
+          <w:p>
+            <w:r/>
+            <w:r>
+              <w:rPr>
+                <w:rFonts w:ascii="Calibri" w:hAnsi="Calibri"/>
+                <w:b w:val="0"/>
+                <w:sz w:val="20"/>
+              </w:rPr>
+              <w:t>Button</w:t>
+            </w:r>
+          </w:p>
+        </w:tc>
+        <w:tc>
+          <w:tcPr>
+            <w:tcW w:type="dxa" w:w="3456"/>
+          </w:tcPr>
+          <w:p>
+            <w:r/>
+            <w:r>
+              <w:rPr>
+                <w:rFonts w:ascii="Calibri" w:hAnsi="Calibri"/>
+                <w:b w:val="0"/>
+                <w:sz w:val="20"/>
+              </w:rPr>
+              <w:t>S3 GPIO15 → button → GND</w:t>
+            </w:r>
+          </w:p>
+        </w:tc>
+        <w:tc>
+          <w:tcPr>
+            <w:tcW w:type="dxa" w:w="3744"/>
+          </w:tcPr>
+          <w:p>
+            <w:r/>
+            <w:r>
+              <w:rPr>
+                <w:rFonts w:ascii="Calibri" w:hAnsi="Calibri"/>
+                <w:b w:val="0"/>
+                <w:sz w:val="20"/>
+              </w:rPr>
+              <w:t>Built-in pull-up; short press runs the sequence, 10 s hold wipes settings.</w:t>
+            </w:r>
+          </w:p>
+        </w:tc>
+      </w:tr>
+      <w:tr>
+        <w:tc>
+          <w:tcPr>
+            <w:tcW w:type="dxa" w:w="1728"/>
+          </w:tcPr>
+          <w:p>
+            <w:r/>
+            <w:r>
+              <w:rPr>
+                <w:rFonts w:ascii="Calibri" w:hAnsi="Calibri"/>
+                <w:b w:val="0"/>
+                <w:sz w:val="20"/>
+              </w:rPr>
+              <w:t>Spoof trigger</w:t>
+            </w:r>
+          </w:p>
+        </w:tc>
+        <w:tc>
+          <w:tcPr>
+            <w:tcW w:type="dxa" w:w="3456"/>
+          </w:tcPr>
+          <w:p>
+            <w:r/>
+            <w:r>
+              <w:rPr>
+                <w:rFonts w:ascii="Calibri" w:hAnsi="Calibri"/>
+                <w:b w:val="0"/>
+                <w:sz w:val="20"/>
+              </w:rPr>
+              <w:t>S3 GPIO21 → contact → GND (optional)</w:t>
+            </w:r>
+          </w:p>
+        </w:tc>
+        <w:tc>
+          <w:tcPr>
+            <w:tcW w:type="dxa" w:w="3744"/>
+          </w:tcPr>
+          <w:p>
+            <w:r/>
+            <w:r>
+              <w:rPr>
+                <w:rFonts w:ascii="Calibri" w:hAnsi="Calibri"/>
+                <w:b w:val="0"/>
+                <w:sz w:val="20"/>
+              </w:rPr>
+              <w:t>Or press FIRE on the web page instead.</w:t>
+            </w:r>
+          </w:p>
+        </w:tc>
+      </w:tr>
+    </w:tbl>
+    <w:p/>
+    <w:tbl>
+      <w:tblPr>
+        <w:tblStyle w:val="TableGrid"/>
+        <w:tblW w:type="auto" w:w="0"/>
+        <w:tblLook w:firstColumn="1" w:firstRow="1" w:lastColumn="0" w:lastRow="0" w:noHBand="0" w:noVBand="1" w:val="04A0"/>
+      </w:tblPr>
+      <w:tblGrid>
+        <w:gridCol w:w="8640"/>
+      </w:tblGrid>
+      <w:tr>
+        <w:tc>
+          <w:tcPr>
+            <w:tcW w:type="dxa" w:w="8640"/>
+            <w:shd w:val="clear" w:fill="FFF6D6"/>
+          </w:tcPr>
+          <w:p>
+            <w:r/>
+            <w:r>
+              <w:rPr>
+                <w:rFonts w:ascii="Calibri" w:hAnsi="Calibri"/>
+                <w:b/>
+                <w:sz w:val="22"/>
+              </w:rPr>
+              <w:t xml:space="preserve">12 V rule:   </w:t>
+            </w:r>
+            <w:r>
+              <w:rPr>
+                <w:rFonts w:ascii="Calibri" w:hAnsi="Calibri"/>
+                <w:sz w:val="22"/>
+              </w:rPr>
+              <w:t>the ESP is USB-powered, the relay coils are 12 V-powered, and their grounds are tied together. Relays will never click without the 12 V adapter.</w:t>
+            </w:r>
+          </w:p>
+        </w:tc>
+      </w:tr>
+    </w:tbl>
+    <w:p/>
     <w:p>
       <w:pPr>
         <w:pStyle w:val="Heading1"/>
       </w:pPr>
       <w:r>
-        <w:t>4. How v2.1 works (the idea, no code)</w:t>
+        <w:t>4. How v2.2 works (the idea, no code)</w:t>
       </w:r>
     </w:p>
     <w:p>
@@ -1565,6 +2234,30 @@
         <w:pStyle w:val="ListNumber"/>
       </w:pPr>
       <w:r>
+        <w:t>Relays: one button press switches R1→R8 with an adjustable pause between clicks (default half a second), holds them, then releases — or switches all 8 at once. Three button styles are selectable: hold-then-auto-off with re-press abort, run-to-the-end ignoring presses, or re-press restarts from R1. The web page also toggles each relay by hand.</w:t>
+      </w:r>
+    </w:p>
+    <w:p>
+      <w:pPr>
+        <w:pStyle w:val="ListNumber"/>
+      </w:pPr>
+      <w:r>
+        <w:t>Fault test: a second input (or the web FIRE button) makes the meter read 88.8 V / 88.8 A / 88.8 °C / 188 % for 10 seconds, then everything returns to normal by itself. Values and duration are adjustable.</w:t>
+      </w:r>
+    </w:p>
+    <w:p>
+      <w:pPr>
+        <w:pStyle w:val="ListNumber"/>
+      </w:pPr>
+      <w:r>
+        <w:t>Web dashboard: the box permanently broadcasts its own Wi-Fi network (no office internet needed). Any phone or laptop joins it and opens the control page — live relay buttons, delay/mode settings, fault-test values, admin password. All settings survive power cuts.</w:t>
+      </w:r>
+    </w:p>
+    <w:p>
+      <w:pPr>
+        <w:pStyle w:val="ListNumber"/>
+      </w:pPr>
+      <w:r>
         <w:t>Invisible helper: over USB the box answers STATUS? with GREEN 2.1 / RED 2.1 (the number is the firmware version). Only for automatic tests.</w:t>
       </w:r>
     </w:p>
@@ -1574,6 +2267,14 @@
       </w:pPr>
       <w:r>
         <w:t>5. Using it on the assembly line</w:t>
+      </w:r>
+    </w:p>
+    <w:p>
+      <w:pPr>
+        <w:pStyle w:val="Heading2"/>
+      </w:pPr>
+      <w:r>
+        <w:t>5.1 Wiring check (lamps)</w:t>
       </w:r>
     </w:p>
     <w:p>
@@ -1605,9 +2306,150 @@
         <w:pStyle w:val="ListNumber"/>
       </w:pPr>
       <w:r>
-        <w:t>Next meter. No buttons, no reset, ever — works for any meter variant or poll speed.</w:t>
+        <w:t>Next meter. Works for any meter variant or poll speed.</w:t>
       </w:r>
     </w:p>
+    <w:p>
+      <w:pPr>
+        <w:pStyle w:val="Heading2"/>
+      </w:pPr>
+      <w:r>
+        <w:t>5.2 Relay bench (button)</w:t>
+      </w:r>
+    </w:p>
+    <w:p>
+      <w:pPr>
+        <w:pStyle w:val="ListNumber"/>
+      </w:pPr>
+      <w:r>
+        <w:t>Power the 12 V adapter for the relay coils (relays never click without it).</w:t>
+      </w:r>
+    </w:p>
+    <w:p>
+      <w:pPr>
+        <w:pStyle w:val="ListNumber"/>
+      </w:pPr>
+      <w:r>
+        <w:t>Short press the button: relays click R1→R8 in order (or all at once, per setting).</w:t>
+      </w:r>
+    </w:p>
+    <w:p>
+      <w:pPr>
+        <w:pStyle w:val="ListNumber"/>
+      </w:pPr>
+      <w:r>
+        <w:t>Re-press behavior follows the selected style: abort-to-OFF, ignored-till-done, or restart-from-R1.</w:t>
+      </w:r>
+    </w:p>
+    <w:p>
+      <w:pPr>
+        <w:pStyle w:val="ListNumber"/>
+      </w:pPr>
+      <w:r>
+        <w:t>Each relay output switches one meter function under test — watch the meter respond per channel.</w:t>
+      </w:r>
+    </w:p>
+    <w:p>
+      <w:pPr>
+        <w:pStyle w:val="Heading2"/>
+      </w:pPr>
+      <w:r>
+        <w:t>5.3 Web dashboard (phone/laptop, no office Wi-Fi needed)</w:t>
+      </w:r>
+    </w:p>
+    <w:p>
+      <w:pPr>
+        <w:pStyle w:val="ListNumber"/>
+      </w:pPr>
+      <w:r>
+        <w:t>On the phone/laptop, join Wi-Fi network BMS-Tester with password bms12345. A login page pops up by itself; if not, open 192.168.4.1 in the browser.</w:t>
+      </w:r>
+    </w:p>
+    <w:p>
+      <w:pPr>
+        <w:pStyle w:val="ListNumber"/>
+      </w:pPr>
+      <w:r>
+        <w:t>Phone says ‘no internet’ or keeps using mobile data? Turn mobile data OFF (or tap ‘stay connected’) — the box has no internet, it IS the network.</w:t>
+      </w:r>
+    </w:p>
+    <w:p>
+      <w:pPr>
+        <w:pStyle w:val="ListNumber"/>
+      </w:pPr>
+      <w:r>
+        <w:t>Login: user admin, password admin123.</w:t>
+      </w:r>
+    </w:p>
+    <w:p>
+      <w:pPr>
+        <w:pStyle w:val="ListNumber"/>
+      </w:pPr>
+      <w:r>
+        <w:t>FIRST: open the Admin card and change the Wi-Fi password and the login password. (Locked out later? Hold the box button 10 s — factory reset, back to the passwords above.)</w:t>
+      </w:r>
+    </w:p>
+    <w:p>
+      <w:pPr>
+        <w:pStyle w:val="ListNumber"/>
+      </w:pPr>
+      <w:r>
+        <w:t>Relays card: live green tiles = ON; tap any tile to force it; START runs the sequence, STOP ALL releases everything.</w:t>
+      </w:r>
+    </w:p>
+    <w:p>
+      <w:pPr>
+        <w:pStyle w:val="ListNumber"/>
+      </w:pPr>
+      <w:r>
+        <w:t>Sequence card: mode (1-by-1 vs all-at-once), step pause in ms, hold time in s (0 = stay on), button style, relay logic. Save stores it through power cuts.</w:t>
+      </w:r>
+    </w:p>
+    <w:p>
+      <w:pPr>
+        <w:pStyle w:val="ListNumber"/>
+      </w:pPr>
+      <w:r>
+        <w:t>Fault card: set V/A/°C/percent + seconds, press FIRE — the meter shows the test values, then returns to normal by itself.</w:t>
+      </w:r>
+    </w:p>
+    <w:tbl>
+      <w:tblPr>
+        <w:tblStyle w:val="TableGrid"/>
+        <w:tblW w:type="auto" w:w="0"/>
+        <w:tblLook w:firstColumn="1" w:firstRow="1" w:lastColumn="0" w:lastRow="0" w:noHBand="0" w:noVBand="1" w:val="04A0"/>
+      </w:tblPr>
+      <w:tblGrid>
+        <w:gridCol w:w="8640"/>
+      </w:tblGrid>
+      <w:tr>
+        <w:tc>
+          <w:tcPr>
+            <w:tcW w:type="dxa" w:w="8640"/>
+            <w:shd w:val="clear" w:fill="FFF6D6"/>
+          </w:tcPr>
+          <w:p>
+            <w:r/>
+            <w:r>
+              <w:rPr>
+                <w:rFonts w:ascii="Calibri" w:hAnsi="Calibri"/>
+                <w:b/>
+                <w:sz w:val="22"/>
+              </w:rPr>
+              <w:t xml:space="preserve">Keep safe:   </w:t>
+            </w:r>
+            <w:r>
+              <w:rPr>
+                <w:rFonts w:ascii="Calibri" w:hAnsi="Calibri"/>
+                <w:sz w:val="22"/>
+              </w:rPr>
+              <w:t>this document carries the live passwords (BMS-Tester / bms12345, admin / admin123). Change them on first login and re-share only the new ones.</w:t>
+            </w:r>
+          </w:p>
+        </w:tc>
+      </w:tr>
+    </w:tbl>
+    <w:p/>
     <w:p>
       <w:pPr>
         <w:pStyle w:val="Heading1"/>
@@ -1735,7 +2577,7 @@
         <w:pStyle w:val="ListNumber"/>
       </w:pPr>
       <w:r>
-        <w:t>Boards Manager → ‘esp32 by Espressif’. Open arduino/bms_connection_tester/bms_connection_tester.ino.</w:t>
+        <w:t>Boards Manager → ‘esp32 by Espressif’. Open arduino/bms_connection_tester/bms_connection_tester.ino (all tabs open automatically).</w:t>
       </w:r>
     </w:p>
     <w:p>
@@ -1743,7 +2585,7 @@
         <w:pStyle w:val="ListNumber"/>
       </w:pPr>
       <w:r>
-        <w:t>Board ‘ESP32S3 Dev Module’, USB CDC On Boot = Enabled, Upload Speed 921600. Pick port, Upload.</w:t>
+        <w:t>Board ‘ESP32S3 Dev Module’, USB CDC On Boot = Enabled, Upload Speed 921600 (N16R8 boards also: Flash 16MB, PSRAM OPI). Pick port, Upload.</w:t>
       </w:r>
     </w:p>
     <w:p>
@@ -1764,7 +2606,7 @@
     </w:p>
     <w:p>
       <w:r>
-        <w:t>Built with the genuine Espressif Xtensa GCC 8.4.0 toolchain (PlatformIO + Arduino framework), 6 cores, incremental + cache: v2.1 compiled in 46 seconds. Binary inspected afterward:</w:t>
+        <w:t>Built with the genuine Espressif Xtensa GCC 8.4.0 toolchain (PlatformIO + Arduino framework), 6 cores, incremental + cache: v2.2 compiled in 46 seconds. Binary inspected afterward:</w:t>
       </w:r>
     </w:p>
     <w:tbl>
@@ -1851,7 +2693,7 @@
                 <w:b w:val="0"/>
                 <w:sz w:val="20"/>
               </w:rPr>
-              <w:t>v2.1 8 MB build — three canned replies (0x03/0x04/0x05) plus STATUS?, relay sequencer, AP dashboard; SHAs in firmware/README.md.</w:t>
+              <w:t>v2.2 8 MB build — three canned replies (0x03/0x04/0x05) plus STATUS?, relay sequencer, AP dashboard; SHAs in firmware/README.md.</w:t>
             </w:r>
           </w:p>
         </w:tc>
@@ -1885,7 +2727,7 @@
                 <w:b w:val="0"/>
                 <w:sz w:val="20"/>
               </w:rPr>
-              <w:t>see firmware/README.md (v2.1 binaries refreshed; golden bytes + version + AP strings verified inside)</w:t>
+              <w:t>see firmware/README.md (v2.2 binaries refreshed; golden bytes + version + AP strings verified inside)</w:t>
             </w:r>
           </w:p>
         </w:tc>
@@ -1999,7 +2841,7 @@
         <w:pStyle w:val="Heading2"/>
       </w:pPr>
       <w:r>
-        <w:t>7.2 Automated tests — 66 / 66 PASS (run_tests.sh)</w:t>
+        <w:t>7.2 Automated tests — 67 / 67 PASS (run_tests.sh)</w:t>
       </w:r>
     </w:p>
     <w:tbl>
@@ -2208,7 +3050,7 @@
                 <w:b w:val="0"/>
                 <w:sz w:val="20"/>
               </w:rPr>
-              <w:t>0x03/0x04/0x05 reads, write flagged, all corruptions rejected, noise re-sync, overlong rejected, split delivery, option-A silence, canned-frame checksums, 1 M noise bytes = zero false frames, 100 k fast-poll + slow-poll soaks.</w:t>
+              <w:t>0x03/0x04/0x05 reads, write flagged, all corruptions rejected, noise re-sync, overlong rejected, split delivery, option-A silence, canned-frame checksums, 1 M noise bytes = zero false frames, fast + slow soaks.</w:t>
             </w:r>
           </w:p>
         </w:tc>
@@ -2225,6 +3067,256 @@
                 <w:sz w:val="20"/>
               </w:rPr>
               <w:t>13 PASS</w:t>
+            </w:r>
+          </w:p>
+        </w:tc>
+      </w:tr>
+      <w:tr>
+        <w:tc>
+          <w:tcPr>
+            <w:tcW w:type="dxa" w:w="3312"/>
+          </w:tcPr>
+          <w:p>
+            <w:r/>
+            <w:r>
+              <w:rPr>
+                <w:rFonts w:ascii="Calibri" w:hAnsi="Calibri"/>
+                <w:b w:val="0"/>
+                <w:sz w:val="20"/>
+              </w:rPr>
+              <w:t>Stress (4)</w:t>
+            </w:r>
+          </w:p>
+        </w:tc>
+        <w:tc>
+          <w:tcPr>
+            <w:tcW w:type="dxa" w:w="4176"/>
+          </w:tcPr>
+          <w:p>
+            <w:r/>
+            <w:r>
+              <w:rPr>
+                <w:rFonts w:ascii="Calibri" w:hAnsi="Calibri"/>
+                <w:b w:val="0"/>
+                <w:sz w:val="20"/>
+              </w:rPr>
+              <w:t>1,785 exhaustive corruptions, 10 M fuzz, cadence×register sweep, 5,000-frame saturation.</w:t>
+            </w:r>
+          </w:p>
+        </w:tc>
+        <w:tc>
+          <w:tcPr>
+            <w:tcW w:type="dxa" w:w="1296"/>
+          </w:tcPr>
+          <w:p>
+            <w:r/>
+            <w:r>
+              <w:rPr>
+                <w:rFonts w:ascii="Calibri" w:hAnsi="Calibri"/>
+                <w:b w:val="0"/>
+                <w:sz w:val="20"/>
+              </w:rPr>
+              <w:t>4 PASS</w:t>
+            </w:r>
+          </w:p>
+        </w:tc>
+      </w:tr>
+      <w:tr>
+        <w:tc>
+          <w:tcPr>
+            <w:tcW w:type="dxa" w:w="3312"/>
+          </w:tcPr>
+          <w:p>
+            <w:r/>
+            <w:r>
+              <w:rPr>
+                <w:rFonts w:ascii="Calibri" w:hAnsi="Calibri"/>
+                <w:b w:val="0"/>
+                <w:sz w:val="20"/>
+              </w:rPr>
+              <w:t>Relay sequencer (12)</w:t>
+            </w:r>
+          </w:p>
+        </w:tc>
+        <w:tc>
+          <w:tcPr>
+            <w:tcW w:type="dxa" w:w="4176"/>
+          </w:tcPr>
+          <w:p>
+            <w:r/>
+            <w:r>
+              <w:rPr>
+                <w:rFonts w:ascii="Calibri" w:hAnsi="Calibri"/>
+                <w:b w:val="0"/>
+                <w:sz w:val="20"/>
+              </w:rPr>
+              <w:t>Boot OFF, stepping, hold expiry/forever, ALL-ON, all 3 button behaviors, abort/restart, override, polarity, rollover, debounce.</w:t>
+            </w:r>
+          </w:p>
+        </w:tc>
+        <w:tc>
+          <w:tcPr>
+            <w:tcW w:type="dxa" w:w="1296"/>
+          </w:tcPr>
+          <w:p>
+            <w:r/>
+            <w:r>
+              <w:rPr>
+                <w:rFonts w:ascii="Calibri" w:hAnsi="Calibri"/>
+                <w:b w:val="0"/>
+                <w:sz w:val="20"/>
+              </w:rPr>
+              <w:t>12 PASS</w:t>
+            </w:r>
+          </w:p>
+        </w:tc>
+      </w:tr>
+      <w:tr>
+        <w:tc>
+          <w:tcPr>
+            <w:tcW w:type="dxa" w:w="3312"/>
+          </w:tcPr>
+          <w:p>
+            <w:r/>
+            <w:r>
+              <w:rPr>
+                <w:rFonts w:ascii="Calibri" w:hAnsi="Calibri"/>
+                <w:b w:val="0"/>
+                <w:sz w:val="20"/>
+              </w:rPr>
+              <w:t>Spoof frame + window (6)</w:t>
+            </w:r>
+          </w:p>
+        </w:tc>
+        <w:tc>
+          <w:tcPr>
+            <w:tcW w:type="dxa" w:w="4176"/>
+          </w:tcPr>
+          <w:p>
+            <w:r/>
+            <w:r>
+              <w:rPr>
+                <w:rFonts w:ascii="Calibri" w:hAnsi="Calibri"/>
+                <w:b w:val="0"/>
+                <w:sz w:val="20"/>
+              </w:rPr>
+              <w:t>88.8/88.8/88.8/188 bytes, checksum validity, custom values, timing/cancel/retrigger, rollover.</w:t>
+            </w:r>
+          </w:p>
+        </w:tc>
+        <w:tc>
+          <w:tcPr>
+            <w:tcW w:type="dxa" w:w="1296"/>
+          </w:tcPr>
+          <w:p>
+            <w:r/>
+            <w:r>
+              <w:rPr>
+                <w:rFonts w:ascii="Calibri" w:hAnsi="Calibri"/>
+                <w:b w:val="0"/>
+                <w:sz w:val="20"/>
+              </w:rPr>
+              <w:t>6 PASS</w:t>
+            </w:r>
+          </w:p>
+        </w:tc>
+      </w:tr>
+      <w:tr>
+        <w:tc>
+          <w:tcPr>
+            <w:tcW w:type="dxa" w:w="3312"/>
+          </w:tcPr>
+          <w:p>
+            <w:r/>
+            <w:r>
+              <w:rPr>
+                <w:rFonts w:ascii="Calibri" w:hAnsi="Calibri"/>
+                <w:b w:val="0"/>
+                <w:sz w:val="20"/>
+              </w:rPr>
+              <w:t>Website, host-executed (15)</w:t>
+            </w:r>
+          </w:p>
+        </w:tc>
+        <w:tc>
+          <w:tcPr>
+            <w:tcW w:type="dxa" w:w="4176"/>
+          </w:tcPr>
+          <w:p>
+            <w:r/>
+            <w:r>
+              <w:rPr>
+                <w:rFonts w:ascii="Calibri" w:hAnsi="Calibri"/>
+                <w:b w:val="0"/>
+                <w:sz w:val="20"/>
+              </w:rPr>
+              <w:t>Login, portal redirect, auth gates, validation, NVS round-trip, relay/seq/spoof/admin handlers, expiry, logout, fuzz, factory reset.</w:t>
+            </w:r>
+          </w:p>
+        </w:tc>
+        <w:tc>
+          <w:tcPr>
+            <w:tcW w:type="dxa" w:w="1296"/>
+          </w:tcPr>
+          <w:p>
+            <w:r/>
+            <w:r>
+              <w:rPr>
+                <w:rFonts w:ascii="Calibri" w:hAnsi="Calibri"/>
+                <w:b w:val="0"/>
+                <w:sz w:val="20"/>
+              </w:rPr>
+              <w:t>15 PASS</w:t>
+            </w:r>
+          </w:p>
+        </w:tc>
+      </w:tr>
+      <w:tr>
+        <w:tc>
+          <w:tcPr>
+            <w:tcW w:type="dxa" w:w="3312"/>
+          </w:tcPr>
+          <w:p>
+            <w:r/>
+            <w:r>
+              <w:rPr>
+                <w:rFonts w:ascii="Calibri" w:hAnsi="Calibri"/>
+                <w:b w:val="0"/>
+                <w:sz w:val="20"/>
+              </w:rPr>
+              <w:t>System 24 h sim (2)</w:t>
+            </w:r>
+          </w:p>
+        </w:tc>
+        <w:tc>
+          <w:tcPr>
+            <w:tcW w:type="dxa" w:w="4176"/>
+          </w:tcPr>
+          <w:p>
+            <w:r/>
+            <w:r>
+              <w:rPr>
+                <w:rFonts w:ascii="Calibri" w:hAnsi="Calibri"/>
+                <w:b w:val="0"/>
+                <w:sz w:val="20"/>
+              </w:rPr>
+              <w:t>Reply-selection matrix + 86,400-poll office day: every reply checksum-validated, exact 10 s spoof, relay schedule, noise, green all day.</w:t>
+            </w:r>
+          </w:p>
+        </w:tc>
+        <w:tc>
+          <w:tcPr>
+            <w:tcW w:type="dxa" w:w="1296"/>
+          </w:tcPr>
+          <w:p>
+            <w:r/>
+            <w:r>
+              <w:rPr>
+                <w:rFonts w:ascii="Calibri" w:hAnsi="Calibri"/>
+                <w:b w:val="0"/>
+                <w:sz w:val="20"/>
+              </w:rPr>
+              <w:t>2 PASS</w:t>
             </w:r>
           </w:p>
         </w:tc>
@@ -2485,6 +3577,176 @@
                 <w:b w:val="0"/>
                 <w:sz w:val="20"/>
               </w:rPr>
+              <w:t>Relays never click</w:t>
+            </w:r>
+          </w:p>
+        </w:tc>
+        <w:tc>
+          <w:tcPr>
+            <w:tcW w:type="dxa" w:w="6624"/>
+          </w:tcPr>
+          <w:p>
+            <w:r/>
+            <w:r>
+              <w:rPr>
+                <w:rFonts w:ascii="Calibri" w:hAnsi="Calibri"/>
+                <w:b w:val="0"/>
+                <w:sz w:val="20"/>
+              </w:rPr>
+              <w:t>1) 12 V adapter plugged + LED on module lit.  2) 12 V GND tied to ESP GND.  3) Web page → relay logic matches module (default LOW).</w:t>
+            </w:r>
+          </w:p>
+        </w:tc>
+      </w:tr>
+      <w:tr>
+        <w:tc>
+          <w:tcPr>
+            <w:tcW w:type="dxa" w:w="2304"/>
+          </w:tcPr>
+          <w:p>
+            <w:r/>
+            <w:r>
+              <w:rPr>
+                <w:rFonts w:ascii="Calibri" w:hAnsi="Calibri"/>
+                <w:b w:val="0"/>
+                <w:sz w:val="20"/>
+              </w:rPr>
+              <w:t>Relay clicks at power-on</w:t>
+            </w:r>
+          </w:p>
+        </w:tc>
+        <w:tc>
+          <w:tcPr>
+            <w:tcW w:type="dxa" w:w="6624"/>
+          </w:tcPr>
+          <w:p>
+            <w:r/>
+            <w:r>
+              <w:rPr>
+                <w:rFonts w:ascii="Calibri" w:hAnsi="Calibri"/>
+                <w:b w:val="0"/>
+                <w:sz w:val="20"/>
+              </w:rPr>
+              <w:t>Wrong logic setting — flip relay logic on the web page and Save.</w:t>
+            </w:r>
+          </w:p>
+        </w:tc>
+      </w:tr>
+      <w:tr>
+        <w:tc>
+          <w:tcPr>
+            <w:tcW w:type="dxa" w:w="2304"/>
+          </w:tcPr>
+          <w:p>
+            <w:r/>
+            <w:r>
+              <w:rPr>
+                <w:rFonts w:ascii="Calibri" w:hAnsi="Calibri"/>
+                <w:b w:val="0"/>
+                <w:sz w:val="20"/>
+              </w:rPr>
+              <w:t>Phone cannot see BMS-Tester</w:t>
+            </w:r>
+          </w:p>
+        </w:tc>
+        <w:tc>
+          <w:tcPr>
+            <w:tcW w:type="dxa" w:w="6624"/>
+          </w:tcPr>
+          <w:p>
+            <w:r/>
+            <w:r>
+              <w:rPr>
+                <w:rFonts w:ascii="Calibri" w:hAnsi="Calibri"/>
+                <w:b w:val="0"/>
+                <w:sz w:val="20"/>
+              </w:rPr>
+              <w:t>Box fully booted? (takes ~5 s with Wi-Fi). Forget + rejoin; confirm a DATA USB cable powers it.</w:t>
+            </w:r>
+          </w:p>
+        </w:tc>
+      </w:tr>
+      <w:tr>
+        <w:tc>
+          <w:tcPr>
+            <w:tcW w:type="dxa" w:w="2304"/>
+          </w:tcPr>
+          <w:p>
+            <w:r/>
+            <w:r>
+              <w:rPr>
+                <w:rFonts w:ascii="Calibri" w:hAnsi="Calibri"/>
+                <w:b w:val="0"/>
+                <w:sz w:val="20"/>
+              </w:rPr>
+              <w:t>Web page won't open</w:t>
+            </w:r>
+          </w:p>
+        </w:tc>
+        <w:tc>
+          <w:tcPr>
+            <w:tcW w:type="dxa" w:w="6624"/>
+          </w:tcPr>
+          <w:p>
+            <w:r/>
+            <w:r>
+              <w:rPr>
+                <w:rFonts w:ascii="Calibri" w:hAnsi="Calibri"/>
+                <w:b w:val="0"/>
+                <w:sz w:val="20"/>
+              </w:rPr>
+              <w:t>Joined BMS-Tester (not office Wi-Fi)? Open 192.168.4.1 exactly.</w:t>
+            </w:r>
+          </w:p>
+        </w:tc>
+      </w:tr>
+      <w:tr>
+        <w:tc>
+          <w:tcPr>
+            <w:tcW w:type="dxa" w:w="2304"/>
+          </w:tcPr>
+          <w:p>
+            <w:r/>
+            <w:r>
+              <w:rPr>
+                <w:rFonts w:ascii="Calibri" w:hAnsi="Calibri"/>
+                <w:b w:val="0"/>
+                <w:sz w:val="20"/>
+              </w:rPr>
+              <w:t>Login rejected</w:t>
+            </w:r>
+          </w:p>
+        </w:tc>
+        <w:tc>
+          <w:tcPr>
+            <w:tcW w:type="dxa" w:w="6624"/>
+          </w:tcPr>
+          <w:p>
+            <w:r/>
+            <w:r>
+              <w:rPr>
+                <w:rFonts w:ascii="Calibri" w:hAnsi="Calibri"/>
+                <w:b w:val="0"/>
+                <w:sz w:val="20"/>
+              </w:rPr>
+              <w:t>Changed earlier? Ask who changed it. Else hold the box button 10 s (factory reset) → admin/admin123 back.</w:t>
+            </w:r>
+          </w:p>
+        </w:tc>
+      </w:tr>
+      <w:tr>
+        <w:tc>
+          <w:tcPr>
+            <w:tcW w:type="dxa" w:w="2304"/>
+          </w:tcPr>
+          <w:p>
+            <w:r/>
+            <w:r>
+              <w:rPr>
+                <w:rFonts w:ascii="Calibri" w:hAnsi="Calibri"/>
+                <w:b w:val="0"/>
+                <w:sz w:val="20"/>
+              </w:rPr>
               <w:t>PC cannot see S3</w:t>
             </w:r>
           </w:p>
@@ -2521,7 +3783,15 @@
         <w:pStyle w:val="ListBullet"/>
       </w:pPr>
       <w:r>
-        <w:t>Power the tester ONLY from USB. Never from the traction pack.</w:t>
+        <w:t>Power the tester ONLY from USB. Never from the traction pack. Relay coils ONLY from the 12 V adapter (grounds tied).</w:t>
+      </w:r>
+    </w:p>
+    <w:p>
+      <w:pPr>
+        <w:pStyle w:val="ListBullet"/>
+      </w:pPr>
+      <w:r>
+        <w:t>USB must be a real charger — the Wi-Fi radio is always on. A weak laptop port browns out.</w:t>
       </w:r>
     </w:p>
     <w:p>
@@ -2669,7 +3939,41 @@
                 <w:b w:val="0"/>
                 <w:sz w:val="20"/>
               </w:rPr>
-              <w:t>v2.1 program (parser + dispatcher + adaptive window).</w:t>
+              <w:t>v2.2 program (frozen responder core).</w:t>
+            </w:r>
+          </w:p>
+        </w:tc>
+      </w:tr>
+      <w:tr>
+        <w:tc>
+          <w:tcPr>
+            <w:tcW w:type="dxa" w:w="3744"/>
+          </w:tcPr>
+          <w:p>
+            <w:r/>
+            <w:r>
+              <w:rPr>
+                <w:rFonts w:ascii="Calibri" w:hAnsi="Calibri"/>
+                <w:b w:val="0"/>
+                <w:sz w:val="20"/>
+              </w:rPr>
+              <w:t>src/relay_ctrl.*, src/web_ui.*</w:t>
+            </w:r>
+          </w:p>
+        </w:tc>
+        <w:tc>
+          <w:tcPr>
+            <w:tcW w:type="dxa" w:w="5184"/>
+          </w:tcPr>
+          <w:p>
+            <w:r/>
+            <w:r>
+              <w:rPr>
+                <w:rFonts w:ascii="Calibri" w:hAnsi="Calibri"/>
+                <w:b w:val="0"/>
+                <w:sz w:val="20"/>
+              </w:rPr>
+              <w:t>v2.x relay sequencer + always-on AP dashboard.</w:t>
             </w:r>
           </w:p>
         </w:tc>
@@ -2703,7 +4007,7 @@
                 <w:b w:val="0"/>
                 <w:sz w:val="20"/>
               </w:rPr>
-              <w:t>2.0 (also baked into STATUS? replies).</w:t>
+              <w:t>2.1 (also baked into STATUS? replies).</w:t>
             </w:r>
           </w:p>
         </w:tc>
@@ -2737,7 +4041,7 @@
                 <w:b w:val="0"/>
                 <w:sz w:val="20"/>
               </w:rPr>
-              <w:t>Same v2.1 as an Arduino sketch + README.</w:t>
+              <w:t>Same v2.2 as an Arduino sketch + README (7 tabs).</w:t>
             </w:r>
           </w:p>
         </w:tc>
@@ -2755,7 +4059,7 @@
                 <w:b w:val="0"/>
                 <w:sz w:val="20"/>
               </w:rPr>
-              <w:t>firmware/*.bin</w:t>
+              <w:t>firmware/*.bin + firmware-n16r8/*.bin</w:t>
             </w:r>
           </w:p>
         </w:tc>
@@ -2771,7 +4075,7 @@
                 <w:b w:val="0"/>
                 <w:sz w:val="20"/>
               </w:rPr>
-              <w:t>Ready-to-flash v2.1 binaries + flash README.</w:t>
+              <w:t>Ready-to-flash v2.2 binaries + flash READMEs with SHAs.</w:t>
             </w:r>
           </w:p>
         </w:tc>
@@ -2789,7 +4093,7 @@
                 <w:b w:val="0"/>
                 <w:sz w:val="20"/>
               </w:rPr>
-              <w:t>test/test_checksum|test_logic|test_parser</w:t>
+              <w:t>test/ (8 suites)</w:t>
             </w:r>
           </w:p>
         </w:tc>
@@ -2805,7 +4109,7 @@
                 <w:b w:val="0"/>
                 <w:sz w:val="20"/>
               </w:rPr>
-              <w:t>32 automated tests, all passing.</w:t>
+              <w:t>67 automated tests, all passing (incl. website + 24 h sim).</w:t>
             </w:r>
           </w:p>
         </w:tc>
@@ -2840,6 +4144,40 @@
                 <w:sz w:val="20"/>
               </w:rPr>
               <w:t>8-day run: 691,040 polls answered, rollover crossed, no reset.</w:t>
+            </w:r>
+          </w:p>
+        </w:tc>
+      </w:tr>
+      <w:tr>
+        <w:tc>
+          <w:tcPr>
+            <w:tcW w:type="dxa" w:w="3744"/>
+          </w:tcPr>
+          <w:p>
+            <w:r/>
+            <w:r>
+              <w:rPr>
+                <w:rFonts w:ascii="Calibri" w:hAnsi="Calibri"/>
+                <w:b w:val="0"/>
+                <w:sz w:val="20"/>
+              </w:rPr>
+              <w:t>tools/virtual_bus.sh</w:t>
+            </w:r>
+          </w:p>
+        </w:tc>
+        <w:tc>
+          <w:tcPr>
+            <w:tcW w:type="dxa" w:w="5184"/>
+          </w:tcPr>
+          <w:p>
+            <w:r/>
+            <w:r>
+              <w:rPr>
+                <w:rFonts w:ascii="Calibri" w:hAnsi="Calibri"/>
+                <w:b w:val="0"/>
+                <w:sz w:val="20"/>
+              </w:rPr>
+              <w:t>One-shot PTY emulation: real protocol core vs scripted meter.</w:t>
             </w:r>
           </w:p>
         </w:tc>
@@ -3043,7 +4381,41 @@
                 <w:b w:val="0"/>
                 <w:sz w:val="20"/>
               </w:rPr>
-              <w:t>Browser simulation (meter now cycles 0x03/0x04/0x05).</w:t>
+              <w:t>Browser simulation + sim.yaml headless scenario (relays, buttons, meter).</w:t>
+            </w:r>
+          </w:p>
+        </w:tc>
+      </w:tr>
+      <w:tr>
+        <w:tc>
+          <w:tcPr>
+            <w:tcW w:type="dxa" w:w="3744"/>
+          </w:tcPr>
+          <w:p>
+            <w:r/>
+            <w:r>
+              <w:rPr>
+                <w:rFonts w:ascii="Calibri" w:hAnsi="Calibri"/>
+                <w:b w:val="0"/>
+                <w:sz w:val="20"/>
+              </w:rPr>
+              <w:t>wiki/</w:t>
+            </w:r>
+          </w:p>
+        </w:tc>
+        <w:tc>
+          <w:tcPr>
+            <w:tcW w:type="dxa" w:w="5184"/>
+          </w:tcPr>
+          <w:p>
+            <w:r/>
+            <w:r>
+              <w:rPr>
+                <w:rFonts w:ascii="Calibri" w:hAnsi="Calibri"/>
+                <w:b w:val="0"/>
+                <w:sz w:val="20"/>
+              </w:rPr>
+              <w:t>Online manual mirror (Relays page has the web guide).</w:t>
             </w:r>
           </w:p>
         </w:tc>
@@ -3111,7 +4483,7 @@
                 <w:b w:val="0"/>
                 <w:sz w:val="20"/>
               </w:rPr>
-              <w:t>Frozen v1.0 — untouched by v2.1 work. Current release: v2.1.</w:t>
+              <w:t>Frozen v1.0 — untouched by v2.2 work. Current release: v2.2.</w:t>
             </w:r>
           </w:p>
         </w:tc>
@@ -3128,7 +4500,7 @@
           <w:i/>
           <w:color w:val="595959"/>
         </w:rPr>
-        <w:t>— End of report v2.1. This document + the wiring table in §3 is all any electronics engineer needs to build, flash and maintain it. —</w:t>
+        <w:t>— End of report v2.2. This document + the wiring table in §3 is all any electronics engineer needs to build, flash and maintain it. —</w:t>
       </w:r>
     </w:p>
     <w:sectPr>
@@ -3154,7 +4526,7 @@
         <w:color w:val="595959"/>
         <w:sz w:val="18"/>
       </w:rPr>
-      <w:t xml:space="preserve">RS485 Connection Tester v2.1  —  Build &amp; Test Report   |   Page </w:t>
+      <w:t xml:space="preserve">RS485 Connection Tester v2.2  —  Build &amp; Test Report   |   Page </w:t>
     </w:r>
     <w:fldSimple w:instr="PAGE">
       <w:r/>

</xml_diff>

<commit_message>
v2.3: relay count/chase, 2-stage spoof, per-mode holds, industrial pack, logins, OTA (105/105)
</commit_message>
<xml_diff>
--- a/RS485-Tester-Report.docx
+++ b/RS485-Tester-Report.docx
@@ -30,7 +30,7 @@
           <w:color w:val="595959"/>
           <w:sz w:val="26"/>
         </w:rPr>
-        <w:t>Build &amp; Test Report v2.2 — for an electronics engineer, no coding needed</w:t>
+        <w:t>Build &amp; Test Report v2.3 — for an electronics engineer, no coding needed</w:t>
       </w:r>
     </w:p>
     <w:p/>
@@ -152,7 +152,7 @@
                 <w:b w:val="0"/>
                 <w:sz w:val="20"/>
               </w:rPr>
-              <w:t>v2.2 — answers 0x03/0x04/0x05, silent on the rest; self-adjusts to any poll speed; sequences 8 relays; serves a config web page</w:t>
+              <w:t>v2.3 — answers 0x03/0x04/0x05, silent on the rest; self-adjusts to any poll speed; sequences first-N relays (or chase wave); 2-stage fault values; serves a config web page + firmware updates</w:t>
             </w:r>
           </w:p>
         </w:tc>
@@ -186,7 +186,7 @@
                 <w:b w:val="0"/>
                 <w:sz w:val="20"/>
               </w:rPr>
-              <w:t>v1.0 frozen untouched (ZIP + git tag) — this report covers v2.2 only</w:t>
+              <w:t>v1.0 frozen untouched (ZIP + git tag) — this report covers v2.3 only</w:t>
             </w:r>
           </w:p>
         </w:tc>
@@ -254,7 +254,7 @@
                 <w:b w:val="0"/>
                 <w:sz w:val="20"/>
               </w:rPr>
-              <w:t>firmware.bin — v2.2 8 MB build, compiled + verified (SHA in firmware/README.md)</w:t>
+              <w:t>firmware.bin — v2.3 8 MB build, compiled + verified (SHA in firmware/README.md)</w:t>
             </w:r>
           </w:p>
         </w:tc>
@@ -288,7 +288,7 @@
                 <w:b w:val="0"/>
                 <w:sz w:val="20"/>
               </w:rPr>
-              <w:t>67 / 67 passing (protocol + lamps + faults + soak + relay/spoof/web/portal/24h sim)</w:t>
+              <w:t>105 / 105 passing (protocol + lamps + faults + soak + relay/chase/loop/spoof-stages/OTA/web/login/portal/24h sim)</w:t>
             </w:r>
           </w:p>
         </w:tc>
@@ -408,7 +408,7 @@
     </w:p>
     <w:p>
       <w:r>
-        <w:t>4.  How v2.2 works (every meter type, no code)</w:t>
+        <w:t>4.  How v2.3 works (every meter type, no code)</w:t>
       </w:r>
     </w:p>
     <w:p>
@@ -480,7 +480,7 @@
     </w:p>
     <w:p>
       <w:r>
-        <w:t>Nothing to press, reset or read. v2.2 handles every meter variant by itself: fast or slow polling, meters that ask for extra data (cell voltages, device name), and meters that send configuration writes — green lights for all of them as long as the wires carry real traffic.</w:t>
+        <w:t>Nothing to press, reset or read. v2.3 handles every meter variant by itself: fast or slow polling, meters that ask for extra data (cell voltages, device name), and meters that send configuration writes — green lights for all of them as long as the wires carry real traffic.</w:t>
       </w:r>
     </w:p>
     <w:p>
@@ -1712,7 +1712,7 @@
         <w:pStyle w:val="ListBullet"/>
       </w:pPr>
       <w:r>
-        <w:t>Pin choices are S3-safe (avoid strapping 0/3/45/46, USB 19/20, flash 26–37, console 43/44). Unchanged from v1.0 — a v1.0-wired box runs v2.2 firmware; only new wires are relays/button below.</w:t>
+        <w:t>Pin choices are S3-safe (avoid strapping 0/3/45/46, USB 19/20, flash 26–37, console 43/44). Unchanged from v1.0 — a v1.0-wired box runs v2.3 firmware; only new wires are relays/button below.</w:t>
       </w:r>
     </w:p>
     <w:p>
@@ -2194,7 +2194,7 @@
         <w:pStyle w:val="Heading1"/>
       </w:pPr>
       <w:r>
-        <w:t>4. How v2.2 works (the idea, no code)</w:t>
+        <w:t>4. How v2.3 works (the idea, no code)</w:t>
       </w:r>
     </w:p>
     <w:p>
@@ -2234,7 +2234,7 @@
         <w:pStyle w:val="ListNumber"/>
       </w:pPr>
       <w:r>
-        <w:t>Relays: one button press switches R1→R8 with an adjustable pause between clicks (default half a second), holds them, then releases — or switches all 8 at once. Three button styles are selectable: hold-then-auto-off with re-press abort, run-to-the-end ignoring presses, or re-press restarts from R1. The web page also toggles each relay by hand.</w:t>
+        <w:t>Relays: one button press switches the first N relays in order with an adjustable pause between clicks (default half a second), holds each mode for its own time in milliseconds, then releases — or switches them all at once, or sweeps a single lit relay (chase wave, both directions). Three button styles are selectable: hold-then-auto-off with re-press abort, run-to-the-end ignoring presses, or re-press restarts from R1. Burn-in extras: loop the cycle with a cooling pause, stop after N cycles, stagger the all-at-once inrush, name each relay (HORN, LIGHT…), and count cycles + relay clicks for QC. The web page also toggles each relay by hand.</w:t>
       </w:r>
     </w:p>
     <w:p>
@@ -2242,7 +2242,7 @@
         <w:pStyle w:val="ListNumber"/>
       </w:pPr>
       <w:r>
-        <w:t>Fault test: a second input (or the web FIRE button) makes the meter read 88.8 V / 88.8 A / 88.8 °C / 188 % for 10 seconds, then everything returns to normal by itself. Values and duration are adjustable.</w:t>
+        <w:t>Fault test: a second input (or the web FIRE button) first shows a realistic full pack (100 V / 100 A / 100 °C / 100 %) for 5 seconds, then the over-range pattern (88.8 / 88.8 / 88.8 / 188 %) for 10 seconds — then everything returns to normal by itself. Both stages (values + seconds) are adjustable. Note: if the meter shows 100 instead of 188, that is the meter capping the display — the box provably sends 188.</w:t>
       </w:r>
     </w:p>
     <w:p>
@@ -2250,7 +2250,7 @@
         <w:pStyle w:val="ListNumber"/>
       </w:pPr>
       <w:r>
-        <w:t>Web dashboard: the box permanently broadcasts its own Wi-Fi network (no office internet needed). Any phone or laptop joins it and opens the control page — live relay buttons, delay/mode settings, fault-test values, admin password. All settings survive power cuts.</w:t>
+        <w:t>Web dashboard: the box permanently broadcasts its own Wi-Fi network (no office internet needed). Any phone or laptop joins it and opens the control page — live relay buttons, delay/mode settings, fault-test values, firmware updates, admin password. Tick ‘remember this device’ to stay logged in for 30 days, even across power cuts. All settings survive power cuts.</w:t>
       </w:r>
     </w:p>
     <w:p>
@@ -2258,7 +2258,15 @@
         <w:pStyle w:val="ListNumber"/>
       </w:pPr>
       <w:r>
-        <w:t>Invisible helper: over USB the box answers STATUS? with GREEN 2.1 / RED 2.1 (the number is the firmware version). Only for automatic tests.</w:t>
+        <w:t>Firmware updates: two ways. Offline: open the Firmware upload page and send the matching .bin file (works with zero internet). Automatic: enter a phone-hotspot Wi-Fi once — the box checks GitHub for new releases and installs them itself when the bench is idle.</w:t>
+      </w:r>
+    </w:p>
+    <w:p>
+      <w:pPr>
+        <w:pStyle w:val="ListNumber"/>
+      </w:pPr>
+      <w:r>
+        <w:t>Invisible helper: over USB the box answers STATUS? with GREEN 2.3 / RED 2.3 (the number is the firmware version). Only for automatic tests.</w:t>
       </w:r>
     </w:p>
     <w:p>
@@ -2402,7 +2410,7 @@
         <w:pStyle w:val="ListNumber"/>
       </w:pPr>
       <w:r>
-        <w:t>Sequence card: mode (1-by-1 vs all-at-once), step pause in ms, hold time in s (0 = stay on), button style, relay logic. Save stores it through power cuts.</w:t>
+        <w:t>Sequence card: mode (1-by-1, chase wave, or all-at-once), how many relays (1–8), step pause in ms, hold time per mode in ms (0 = stay on), loop + cooling pause + cycle limit for burn-in, all-at-once stagger, direction, button style, relay logic. Save stores it through power cuts.</w:t>
       </w:r>
     </w:p>
     <w:p>
@@ -2410,7 +2418,31 @@
         <w:pStyle w:val="ListNumber"/>
       </w:pPr>
       <w:r>
-        <w:t>Fault card: set V/A/°C/percent + seconds, press FIRE — the meter shows the test values, then returns to normal by itself.</w:t>
+        <w:t>Relay labels card: give each relay a name (HORN, LIGHT…) — workers see names, not R-numbers.</w:t>
+      </w:r>
+    </w:p>
+    <w:p>
+      <w:pPr>
+        <w:pStyle w:val="ListNumber"/>
+      </w:pPr>
+      <w:r>
+        <w:t>Fault card: stage 1 (100s) and stage 2 (88.8/188) values + seconds each, press FIRE — the meter shows stage 1, then stage 2, then returns to normal by itself.</w:t>
+      </w:r>
+    </w:p>
+    <w:p>
+      <w:pPr>
+        <w:pStyle w:val="ListNumber"/>
+      </w:pPr>
+      <w:r>
+        <w:t>Firmware card: tick auto-check and enter a hotspot Wi-Fi once for automatic updates; or open the Firmware upload page and send a .bin file (no internet needed).</w:t>
+      </w:r>
+    </w:p>
+    <w:p>
+      <w:pPr>
+        <w:pStyle w:val="ListNumber"/>
+      </w:pPr>
+      <w:r>
+        <w:t>Admin card: Wi-Fi + login passwords, auto-start on boot (burn-in), reboot, factory reset.</w:t>
       </w:r>
     </w:p>
     <w:tbl>
@@ -2606,7 +2638,7 @@
     </w:p>
     <w:p>
       <w:r>
-        <w:t>Built with the genuine Espressif Xtensa GCC 8.4.0 toolchain (PlatformIO + Arduino framework), 6 cores, incremental + cache: v2.2 compiled in 46 seconds. Binary inspected afterward:</w:t>
+        <w:t>Built with the genuine Espressif Xtensa GCC 8.4.0 toolchain (PlatformIO + Arduino framework): both S3 profiles compiled SUCCESS (8 MB + N16R8). Binary inspected afterward:</w:t>
       </w:r>
     </w:p>
     <w:tbl>
@@ -2693,7 +2725,7 @@
                 <w:b w:val="0"/>
                 <w:sz w:val="20"/>
               </w:rPr>
-              <w:t>v2.2 8 MB build — three canned replies (0x03/0x04/0x05) plus STATUS?, relay sequencer, AP dashboard; SHAs in firmware/README.md.</w:t>
+              <w:t>v2.3 8 MB build — three canned replies (0x03/0x04/0x05) plus STATUS?, relay bench (count/chase/loop/labels), AP dashboard, 2-stage spoof, OTA; SHAs in firmware/README.md.</w:t>
             </w:r>
           </w:p>
         </w:tc>
@@ -2727,7 +2759,7 @@
                 <w:b w:val="0"/>
                 <w:sz w:val="20"/>
               </w:rPr>
-              <w:t>see firmware/README.md (v2.2 binaries refreshed; golden bytes + version + AP strings verified inside)</w:t>
+              <w:t>see firmware/README.md (v2.3 binaries refreshed; golden bytes + version + AP strings verified inside)</w:t>
             </w:r>
           </w:p>
         </w:tc>
@@ -2795,7 +2827,7 @@
                 <w:b w:val="0"/>
                 <w:sz w:val="20"/>
               </w:rPr>
-              <w:t>All three unit-test programs also compile + link for the S3 chip (they execute once a board is plugged in).</w:t>
+              <w:t>All unit-test programs also compile + link for the S3 chip (they execute once a board is plugged in).</w:t>
             </w:r>
           </w:p>
         </w:tc>
@@ -2829,7 +2861,7 @@
                 <w:b w:val="0"/>
                 <w:sz w:val="20"/>
               </w:rPr>
-              <w:t>QEMU 9.2.2 built from source on this phone; it boots our firmware to the Arduino flash-init step. Tracing proved QEMU's flash model lacked RDID 0x90/0xAB and GD25Q64 SFDP — both patched (separate emulator repo). Only an undecodable DIO-era cmd 0x77 remains: emulator gap, our code is never reached. Wokwi S3 is the practical Arduino-emulation path.</w:t>
+              <w:t>Not re-run for v2.3 (QEMU cannot start inside the phone sandbox). Known Arduino-guest flash-model gap unchanged since v2.1 — our code is never reached there. Wokwi S3 is the practical Arduino-emulation path.</w:t>
             </w:r>
           </w:p>
         </w:tc>
@@ -2841,7 +2873,7 @@
         <w:pStyle w:val="Heading2"/>
       </w:pPr>
       <w:r>
-        <w:t>7.2 Automated tests — 67 / 67 PASS (run_tests.sh)</w:t>
+        <w:t>7.2 Automated tests — 105 / 105 PASS (run_tests.sh)</w:t>
       </w:r>
     </w:p>
     <w:tbl>
@@ -3134,7 +3166,7 @@
                 <w:b w:val="0"/>
                 <w:sz w:val="20"/>
               </w:rPr>
-              <w:t>Relay sequencer (12)</w:t>
+              <w:t>Relay bench (24)</w:t>
             </w:r>
           </w:p>
         </w:tc>
@@ -3150,7 +3182,7 @@
                 <w:b w:val="0"/>
                 <w:sz w:val="20"/>
               </w:rPr>
-              <w:t>Boot OFF, stepping, hold expiry/forever, ALL-ON, all 3 button behaviors, abort/restart, override, polarity, rollover, debounce.</w:t>
+              <w:t>Boot OFF, stepping, per-mode ms holds, ALL-ON, chase wave + count scoping, loop/pause/limit, reverse direction, ALL-ON stagger, QC counters, all 3 button behaviors, abort/restart, override, polarity, rollover, debounce.</w:t>
             </w:r>
           </w:p>
         </w:tc>
@@ -3166,7 +3198,7 @@
                 <w:b w:val="0"/>
                 <w:sz w:val="20"/>
               </w:rPr>
-              <w:t>12 PASS</w:t>
+              <w:t>24 PASS</w:t>
             </w:r>
           </w:p>
         </w:tc>
@@ -3184,7 +3216,7 @@
                 <w:b w:val="0"/>
                 <w:sz w:val="20"/>
               </w:rPr>
-              <w:t>Spoof frame + window (6)</w:t>
+              <w:t>Spoof 2-stage (11)</w:t>
             </w:r>
           </w:p>
         </w:tc>
@@ -3200,7 +3232,57 @@
                 <w:b w:val="0"/>
                 <w:sz w:val="20"/>
               </w:rPr>
-              <w:t>88.8/88.8/88.8/188 bytes, checksum validity, custom values, timing/cancel/retrigger, rollover.</w:t>
+              <w:t>Stage-1 ‘100’ + stage-2 88.8/88.8/88.8/188 bytes, checksum validity, custom values, stage handoff/cancel/retrigger, rollover.</w:t>
+            </w:r>
+          </w:p>
+        </w:tc>
+        <w:tc>
+          <w:tcPr>
+            <w:tcW w:type="dxa" w:w="1296"/>
+          </w:tcPr>
+          <w:p>
+            <w:r/>
+            <w:r>
+              <w:rPr>
+                <w:rFonts w:ascii="Calibri" w:hAnsi="Calibri"/>
+                <w:b w:val="0"/>
+                <w:sz w:val="20"/>
+              </w:rPr>
+              <w:t>11 PASS</w:t>
+            </w:r>
+          </w:p>
+        </w:tc>
+      </w:tr>
+      <w:tr>
+        <w:tc>
+          <w:tcPr>
+            <w:tcW w:type="dxa" w:w="3312"/>
+          </w:tcPr>
+          <w:p>
+            <w:r/>
+            <w:r>
+              <w:rPr>
+                <w:rFonts w:ascii="Calibri" w:hAnsi="Calibri"/>
+                <w:b w:val="0"/>
+                <w:sz w:val="20"/>
+              </w:rPr>
+              <w:t>OTA logic (6)</w:t>
+            </w:r>
+          </w:p>
+        </w:tc>
+        <w:tc>
+          <w:tcPr>
+            <w:tcW w:type="dxa" w:w="4176"/>
+          </w:tcPr>
+          <w:p>
+            <w:r/>
+            <w:r>
+              <w:rPr>
+                <w:rFonts w:ascii="Calibri" w:hAnsi="Calibri"/>
+                <w:b w:val="0"/>
+                <w:sz w:val="20"/>
+              </w:rPr>
+              <w:t>Version compare (2.10 &gt; 2.9), per-board file pick, safe download links, idle-only auto-check gate.</w:t>
             </w:r>
           </w:p>
         </w:tc>
@@ -3234,7 +3316,7 @@
                 <w:b w:val="0"/>
                 <w:sz w:val="20"/>
               </w:rPr>
-              <w:t>Website, host-executed (15)</w:t>
+              <w:t>Website, host-executed (29)</w:t>
             </w:r>
           </w:p>
         </w:tc>
@@ -3250,7 +3332,7 @@
                 <w:b w:val="0"/>
                 <w:sz w:val="20"/>
               </w:rPr>
-              <w:t>Login, portal redirect, auth gates, validation, NVS round-trip, relay/seq/spoof/admin handlers, expiry, logout, fuzz, factory reset.</w:t>
+              <w:t>Login, remember-me + expiry, NVS v2→v3 migration, portal redirect, auth gates, validation, coalesced saves, count/chase/loop/labels/counters/STA/OTA/upload handlers, logout, fuzz, factory reset.</w:t>
             </w:r>
           </w:p>
         </w:tc>
@@ -3266,7 +3348,7 @@
                 <w:b w:val="0"/>
                 <w:sz w:val="20"/>
               </w:rPr>
-              <w:t>15 PASS</w:t>
+              <w:t>29 PASS</w:t>
             </w:r>
           </w:p>
         </w:tc>
@@ -3284,7 +3366,7 @@
                 <w:b w:val="0"/>
                 <w:sz w:val="20"/>
               </w:rPr>
-              <w:t>System 24 h sim (2)</w:t>
+              <w:t>System 24 h sim (3)</w:t>
             </w:r>
           </w:p>
         </w:tc>
@@ -3300,7 +3382,7 @@
                 <w:b w:val="0"/>
                 <w:sz w:val="20"/>
               </w:rPr>
-              <w:t>Reply-selection matrix + 86,400-poll office day: every reply checksum-validated, exact 10 s spoof, relay schedule, noise, green all day.</w:t>
+              <w:t>Reply-selection matrix + 86,400-poll office day: every reply checksum-validated, exact 5 s + 10 s spoof stages, relay + chase schedule, loop cycles, noise, green all day.</w:t>
             </w:r>
           </w:p>
         </w:tc>
@@ -3316,7 +3398,7 @@
                 <w:b w:val="0"/>
                 <w:sz w:val="20"/>
               </w:rPr>
-              <w:t>2 PASS</w:t>
+              <w:t>3 PASS</w:t>
             </w:r>
           </w:p>
         </w:tc>
@@ -3355,6 +3437,14 @@
       </w:pPr>
       <w:r>
         <w:t>1) The new parser emitted a frame when a corrupted checksum was followed by 0x77 — fixed by gating emission on checksum success, now covered by test. 2) A hand-written test vector had a wrong checksum (FEEF, not FEFF) — fixed. 3) Arduino's headers define a B1 macro that broke the parser's state names on S3 builds — renamed, S3 build green.</w:t>
+      </w:r>
+    </w:p>
+    <w:p>
+      <w:pPr>
+        <w:pStyle w:val="ListBullet"/>
+      </w:pPr>
+      <w:r>
+        <w:t>4) v2.3 host stubs: the single-character cookie search returned garbage and cut login tokens (2 web tests caught it) — parsing now uses the exact-match search. 5) A stray semicolon ended the dashboard status builder early and dropped the fault-test values from the web reply (2 web tests caught it before release).</w:t>
       </w:r>
     </w:p>
     <w:p>
@@ -3593,7 +3683,7 @@
                 <w:b w:val="0"/>
                 <w:sz w:val="20"/>
               </w:rPr>
-              <w:t>1) 12 V adapter plugged + LED on module lit.  2) 12 V GND tied to ESP GND.  3) Web page → relay logic matches module (default LOW).</w:t>
+              <w:t>1) 12 V adapter plugged + LED on module lit.  2) 12 V GND tied to ESP GND.  3) Web page → relay logic matches module (default LOW).  4) Relays card: relays past the count are greyed out — raise Relays.</w:t>
             </w:r>
           </w:p>
         </w:tc>
@@ -3628,6 +3718,74 @@
                 <w:sz w:val="20"/>
               </w:rPr>
               <w:t>Wrong logic setting — flip relay logic on the web page and Save.</w:t>
+            </w:r>
+          </w:p>
+        </w:tc>
+      </w:tr>
+      <w:tr>
+        <w:tc>
+          <w:tcPr>
+            <w:tcW w:type="dxa" w:w="2304"/>
+          </w:tcPr>
+          <w:p>
+            <w:r/>
+            <w:r>
+              <w:rPr>
+                <w:rFonts w:ascii="Calibri" w:hAnsi="Calibri"/>
+                <w:b w:val="0"/>
+                <w:sz w:val="20"/>
+              </w:rPr>
+              <w:t>Relays stay ON forever</w:t>
+            </w:r>
+          </w:p>
+        </w:tc>
+        <w:tc>
+          <w:tcPr>
+            <w:tcW w:type="dxa" w:w="6624"/>
+          </w:tcPr>
+          <w:p>
+            <w:r/>
+            <w:r>
+              <w:rPr>
+                <w:rFonts w:ascii="Calibri" w:hAnsi="Calibri"/>
+                <w:b w:val="0"/>
+                <w:sz w:val="20"/>
+              </w:rPr>
+              <w:t>Normal if a hold is 0 (= stay on until STOP). Set per-mode hold ms (sequence / chase / all-on) to the wanted time.</w:t>
+            </w:r>
+          </w:p>
+        </w:tc>
+      </w:tr>
+      <w:tr>
+        <w:tc>
+          <w:tcPr>
+            <w:tcW w:type="dxa" w:w="2304"/>
+          </w:tcPr>
+          <w:p>
+            <w:r/>
+            <w:r>
+              <w:rPr>
+                <w:rFonts w:ascii="Calibri" w:hAnsi="Calibri"/>
+                <w:b w:val="0"/>
+                <w:sz w:val="20"/>
+              </w:rPr>
+              <w:t>188 % shows 100</w:t>
+            </w:r>
+          </w:p>
+        </w:tc>
+        <w:tc>
+          <w:tcPr>
+            <w:tcW w:type="dxa" w:w="6624"/>
+          </w:tcPr>
+          <w:p>
+            <w:r/>
+            <w:r>
+              <w:rPr>
+                <w:rFonts w:ascii="Calibri" w:hAnsi="Calibri"/>
+                <w:b w:val="0"/>
+                <w:sz w:val="20"/>
+              </w:rPr>
+              <w:t>The meter caps the display — the box provably sends 188 (valid checksum). Use stage 1 (100) for a realistic demo.</w:t>
             </w:r>
           </w:p>
         </w:tc>
@@ -3939,7 +4097,7 @@
                 <w:b w:val="0"/>
                 <w:sz w:val="20"/>
               </w:rPr>
-              <w:t>v2.2 program (frozen responder core).</w:t>
+              <w:t>v2.3 program (frozen responder core).</w:t>
             </w:r>
           </w:p>
         </w:tc>
@@ -3957,7 +4115,7 @@
                 <w:b w:val="0"/>
                 <w:sz w:val="20"/>
               </w:rPr>
-              <w:t>src/relay_ctrl.*, src/web_ui.*</w:t>
+              <w:t>src/relay_ctrl.*, src/web_ui.*, src/ota.*</w:t>
             </w:r>
           </w:p>
         </w:tc>
@@ -3973,7 +4131,7 @@
                 <w:b w:val="0"/>
                 <w:sz w:val="20"/>
               </w:rPr>
-              <w:t>v2.x relay sequencer + always-on AP dashboard.</w:t>
+              <w:t>v2.3 relay bench + dashboard + update logic.</w:t>
             </w:r>
           </w:p>
         </w:tc>
@@ -4007,7 +4165,7 @@
                 <w:b w:val="0"/>
                 <w:sz w:val="20"/>
               </w:rPr>
-              <w:t>2.1 (also baked into STATUS? replies).</w:t>
+              <w:t>2.3 (also baked into STATUS? replies).</w:t>
             </w:r>
           </w:p>
         </w:tc>
@@ -4041,7 +4199,7 @@
                 <w:b w:val="0"/>
                 <w:sz w:val="20"/>
               </w:rPr>
-              <w:t>Same v2.2 as an Arduino sketch + README (7 tabs).</w:t>
+              <w:t>Same v2.3 as an Arduino sketch + README (9 tabs).</w:t>
             </w:r>
           </w:p>
         </w:tc>
@@ -4075,7 +4233,7 @@
                 <w:b w:val="0"/>
                 <w:sz w:val="20"/>
               </w:rPr>
-              <w:t>Ready-to-flash v2.2 binaries + flash READMEs with SHAs.</w:t>
+              <w:t>Ready-to-flash v2.3 binaries + flash READMEs with SHAs.</w:t>
             </w:r>
           </w:p>
         </w:tc>
@@ -4093,7 +4251,7 @@
                 <w:b w:val="0"/>
                 <w:sz w:val="20"/>
               </w:rPr>
-              <w:t>test/ (8 suites)</w:t>
+              <w:t>test/ (9 suites)</w:t>
             </w:r>
           </w:p>
         </w:tc>
@@ -4109,7 +4267,7 @@
                 <w:b w:val="0"/>
                 <w:sz w:val="20"/>
               </w:rPr>
-              <w:t>67 automated tests, all passing (incl. website + 24 h sim).</w:t>
+              <w:t>105 automated tests, all passing (incl. relay bench, OTA, website + 24 h sim).</w:t>
             </w:r>
           </w:p>
         </w:tc>
@@ -4483,7 +4641,7 @@
                 <w:b w:val="0"/>
                 <w:sz w:val="20"/>
               </w:rPr>
-              <w:t>Frozen v1.0 — untouched by v2.2 work. Current release: v2.2.</w:t>
+              <w:t>Frozen v1.0 — untouched by v2.3 work. Current release: v2.3.</w:t>
             </w:r>
           </w:p>
         </w:tc>
@@ -4500,7 +4658,7 @@
           <w:i/>
           <w:color w:val="595959"/>
         </w:rPr>
-        <w:t>— End of report v2.2. This document + the wiring table in §3 is all any electronics engineer needs to build, flash and maintain it. —</w:t>
+        <w:t>— End of report v2.3. This document + the wiring table in §3 is all any electronics engineer needs to build, flash and maintain it. —</w:t>
       </w:r>
     </w:p>
     <w:sectPr>
@@ -4526,7 +4684,7 @@
         <w:color w:val="595959"/>
         <w:sz w:val="18"/>
       </w:rPr>
-      <w:t xml:space="preserve">RS485 Connection Tester v2.2  —  Build &amp; Test Report   |   Page </w:t>
+      <w:t xml:space="preserve">RS485 Connection Tester v2.3  —  Build &amp; Test Report   |   Page </w:t>
     </w:r>
     <w:fldSimple w:instr="PAGE">
       <w:r/>

</xml_diff>

<commit_message>
v2.3.1: no login wall, sticky saves, chase sweeps, spoof GPIO, kill switch, OTA install (103/103)
</commit_message>
<xml_diff>
--- a/RS485-Tester-Report.docx
+++ b/RS485-Tester-Report.docx
@@ -30,7 +30,7 @@
           <w:color w:val="595959"/>
           <w:sz w:val="26"/>
         </w:rPr>
-        <w:t>Build &amp; Test Report v2.3 — for an electronics engineer, no coding needed</w:t>
+        <w:t>Build &amp; Test Report v2.3.1 — for an electronics engineer, no coding needed</w:t>
       </w:r>
     </w:p>
     <w:p/>
@@ -152,7 +152,7 @@
                 <w:b w:val="0"/>
                 <w:sz w:val="20"/>
               </w:rPr>
-              <w:t>v2.3 — answers 0x03/0x04/0x05, silent on the rest; self-adjusts to any poll speed; sequences first-N relays (or chase wave); 2-stage fault values; serves a config web page + firmware updates</w:t>
+              <w:t>v2.3.1 — answers 0x03/0x04/0x05, silent on the rest; self-adjusts to any poll speed; sequences first-N relays (or chase wave); 2-stage fault values; serves a config web page + firmware updates</w:t>
             </w:r>
           </w:p>
         </w:tc>
@@ -186,7 +186,7 @@
                 <w:b w:val="0"/>
                 <w:sz w:val="20"/>
               </w:rPr>
-              <w:t>v1.0 frozen untouched (ZIP + git tag) — this report covers v2.3 only</w:t>
+              <w:t>v1.0 frozen untouched (ZIP + git tag) — this report covers v2.3.1 (patch on v2.3)</w:t>
             </w:r>
           </w:p>
         </w:tc>
@@ -254,7 +254,7 @@
                 <w:b w:val="0"/>
                 <w:sz w:val="20"/>
               </w:rPr>
-              <w:t>firmware.bin — v2.3 8 MB build, compiled + verified (SHA in firmware/README.md)</w:t>
+              <w:t>firmware.bin — v2.3.1 8 MB build, compiled + verified (SHA in firmware/README.md)</w:t>
             </w:r>
           </w:p>
         </w:tc>
@@ -288,7 +288,7 @@
                 <w:b w:val="0"/>
                 <w:sz w:val="20"/>
               </w:rPr>
-              <w:t>105 / 105 passing (protocol + lamps + faults + soak + relay/chase/loop/spoof-stages/OTA/web/login/portal/24h sim)</w:t>
+              <w:t>103 / 103 passing (protocol + lamps + faults + soak + relay/chase/sweeps/spoof-stages/spin/OTA/web/admin-gate/portal/24h sim)</w:t>
             </w:r>
           </w:p>
         </w:tc>
@@ -408,7 +408,7 @@
     </w:p>
     <w:p>
       <w:r>
-        <w:t>4.  How v2.3 works (every meter type, no code)</w:t>
+        <w:t>4.  How v2.3.1 works (every meter type, no code)</w:t>
       </w:r>
     </w:p>
     <w:p>
@@ -2194,7 +2194,7 @@
         <w:pStyle w:val="Heading1"/>
       </w:pPr>
       <w:r>
-        <w:t>4. How v2.3 works (the idea, no code)</w:t>
+        <w:t>4. How v2.3.1 works (the idea, no code)</w:t>
       </w:r>
     </w:p>
     <w:p>
@@ -2725,7 +2725,7 @@
                 <w:b w:val="0"/>
                 <w:sz w:val="20"/>
               </w:rPr>
-              <w:t>v2.3 8 MB build — three canned replies (0x03/0x04/0x05) plus STATUS?, relay bench (count/chase/loop/labels), AP dashboard, 2-stage spoof, OTA; SHAs in firmware/README.md.</w:t>
+              <w:t>v2.3.1 8 MB build — three canned replies (0x03/0x04/0x05) plus STATUS?, relay bench (count/chase/loop/labels), AP dashboard, 2-stage spoof, OTA; SHAs in firmware/README.md.</w:t>
             </w:r>
           </w:p>
         </w:tc>
@@ -2759,7 +2759,7 @@
                 <w:b w:val="0"/>
                 <w:sz w:val="20"/>
               </w:rPr>
-              <w:t>see firmware/README.md (v2.3 binaries refreshed; golden bytes + version + AP strings verified inside)</w:t>
+              <w:t>see firmware/README.md (v2.3.1 binaries refreshed; golden bytes + version + AP strings verified inside)</w:t>
             </w:r>
           </w:p>
         </w:tc>
@@ -2873,7 +2873,7 @@
         <w:pStyle w:val="Heading2"/>
       </w:pPr>
       <w:r>
-        <w:t>7.2 Automated tests — 105 / 105 PASS (run_tests.sh)</w:t>
+        <w:t>7.2 Automated tests — 103 / 103 PASS (run_tests.sh)</w:t>
       </w:r>
     </w:p>
     <w:tbl>
@@ -3444,7 +3444,7 @@
         <w:pStyle w:val="ListBullet"/>
       </w:pPr>
       <w:r>
-        <w:t>4) v2.3 host stubs: the single-character cookie search returned garbage and cut login tokens (2 web tests caught it) — parsing now uses the exact-match search. 5) A stray semicolon ended the dashboard status builder early and dropped the fault-test values from the web reply (2 web tests caught it before release).</w:t>
+        <w:t>4) Retired login wall (v2.3.1): per-request admin password now gates reboot/reset/upload/OTA-admin; the dashboard is open on the WPA2 AP. 5) A stray semicolon ended the dashboard status builder early and dropped the fault-test values from the web reply (2 web tests caught it before release). 6) GitHub OTA check never matched (API pretty-prints a space after the colon) + no dashboard install path (host reasoning + new web tests; fixed with tolerant parse + Install button).</w:t>
       </w:r>
     </w:p>
     <w:p>
@@ -4641,7 +4641,7 @@
                 <w:b w:val="0"/>
                 <w:sz w:val="20"/>
               </w:rPr>
-              <w:t>Frozen v1.0 — untouched by v2.3 work. Current release: v2.3.</w:t>
+              <w:t>Frozen v1.0 — untouched by v2.3.x work. Current release: v2.3.1.</w:t>
             </w:r>
           </w:p>
         </w:tc>
@@ -4658,7 +4658,7 @@
           <w:i/>
           <w:color w:val="595959"/>
         </w:rPr>
-        <w:t>— End of report v2.3. This document + the wiring table in §3 is all any electronics engineer needs to build, flash and maintain it. —</w:t>
+        <w:t>— End of report v2.3.1. This document + the wiring table in §3 is all any electronics engineer needs to build, flash and maintain it. —</w:t>
       </w:r>
     </w:p>
     <w:sectPr>
@@ -4684,7 +4684,7 @@
         <w:color w:val="595959"/>
         <w:sz w:val="18"/>
       </w:rPr>
-      <w:t xml:space="preserve">RS485 Connection Tester v2.3  —  Build &amp; Test Report   |   Page </w:t>
+      <w:t xml:space="preserve">RS485 Connection Tester v2.3.1  —  Build &amp; Test Report   |   Page </w:t>
     </w:r>
     <w:fldSimple w:instr="PAGE">
       <w:r/>

</xml_diff>

<commit_message>
v2.4: Tasmota-grade update, per-mode relay menu (R1-R31), console, backup/restore, STA test, info card (134/134)
</commit_message>
<xml_diff>
--- a/RS485-Tester-Report.docx
+++ b/RS485-Tester-Report.docx
@@ -30,7 +30,7 @@
           <w:color w:val="595959"/>
           <w:sz w:val="26"/>
         </w:rPr>
-        <w:t>Build &amp; Test Report v2.3.1 — for an electronics engineer, no coding needed</w:t>
+        <w:t>Build &amp; Test Report v2.4 — for an electronics engineer, no coding needed</w:t>
       </w:r>
     </w:p>
     <w:p/>
@@ -152,7 +152,7 @@
                 <w:b w:val="0"/>
                 <w:sz w:val="20"/>
               </w:rPr>
-              <w:t>v2.3.1 — answers 0x03/0x04/0x05, silent on the rest; self-adjusts to any poll speed; sequences first-N relays (or chase wave); 2-stage fault values; serves a config web page + firmware updates</w:t>
+              <w:t>v2.4 — answers 0x03/0x04/0x05, silent on the rest; self-adjusts to any poll speed; per-mode relay bench (sequential/chase/all-on); 2-stage fault values; config web page + Tasmota-grade firmware updates</w:t>
             </w:r>
           </w:p>
         </w:tc>
@@ -186,7 +186,7 @@
                 <w:b w:val="0"/>
                 <w:sz w:val="20"/>
               </w:rPr>
-              <w:t>v1.0 frozen untouched (ZIP + git tag) — this report covers v2.3.1 (patch on v2.3)</w:t>
+              <w:t>v1.0 frozen untouched (ZIP + git tag) — this report covers v2.4 (update + relay review on v2.3.1)</w:t>
             </w:r>
           </w:p>
         </w:tc>
@@ -254,7 +254,7 @@
                 <w:b w:val="0"/>
                 <w:sz w:val="20"/>
               </w:rPr>
-              <w:t>firmware.bin — v2.3.1 8 MB build, compiled + verified (SHA in firmware/README.md)</w:t>
+              <w:t>firmware.bin — v2.4 8 MB build, compiled + verified (SHA in firmware/README.md)</w:t>
             </w:r>
           </w:p>
         </w:tc>
@@ -288,7 +288,7 @@
                 <w:b w:val="0"/>
                 <w:sz w:val="20"/>
               </w:rPr>
-              <w:t>103 / 103 passing (protocol + lamps + faults + soak + relay/chase/sweeps/spoof-stages/spin/OTA/web/admin-gate/portal/24h sim)</w:t>
+              <w:t>134 / 134 passing (protocol + lamps + faults + soak + relay/BBM/dead-band/spoof-save/console/backup/OTA-URL/upload-gates/web/admin-gate/portal/24h sim)</w:t>
             </w:r>
           </w:p>
         </w:tc>
@@ -408,7 +408,7 @@
     </w:p>
     <w:p>
       <w:r>
-        <w:t>4.  How v2.3.1 works (every meter type, no code)</w:t>
+        <w:t>4.  How v2.4 works (every meter type, no code)</w:t>
       </w:r>
     </w:p>
     <w:p>
@@ -2194,7 +2194,7 @@
         <w:pStyle w:val="Heading1"/>
       </w:pPr>
       <w:r>
-        <w:t>4. How v2.3.1 works (the idea, no code)</w:t>
+        <w:t>4. How v2.4 works (the idea, no code)</w:t>
       </w:r>
     </w:p>
     <w:p>
@@ -2725,7 +2725,7 @@
                 <w:b w:val="0"/>
                 <w:sz w:val="20"/>
               </w:rPr>
-              <w:t>v2.3.1 8 MB build — three canned replies (0x03/0x04/0x05) plus STATUS?, relay bench (count/chase/loop/labels), AP dashboard, 2-stage spoof, OTA; SHAs in firmware/README.md.</w:t>
+              <w:t>v2.4 8 MB build — three canned replies (0x03/0x04/0x05) plus STATUS?, per-mode relay bench, AP dashboard + console, 2-stage spoof, Tasmota-grade OTA; SHAs in firmware/README.md.</w:t>
             </w:r>
           </w:p>
         </w:tc>
@@ -2759,7 +2759,7 @@
                 <w:b w:val="0"/>
                 <w:sz w:val="20"/>
               </w:rPr>
-              <w:t>see firmware/README.md (v2.3.1 binaries refreshed; golden bytes + version + AP strings verified inside)</w:t>
+              <w:t>see firmware/README.md (v2.4 binaries refreshed; golden bytes + version + AP strings verified inside)</w:t>
             </w:r>
           </w:p>
         </w:tc>
@@ -2861,7 +2861,7 @@
                 <w:b w:val="0"/>
                 <w:sz w:val="20"/>
               </w:rPr>
-              <w:t>Not re-run for v2.3 (QEMU cannot start inside the phone sandbox). Known Arduino-guest flash-model gap unchanged since v2.1 — our code is never reached there. Wokwi S3 is the practical Arduino-emulation path.</w:t>
+              <w:t>Parked at v2.4: Stage-0 flash model clean (GD WRSR2-QE + burst-wrap fixes banked), guest resets in the 2nd-stage bootloader (init returns 0x0a) — emulator gap, not firmware. Wokwi S3 + virtual-bus PTY emulation are the practical paths.</w:t>
             </w:r>
           </w:p>
         </w:tc>
@@ -2873,7 +2873,7 @@
         <w:pStyle w:val="Heading2"/>
       </w:pPr>
       <w:r>
-        <w:t>7.2 Automated tests — 103 / 103 PASS (run_tests.sh)</w:t>
+        <w:t>7.2 Automated tests — 134 / 134 PASS (run_tests.sh)</w:t>
       </w:r>
     </w:p>
     <w:tbl>
@@ -3166,7 +3166,7 @@
                 <w:b w:val="0"/>
                 <w:sz w:val="20"/>
               </w:rPr>
-              <w:t>Relay bench (24)</w:t>
+              <w:t>Relay bench (36)</w:t>
             </w:r>
           </w:p>
         </w:tc>
@@ -3182,7 +3182,7 @@
                 <w:b w:val="0"/>
                 <w:sz w:val="20"/>
               </w:rPr>
-              <w:t>Boot OFF, stepping, per-mode ms holds, ALL-ON, chase wave + count scoping, loop/pause/limit, reverse direction, ALL-ON stagger, QC counters, all 3 button behaviors, abort/restart, override, polarity, rollover, debounce.</w:t>
+              <w:t>Boot OFF, stepping, per-mode holds, ALL-ON (+ default stagger ramp), chase + 20 ms break-before-make, count live-shrink safety, loop/pause/limit, direction, counters, button behaviors, force-in-chase, RESTART keeps forces, stop dead-band, mid-cycle latching, polarity, rollover, debounce.</w:t>
             </w:r>
           </w:p>
         </w:tc>
@@ -3198,7 +3198,7 @@
                 <w:b w:val="0"/>
                 <w:sz w:val="20"/>
               </w:rPr>
-              <w:t>24 PASS</w:t>
+              <w:t>36 PASS</w:t>
             </w:r>
           </w:p>
         </w:tc>
@@ -3316,7 +3316,7 @@
                 <w:b w:val="0"/>
                 <w:sz w:val="20"/>
               </w:rPr>
-              <w:t>Website, host-executed (29)</w:t>
+              <w:t>Website, host-executed (41)</w:t>
             </w:r>
           </w:p>
         </w:tc>
@@ -3332,7 +3332,7 @@
                 <w:b w:val="0"/>
                 <w:sz w:val="20"/>
               </w:rPr>
-              <w:t>Login, remember-me + expiry, NVS v2→v3 migration, portal redirect, auth gates, validation, coalesced saves, count/chase/loop/labels/counters/STA/OTA/upload handlers, logout, fuzz, factory reset.</w:t>
+              <w:t>No login wall (per-request passwords), NVS migration, portal redirect, validation + named rejects, coalesced saves, per-mode config, spoof save/fire, Tasmota upload gates + rejects, console, backup/restore, STA test, OTA URL/interval/install, mDNS, keep-WiFi/bootcount resets, info fields, fuzz, factory reset.</w:t>
             </w:r>
           </w:p>
         </w:tc>
@@ -3348,7 +3348,57 @@
                 <w:b w:val="0"/>
                 <w:sz w:val="20"/>
               </w:rPr>
-              <w:t>29 PASS</w:t>
+              <w:t>41 PASS</w:t>
+            </w:r>
+          </w:p>
+        </w:tc>
+      </w:tr>
+      <w:tr>
+        <w:tc>
+          <w:tcPr>
+            <w:tcW w:type="dxa" w:w="3312"/>
+          </w:tcPr>
+          <w:p>
+            <w:r/>
+            <w:r>
+              <w:rPr>
+                <w:rFonts w:ascii="Calibri" w:hAnsi="Calibri"/>
+                <w:b w:val="0"/>
+                <w:sz w:val="20"/>
+              </w:rPr>
+              <w:t>Update gates (5)</w:t>
+            </w:r>
+          </w:p>
+        </w:tc>
+        <w:tc>
+          <w:tcPr>
+            <w:tcW w:type="dxa" w:w="4176"/>
+          </w:tcPr>
+          <w:p>
+            <w:r/>
+            <w:r>
+              <w:rPr>
+                <w:rFonts w:ascii="Calibri" w:hAnsi="Calibri"/>
+                <w:b w:val="0"/>
+                <w:sz w:val="20"/>
+              </w:rPr>
+              <w:t>Explicit sketch budget, variant asset pick, exact filename match (suffix-trap proof), image-head magic + flash-size matrix, error vocabulary.</w:t>
+            </w:r>
+          </w:p>
+        </w:tc>
+        <w:tc>
+          <w:tcPr>
+            <w:tcW w:type="dxa" w:w="1296"/>
+          </w:tcPr>
+          <w:p>
+            <w:r/>
+            <w:r>
+              <w:rPr>
+                <w:rFonts w:ascii="Calibri" w:hAnsi="Calibri"/>
+                <w:b w:val="0"/>
+                <w:sz w:val="20"/>
+              </w:rPr>
+              <w:t>5 PASS</w:t>
             </w:r>
           </w:p>
         </w:tc>
@@ -4097,7 +4147,7 @@
                 <w:b w:val="0"/>
                 <w:sz w:val="20"/>
               </w:rPr>
-              <w:t>v2.3 program (frozen responder core).</w:t>
+              <w:t>v2.4 program (frozen responder core).</w:t>
             </w:r>
           </w:p>
         </w:tc>
@@ -4115,7 +4165,7 @@
                 <w:b w:val="0"/>
                 <w:sz w:val="20"/>
               </w:rPr>
-              <w:t>src/relay_ctrl.*, src/web_ui.*, src/ota.*</w:t>
+              <w:t>src/relay_ctrl.*, src/web_ui.*, src/ota.*, src/fw_upload.h</w:t>
             </w:r>
           </w:p>
         </w:tc>
@@ -4131,7 +4181,7 @@
                 <w:b w:val="0"/>
                 <w:sz w:val="20"/>
               </w:rPr>
-              <w:t>v2.3 relay bench + dashboard + update logic.</w:t>
+              <w:t>v2.4 relay bench + dashboard + update gates.</w:t>
             </w:r>
           </w:p>
         </w:tc>
@@ -4199,7 +4249,7 @@
                 <w:b w:val="0"/>
                 <w:sz w:val="20"/>
               </w:rPr>
-              <w:t>Same v2.3 as an Arduino sketch + README (9 tabs).</w:t>
+              <w:t>Same v2.4 as an Arduino sketch + README (10 tabs).</w:t>
             </w:r>
           </w:p>
         </w:tc>
@@ -4233,7 +4283,7 @@
                 <w:b w:val="0"/>
                 <w:sz w:val="20"/>
               </w:rPr>
-              <w:t>Ready-to-flash v2.3 binaries + flash READMEs with SHAs.</w:t>
+              <w:t>Ready-to-flash v2.4 binaries + flash READMEs with SHAs.</w:t>
             </w:r>
           </w:p>
         </w:tc>
@@ -4641,7 +4691,7 @@
                 <w:b w:val="0"/>
                 <w:sz w:val="20"/>
               </w:rPr>
-              <w:t>Frozen v1.0 — untouched by v2.3.x work. Current release: v2.3.1.</w:t>
+              <w:t>Frozen v1.0 — untouched by v2.x work. Current release: v2.4.</w:t>
             </w:r>
           </w:p>
         </w:tc>
@@ -4658,7 +4708,7 @@
           <w:i/>
           <w:color w:val="595959"/>
         </w:rPr>
-        <w:t>— End of report v2.3.1. This document + the wiring table in §3 is all any electronics engineer needs to build, flash and maintain it. —</w:t>
+        <w:t>— End of report v2.4. This document + the wiring table in §3 is all any electronics engineer needs to build, flash and maintain it. —</w:t>
       </w:r>
     </w:p>
     <w:sectPr>
@@ -4684,7 +4734,7 @@
         <w:color w:val="595959"/>
         <w:sz w:val="18"/>
       </w:rPr>
-      <w:t xml:space="preserve">RS485 Connection Tester v2.3.1  —  Build &amp; Test Report   |   Page </w:t>
+      <w:t xml:space="preserve">RS485 Connection Tester v2.4  —  Build &amp; Test Report   |   Page </w:t>
     </w:r>
     <w:fldSimple w:instr="PAGE">
       <w:r/>

</xml_diff>

<commit_message>
v2.5: trigger save, portal landing, structured config, on-demand STA, tolerant JSON, socket harness 64/64, 30-day soak (137/137)
</commit_message>
<xml_diff>
--- a/RS485-Tester-Report.docx
+++ b/RS485-Tester-Report.docx
@@ -30,7 +30,7 @@
           <w:color w:val="595959"/>
           <w:sz w:val="26"/>
         </w:rPr>
-        <w:t>Build &amp; Test Report v2.4 — for an electronics engineer, no coding needed</w:t>
+        <w:t>Build &amp; Test Report v2.5 — for an electronics engineer, no coding needed</w:t>
       </w:r>
     </w:p>
     <w:p/>
@@ -152,7 +152,7 @@
                 <w:b w:val="0"/>
                 <w:sz w:val="20"/>
               </w:rPr>
-              <w:t>v2.4 — answers 0x03/0x04/0x05, silent on the rest; self-adjusts to any poll speed; per-mode relay bench (sequential/chase/all-on); 2-stage fault values; config web page + Tasmota-grade firmware updates</w:t>
+              <w:t>v2.5 — answers 0x03/0x04/0x05, silent on the rest; self-adjusts to any poll speed; per-mode relay bench; 2-stage fault values + trigger save; phone-friendly portal landing; config web page + Tasmota-grade firmware updates</w:t>
             </w:r>
           </w:p>
         </w:tc>
@@ -186,7 +186,7 @@
                 <w:b w:val="0"/>
                 <w:sz w:val="20"/>
               </w:rPr>
-              <w:t>v1.0 frozen untouched (ZIP + git tag) — this report covers v2.4 (update + relay review on v2.3.1)</w:t>
+              <w:t>v1.0 frozen untouched (ZIP + git tag) — this report covers v2.5 (trigger/portal/schema/emulation on v2.4)</w:t>
             </w:r>
           </w:p>
         </w:tc>
@@ -254,7 +254,7 @@
                 <w:b w:val="0"/>
                 <w:sz w:val="20"/>
               </w:rPr>
-              <w:t>firmware.bin — v2.4 8 MB build, compiled + verified (SHA in firmware/README.md)</w:t>
+              <w:t>firmware.bin — v2.5 8 MB build, compiled + verified (SHA in firmware/README.md)</w:t>
             </w:r>
           </w:p>
         </w:tc>
@@ -288,7 +288,7 @@
                 <w:b w:val="0"/>
                 <w:sz w:val="20"/>
               </w:rPr>
-              <w:t>134 / 134 passing (protocol + lamps + faults + soak + relay/BBM/dead-band/spoof-save/console/backup/OTA-URL/upload-gates/web/admin-gate/portal/24h sim)</w:t>
+              <w:t>137 / 137 passing + socket harness 64/64 (protocol + lamps + faults + 30-day soak + relay/BBM/dead-band/spoof-save+trigger/console/backup-v2/OTA-URL+ondemand/upload-gates/portal-landing/whitespace-JSON) + w3m page renders</w:t>
             </w:r>
           </w:p>
         </w:tc>
@@ -408,7 +408,7 @@
     </w:p>
     <w:p>
       <w:r>
-        <w:t>4.  How v2.4 works (every meter type, no code)</w:t>
+        <w:t>4.  How v2.5 works (every meter type, no code)</w:t>
       </w:r>
     </w:p>
     <w:p>
@@ -2194,7 +2194,7 @@
         <w:pStyle w:val="Heading1"/>
       </w:pPr>
       <w:r>
-        <w:t>4. How v2.4 works (the idea, no code)</w:t>
+        <w:t>4. How v2.5 works (the idea, no code)</w:t>
       </w:r>
     </w:p>
     <w:p>
@@ -2725,7 +2725,7 @@
                 <w:b w:val="0"/>
                 <w:sz w:val="20"/>
               </w:rPr>
-              <w:t>v2.4 8 MB build — three canned replies (0x03/0x04/0x05) plus STATUS?, per-mode relay bench, AP dashboard + console, 2-stage spoof, Tasmota-grade OTA; SHAs in firmware/README.md.</w:t>
+              <w:t>v2.5 8 MB build — three canned replies (0x03/0x04/0x05) plus STATUS?, per-mode relay bench, AP dashboard + console, 2-stage spoof + trigger save, phone landing page, Tasmota-grade OTA; SHAs in firmware/README.md.</w:t>
             </w:r>
           </w:p>
         </w:tc>
@@ -2759,7 +2759,7 @@
                 <w:b w:val="0"/>
                 <w:sz w:val="20"/>
               </w:rPr>
-              <w:t>see firmware/README.md (v2.4 binaries refreshed; golden bytes + version + AP strings verified inside)</w:t>
+              <w:t>see firmware/README.md (v2.5 binaries refreshed; golden bytes + version + AP strings verified inside)</w:t>
             </w:r>
           </w:p>
         </w:tc>
@@ -2873,7 +2873,7 @@
         <w:pStyle w:val="Heading2"/>
       </w:pPr>
       <w:r>
-        <w:t>7.2 Automated tests — 134 / 134 PASS (run_tests.sh)</w:t>
+        <w:t>7.2 Automated tests — 137 / 137 PASS (run_tests.sh) + socket harness 64/64</w:t>
       </w:r>
     </w:p>
     <w:tbl>
@@ -3316,7 +3316,7 @@
                 <w:b w:val="0"/>
                 <w:sz w:val="20"/>
               </w:rPr>
-              <w:t>Website, host-executed (41)</w:t>
+              <w:t>Website, host-executed (44)</w:t>
             </w:r>
           </w:p>
         </w:tc>
@@ -3332,7 +3332,7 @@
                 <w:b w:val="0"/>
                 <w:sz w:val="20"/>
               </w:rPr>
-              <w:t>No login wall (per-request passwords), NVS migration, portal redirect, validation + named rejects, coalesced saves, per-mode config, spoof save/fire, Tasmota upload gates + rejects, console, backup/restore, STA test, OTA URL/interval/install, mDNS, keep-WiFi/bootcount resets, info fields, fuzz, factory reset.</w:t>
+              <w:t>No login wall (per-request passwords), NVS migration, portal landing + redirect, validation + named rejects, whitespace-tolerant JSON, coalesced saves, per-mode config, spoof save/fire/trigger, Tasmota upload gates + rejects, console, backup v2 + restore v1/v2, STA test + on-demand join, OTA URL/interval/install, mDNS, keep-WiFi/bootcount resets, info fields, fuzz, factory reset.</w:t>
             </w:r>
           </w:p>
         </w:tc>
@@ -3348,7 +3348,107 @@
                 <w:b w:val="0"/>
                 <w:sz w:val="20"/>
               </w:rPr>
-              <w:t>41 PASS</w:t>
+              <w:t>44 PASS</w:t>
+            </w:r>
+          </w:p>
+        </w:tc>
+      </w:tr>
+      <w:tr>
+        <w:tc>
+          <w:tcPr>
+            <w:tcW w:type="dxa" w:w="3312"/>
+          </w:tcPr>
+          <w:p>
+            <w:r/>
+            <w:r>
+              <w:rPr>
+                <w:rFonts w:ascii="Calibri" w:hAnsi="Calibri"/>
+                <w:b w:val="0"/>
+                <w:sz w:val="20"/>
+              </w:rPr>
+              <w:t>Socket harness, real HTTP (54+10)</w:t>
+            </w:r>
+          </w:p>
+        </w:tc>
+        <w:tc>
+          <w:tcPr>
+            <w:tcW w:type="dxa" w:w="4176"/>
+          </w:tcPr>
+          <w:p>
+            <w:r/>
+            <w:r>
+              <w:rPr>
+                <w:rFonts w:ascii="Calibri" w:hAnsi="Calibri"/>
+                <w:b w:val="0"/>
+                <w:sz w:val="20"/>
+              </w:rPr>
+              <w:t>drive_emu.py: portal, relay flows, spoof/trigger, uploads, backup/restore, console, resets, STA/OTA, info — over the real handlers. drive_soak.py: 48 virtual hours looped, counters exact, NVS coalescing, spoof mid-run, clean stop.</w:t>
+            </w:r>
+          </w:p>
+        </w:tc>
+        <w:tc>
+          <w:tcPr>
+            <w:tcW w:type="dxa" w:w="1296"/>
+          </w:tcPr>
+          <w:p>
+            <w:r/>
+            <w:r>
+              <w:rPr>
+                <w:rFonts w:ascii="Calibri" w:hAnsi="Calibri"/>
+                <w:b w:val="0"/>
+                <w:sz w:val="20"/>
+              </w:rPr>
+              <w:t>64 PASS</w:t>
+            </w:r>
+          </w:p>
+        </w:tc>
+      </w:tr>
+      <w:tr>
+        <w:tc>
+          <w:tcPr>
+            <w:tcW w:type="dxa" w:w="3312"/>
+          </w:tcPr>
+          <w:p>
+            <w:r/>
+            <w:r>
+              <w:rPr>
+                <w:rFonts w:ascii="Calibri" w:hAnsi="Calibri"/>
+                <w:b w:val="0"/>
+                <w:sz w:val="20"/>
+              </w:rPr>
+              <w:t>Month soak (pure logic)</w:t>
+            </w:r>
+          </w:p>
+        </w:tc>
+        <w:tc>
+          <w:tcPr>
+            <w:tcW w:type="dxa" w:w="4176"/>
+          </w:tcPr>
+          <w:p>
+            <w:r/>
+            <w:r>
+              <w:rPr>
+                <w:rFonts w:ascii="Calibri" w:hAnsi="Calibri"/>
+                <w:b w:val="0"/>
+                <w:sz w:val="20"/>
+              </w:rPr>
+              <w:t>30 virtual days from day 40 across the millis() wrap: 2.59 M polls answered, 309 k looped cycles, exact stage/force/stop behavior, 30 NVS commits, silence → red → green, no reset.</w:t>
+            </w:r>
+          </w:p>
+        </w:tc>
+        <w:tc>
+          <w:tcPr>
+            <w:tcW w:type="dxa" w:w="1296"/>
+          </w:tcPr>
+          <w:p>
+            <w:r/>
+            <w:r>
+              <w:rPr>
+                <w:rFonts w:ascii="Calibri" w:hAnsi="Calibri"/>
+                <w:b w:val="0"/>
+                <w:sz w:val="20"/>
+              </w:rPr>
+              <w:t>SOAK PASS</w:t>
             </w:r>
           </w:p>
         </w:tc>
@@ -4691,7 +4791,7 @@
                 <w:b w:val="0"/>
                 <w:sz w:val="20"/>
               </w:rPr>
-              <w:t>Frozen v1.0 — untouched by v2.x work. Current release: v2.4.</w:t>
+              <w:t>Frozen v1.0 — untouched by v2.x work. Current release: v2.5.</w:t>
             </w:r>
           </w:p>
         </w:tc>
@@ -4708,7 +4808,7 @@
           <w:i/>
           <w:color w:val="595959"/>
         </w:rPr>
-        <w:t>— End of report v2.4. This document + the wiring table in §3 is all any electronics engineer needs to build, flash and maintain it. —</w:t>
+        <w:t>— End of report v2.5. This document + the wiring table in §3 is all any electronics engineer needs to build, flash and maintain it. —</w:t>
       </w:r>
     </w:p>
     <w:sectPr>
@@ -4734,7 +4834,7 @@
         <w:color w:val="595959"/>
         <w:sz w:val="18"/>
       </w:rPr>
-      <w:t xml:space="preserve">RS485 Connection Tester v2.4  —  Build &amp; Test Report   |   Page </w:t>
+      <w:t xml:space="preserve">RS485 Connection Tester v2.5  —  Build &amp; Test Report   |   Page </w:t>
     </w:r>
     <w:fldSimple w:instr="PAGE">
       <w:r/>

</xml_diff>

<commit_message>
docs sweep v2.6: every README/wiki/schema/HANDOFF/report to 2.6, test_meter in pio native (152/152), v2.6 docx
</commit_message>
<xml_diff>
--- a/RS485-Tester-Report.docx
+++ b/RS485-Tester-Report.docx
@@ -30,7 +30,7 @@
           <w:color w:val="595959"/>
           <w:sz w:val="26"/>
         </w:rPr>
-        <w:t>Build &amp; Test Report v2.5 — for an electronics engineer, no coding needed</w:t>
+        <w:t>Build &amp; Test Report v2.6 — for an electronics engineer, no coding needed</w:t>
       </w:r>
     </w:p>
     <w:p/>
@@ -152,7 +152,7 @@
                 <w:b w:val="0"/>
                 <w:sz w:val="20"/>
               </w:rPr>
-              <w:t>v2.5 — answers 0x03/0x04/0x05, silent on the rest; self-adjusts to any poll speed; per-mode relay bench; 2-stage fault values + trigger save; phone-friendly portal landing; config web page + Tasmota-grade firmware updates</w:t>
+              <w:t>v2.6 — answers 0x03/0x04/0x05, silent on the rest; self-adjusts to any poll speed; per-mode relay bench; 2-stage fault values + trigger save; phone-friendly portal landing; config web page + Tasmota-grade firmware updates; daily meter estimate from link gaps; round link dots; one-file flash images</w:t>
             </w:r>
           </w:p>
         </w:tc>
@@ -186,7 +186,7 @@
                 <w:b w:val="0"/>
                 <w:sz w:val="20"/>
               </w:rPr>
-              <w:t>v1.0 frozen untouched (ZIP + git tag) — this report covers v2.5 (trigger/portal/schema/emulation on v2.4)</w:t>
+              <w:t>v1.0 frozen untouched (ZIP + git tag) — this report covers v2.6 (meter estimate/dots/merged images on v2.5)</w:t>
             </w:r>
           </w:p>
         </w:tc>
@@ -254,7 +254,7 @@
                 <w:b w:val="0"/>
                 <w:sz w:val="20"/>
               </w:rPr>
-              <w:t>firmware.bin — v2.5 8 MB build, compiled + verified (SHA in firmware/README.md)</w:t>
+              <w:t>bms-tester-8mb.bin — v2.6 8 MB merged image (bootloader + partitions + app, one flash command), compiled + verified (SHAs in firmware/README.md)</w:t>
             </w:r>
           </w:p>
         </w:tc>
@@ -288,7 +288,7 @@
                 <w:b w:val="0"/>
                 <w:sz w:val="20"/>
               </w:rPr>
-              <w:t>137 / 137 passing + socket harness 64/64 (protocol + lamps + faults + 30-day soak + relay/BBM/dead-band/spoof-save+trigger/console/backup-v2/OTA-URL+ondemand/upload-gates/portal-landing/whitespace-JSON) + w3m page renders</w:t>
+              <w:t>152 / 152 passing + socket harness 72/72 (protocol + lamps + faults + 30-day soak + relay/BBM/dead-band/spoof-save+trigger/console/backup-v2/OTA-URL+ondemand/upload-gates/portal-landing/whitespace-JSON/meter-gaps/round-dots) + w3m page renders</w:t>
             </w:r>
           </w:p>
         </w:tc>
@@ -408,7 +408,7 @@
     </w:p>
     <w:p>
       <w:r>
-        <w:t>4.  How v2.5 works (every meter type, no code)</w:t>
+        <w:t>4.  How v2.6 works (every meter type, no code)</w:t>
       </w:r>
     </w:p>
     <w:p>
@@ -2150,6 +2150,56 @@
           </w:p>
         </w:tc>
       </w:tr>
+      <w:tr>
+        <w:tc>
+          <w:tcPr>
+            <w:tcW w:type="dxa" w:w="1728"/>
+          </w:tcPr>
+          <w:p>
+            <w:r/>
+            <w:r>
+              <w:rPr>
+                <w:rFonts w:ascii="Calibri" w:hAnsi="Calibri"/>
+                <w:b w:val="0"/>
+                <w:sz w:val="20"/>
+              </w:rPr>
+              <w:t>WiFi kill</w:t>
+            </w:r>
+          </w:p>
+        </w:tc>
+        <w:tc>
+          <w:tcPr>
+            <w:tcW w:type="dxa" w:w="3456"/>
+          </w:tcPr>
+          <w:p>
+            <w:r/>
+            <w:r>
+              <w:rPr>
+                <w:rFonts w:ascii="Calibri" w:hAnsi="Calibri"/>
+                <w:b w:val="0"/>
+                <w:sz w:val="20"/>
+              </w:rPr>
+              <w:t>S3 GPIO18 → switch → GND (optional)</w:t>
+            </w:r>
+          </w:p>
+        </w:tc>
+        <w:tc>
+          <w:tcPr>
+            <w:tcW w:type="dxa" w:w="3744"/>
+          </w:tcPr>
+          <w:p>
+            <w:r/>
+            <w:r>
+              <w:rPr>
+                <w:rFonts w:ascii="Calibri" w:hAnsi="Calibri"/>
+                <w:b w:val="0"/>
+                <w:sz w:val="20"/>
+              </w:rPr>
+              <w:t>Ground it to turn the Wi-Fi off completely; release to bring it back.</w:t>
+            </w:r>
+          </w:p>
+        </w:tc>
+      </w:tr>
     </w:tbl>
     <w:p/>
     <w:tbl>
@@ -2194,7 +2244,7 @@
         <w:pStyle w:val="Heading1"/>
       </w:pPr>
       <w:r>
-        <w:t>4. How v2.5 works (the idea, no code)</w:t>
+        <w:t>4. How v2.6 works (the idea, no code)</w:t>
       </w:r>
     </w:p>
     <w:p>
@@ -2250,7 +2300,7 @@
         <w:pStyle w:val="ListNumber"/>
       </w:pPr>
       <w:r>
-        <w:t>Web dashboard: the box permanently broadcasts its own Wi-Fi network (no office internet needed). Any phone or laptop joins it and opens the control page — live relay buttons, delay/mode settings, fault-test values, firmware updates, admin password. Tick ‘remember this device’ to stay logged in for 30 days, even across power cuts. All settings survive power cuts.</w:t>
+        <w:t>Web dashboard: the box permanently broadcasts its own Wi-Fi network (no office internet needed). Any phone or laptop joins it and opens the control page — live relay buttons, delay/mode settings, fault-test values, firmware updates. No login: the admin password (default admin123) is asked only for reboot, reset, upload and saves. The page header shows two round link dots (green/red) mirroring the lamps. All settings survive power cuts.</w:t>
       </w:r>
     </w:p>
     <w:p>
@@ -2258,7 +2308,7 @@
         <w:pStyle w:val="ListNumber"/>
       </w:pPr>
       <w:r>
-        <w:t>Firmware updates: two ways. Offline: open the Firmware upload page and send the matching .bin file (works with zero internet). Automatic: enter a phone-hotspot Wi-Fi once — the box checks GitHub for new releases and installs them itself when the bench is idle.</w:t>
+        <w:t>Firmware updates: two ways. Offline: flash the ONE merged file (bms-tester-8mb.bin for 8 MB boards, bms-tester-n16r8.bin for N16R8) at address 0x0 — bootloader, partitions and app in a single command — or open the Firmware upload page and send the matching .bin file (works with zero internet). Automatic: enter a phone-hotspot Wi-Fi once — the box checks GitHub for new releases and installs them itself when the bench is idle.</w:t>
       </w:r>
     </w:p>
     <w:p>
@@ -2266,7 +2316,15 @@
         <w:pStyle w:val="ListNumber"/>
       </w:pPr>
       <w:r>
-        <w:t>Invisible helper: over USB the box answers STATUS? with GREEN 2.3 / RED 2.3 (the number is the firmware version). Only for automatic tests.</w:t>
+        <w:t>Daily meter estimate: the box cannot tell meters apart on the wire (no meter ID exists), so it estimates from link gaps — a red gap of 3 seconds or more that turns green again means the worker swapped in a new meter; retries with the meter still plugged in never count. The dashboard shows meters / attempts / pass / fail (pass = a full relay cycle finished before the swap). Brief flickers never count, and a swap mid-cycle waits for idle before counting. The ‘New day’ button clears the four numbers (no clock on the box — the worker declares the day). Approximate by design, stated honestly on the page.</w:t>
+      </w:r>
+    </w:p>
+    <w:p>
+      <w:pPr>
+        <w:pStyle w:val="ListNumber"/>
+      </w:pPr>
+      <w:r>
+        <w:t>Invisible helper: over USB the box answers STATUS? with GREEN 2.6 / RED 2.6 (the number is the firmware version). Only for automatic tests.</w:t>
       </w:r>
     </w:p>
     <w:p>
@@ -2386,7 +2444,7 @@
         <w:pStyle w:val="ListNumber"/>
       </w:pPr>
       <w:r>
-        <w:t>Login: user admin, password admin123.</w:t>
+        <w:t>No login page — the dashboard opens directly. The admin password (default admin123) is asked only for reboot, reset, upload and saves.</w:t>
       </w:r>
     </w:p>
     <w:p>
@@ -2394,7 +2452,15 @@
         <w:pStyle w:val="ListNumber"/>
       </w:pPr>
       <w:r>
-        <w:t>FIRST: open the Admin card and change the Wi-Fi password and the login password. (Locked out later? Hold the box button 10 s — factory reset, back to the passwords above.)</w:t>
+        <w:t>FIRST: open the Admin card and change the Wi-Fi password and the admin password. (Locked out later? Hold the box button 10 s — factory reset, back to the passwords above.)</w:t>
+      </w:r>
+    </w:p>
+    <w:p>
+      <w:pPr>
+        <w:pStyle w:val="ListNumber"/>
+      </w:pPr>
+      <w:r>
+        <w:t>Top of the page: two round dots (green/red) mirror the lamps, next to the LINK pill.</w:t>
       </w:r>
     </w:p>
     <w:p>
@@ -2403,6 +2469,14 @@
       </w:pPr>
       <w:r>
         <w:t>Relays card: live green tiles = ON; tap any tile to force it; START runs the sequence, STOP ALL releases everything.</w:t>
+      </w:r>
+    </w:p>
+    <w:p>
+      <w:pPr>
+        <w:pStyle w:val="ListNumber"/>
+      </w:pPr>
+      <w:r>
+        <w:t>Meters card (v2.6): meters / attempts / pass / fail for the day — an estimate from link gaps, no button to press. ‘New day (reset)’ clears the four numbers (it asks first).</w:t>
       </w:r>
     </w:p>
     <w:p>
@@ -2524,7 +2598,7 @@
         <w:pStyle w:val="ListNumber"/>
       </w:pPr>
       <w:r>
-        <w:t>Run (replace PORT):  esptool.py --chip esp32s3 --port PORT --baud 460800 write-flash 0x0 bootloader.bin 0x8000 partitions.bin 0x10000 firmware.bin  (files in firmware/)</w:t>
+        <w:t>Run (replace PORT and pick ONE file for the board — 8 MB vs N16R8):  esptool.py --chip esp32s3 --port PORT --baud 460800 write-flash 0x0 bms-tester-8mb.bin  (files in firmware/ and firmware-n16r8/)</w:t>
       </w:r>
     </w:p>
     <w:p>
@@ -2565,7 +2639,7 @@
                 <w:rFonts w:ascii="Calibri" w:hAnsi="Calibri"/>
                 <w:sz w:val="22"/>
               </w:rPr>
-              <w:t>a browser flasher (e.g. espthings.io/tools/esp32-flasher) with the same three files at 0x0 / 0x8000 / 0x10000.</w:t>
+              <w:t>a browser flasher (e.g. espthings.io/tools/esp32-flasher) with the same single file at 0x0. Advanced: the folders also carry bootloader.bin + partitions.bin + firmware.bin for the classic three-address flash (0x0 / 0x8000 / 0x10000).</w:t>
             </w:r>
           </w:p>
         </w:tc>
@@ -2709,7 +2783,7 @@
                 <w:b w:val="0"/>
                 <w:sz w:val="20"/>
               </w:rPr>
-              <w:t>firmware.bin</w:t>
+              <w:t>bms-tester-8mb.bin</w:t>
             </w:r>
           </w:p>
         </w:tc>
@@ -2725,7 +2799,41 @@
                 <w:b w:val="0"/>
                 <w:sz w:val="20"/>
               </w:rPr>
-              <w:t>v2.5 8 MB build — three canned replies (0x03/0x04/0x05) plus STATUS?, per-mode relay bench, AP dashboard + console, 2-stage spoof + trigger save, phone landing page, Tasmota-grade OTA; SHAs in firmware/README.md.</w:t>
+              <w:t>v2.6 8 MB merged image — bootloader + partitions + app in ONE file (flash to 0x0): three canned replies (0x03/0x04/0x05) plus STATUS?, per-mode relay bench, AP dashboard + console, 2-stage spoof + trigger save, phone landing page, Tasmota-grade OTA, meter estimate + round dots; SHAs in firmware/README.md.</w:t>
+            </w:r>
+          </w:p>
+        </w:tc>
+      </w:tr>
+      <w:tr>
+        <w:tc>
+          <w:tcPr>
+            <w:tcW w:type="dxa" w:w="2448"/>
+          </w:tcPr>
+          <w:p>
+            <w:r/>
+            <w:r>
+              <w:rPr>
+                <w:rFonts w:ascii="Calibri" w:hAnsi="Calibri"/>
+                <w:b w:val="0"/>
+                <w:sz w:val="20"/>
+              </w:rPr>
+              <w:t>SHA-256 (merged image)</w:t>
+            </w:r>
+          </w:p>
+        </w:tc>
+        <w:tc>
+          <w:tcPr>
+            <w:tcW w:type="dxa" w:w="6480"/>
+          </w:tcPr>
+          <w:p>
+            <w:r/>
+            <w:r>
+              <w:rPr>
+                <w:rFonts w:ascii="Calibri" w:hAnsi="Calibri"/>
+                <w:b w:val="0"/>
+                <w:sz w:val="20"/>
+              </w:rPr>
+              <w:t>ba08f166fbdcaa40fbd8391479a3cf7687f3154eefeef8c7fae1bec31d8727b9 (1,070,800 bytes; bootloader E9 @0x0, partition magic @0x8000, app E9 @0x10000 verified)</w:t>
             </w:r>
           </w:p>
         </w:tc>
@@ -2759,7 +2867,41 @@
                 <w:b w:val="0"/>
                 <w:sz w:val="20"/>
               </w:rPr>
-              <w:t>see firmware/README.md (v2.5 binaries refreshed; golden bytes + version + AP strings verified inside)</w:t>
+              <w:t>4dc08487668ff9c37e15cc0bdc0c0bf24d19c8da32e3c1f0dd9516b1d313bbf9 (1,005,264 bytes; golden bytes + 2.6 + BMS-Tester verified inside)</w:t>
+            </w:r>
+          </w:p>
+        </w:tc>
+      </w:tr>
+      <w:tr>
+        <w:tc>
+          <w:tcPr>
+            <w:tcW w:type="dxa" w:w="2448"/>
+          </w:tcPr>
+          <w:p>
+            <w:r/>
+            <w:r>
+              <w:rPr>
+                <w:rFonts w:ascii="Calibri" w:hAnsi="Calibri"/>
+                <w:b w:val="0"/>
+                <w:sz w:val="20"/>
+              </w:rPr>
+              <w:t>N16R8 image</w:t>
+            </w:r>
+          </w:p>
+        </w:tc>
+        <w:tc>
+          <w:tcPr>
+            <w:tcW w:type="dxa" w:w="6480"/>
+          </w:tcPr>
+          <w:p>
+            <w:r/>
+            <w:r>
+              <w:rPr>
+                <w:rFonts w:ascii="Calibri" w:hAnsi="Calibri"/>
+                <w:b w:val="0"/>
+                <w:sz w:val="20"/>
+              </w:rPr>
+              <w:t>firmware-n16r8/bms-tester-n16r8.bin — same logic, 16 MB map (847f6c94…2c9ae3875e08db82842, 1,073,328 bytes).</w:t>
             </w:r>
           </w:p>
         </w:tc>
@@ -2873,7 +3015,7 @@
         <w:pStyle w:val="Heading2"/>
       </w:pPr>
       <w:r>
-        <w:t>7.2 Automated tests — 137 / 137 PASS (run_tests.sh) + socket harness 64/64</w:t>
+        <w:t>7.2 Automated tests — 152 / 152 PASS (run_tests.sh) + socket harness 72/72</w:t>
       </w:r>
     </w:p>
     <w:tbl>
@@ -3316,7 +3458,7 @@
                 <w:b w:val="0"/>
                 <w:sz w:val="20"/>
               </w:rPr>
-              <w:t>Website, host-executed (44)</w:t>
+              <w:t>Website, host-executed (49)</w:t>
             </w:r>
           </w:p>
         </w:tc>
@@ -3332,7 +3474,7 @@
                 <w:b w:val="0"/>
                 <w:sz w:val="20"/>
               </w:rPr>
-              <w:t>No login wall (per-request passwords), NVS migration, portal landing + redirect, validation + named rejects, whitespace-tolerant JSON, coalesced saves, per-mode config, spoof save/fire/trigger, Tasmota upload gates + rejects, console, backup v2 + restore v1/v2, STA test + on-demand join, OTA URL/interval/install, mDNS, keep-WiFi/bootcount resets, info fields, fuzz, factory reset.</w:t>
+              <w:t>No login wall (per-request passwords), round link dots + meters card, NVS migration, portal landing + redirect, validation + named rejects, whitespace-tolerant JSON, coalesced saves, per-mode config, spoof save/fire/trigger, Tasmota upload gates + rejects, console (+DAYRESET, meter batch in STATUS), /api/meter reset + link-gap closes over the real tick, backup v2 + restore v1/v2, STA test + on-demand join, OTA URL/interval/install, mDNS, keep-WiFi/bootcount resets, info fields, fuzz, factory reset.</w:t>
             </w:r>
           </w:p>
         </w:tc>
@@ -3348,7 +3490,7 @@
                 <w:b w:val="0"/>
                 <w:sz w:val="20"/>
               </w:rPr>
-              <w:t>44 PASS</w:t>
+              <w:t>49 PASS</w:t>
             </w:r>
           </w:p>
         </w:tc>
@@ -3366,7 +3508,7 @@
                 <w:b w:val="0"/>
                 <w:sz w:val="20"/>
               </w:rPr>
-              <w:t>Socket harness, real HTTP (54+10)</w:t>
+              <w:t>Socket harness, real HTTP (62+10)</w:t>
             </w:r>
           </w:p>
         </w:tc>
@@ -3382,7 +3524,7 @@
                 <w:b w:val="0"/>
                 <w:sz w:val="20"/>
               </w:rPr>
-              <w:t>drive_emu.py: portal, relay flows, spoof/trigger, uploads, backup/restore, console, resets, STA/OTA, info — over the real handlers. drive_soak.py: 48 virtual hours looped, counters exact, NVS coalescing, spoof mid-run, clean stop.</w:t>
+              <w:t>drive_emu.py: portal, relay flows, spoof/trigger, uploads, backup/restore, console, resets, STA/OTA, info, meter gaps + round dots (new /__bus bus-state control) — over the real handlers. drive_soak.py: 48 virtual hours looped, counters exact, NVS coalescing, spoof mid-run, clean stop.</w:t>
             </w:r>
           </w:p>
         </w:tc>
@@ -3398,7 +3540,57 @@
                 <w:b w:val="0"/>
                 <w:sz w:val="20"/>
               </w:rPr>
-              <w:t>64 PASS</w:t>
+              <w:t>72 PASS</w:t>
+            </w:r>
+          </w:p>
+        </w:tc>
+      </w:tr>
+      <w:tr>
+        <w:tc>
+          <w:tcPr>
+            <w:tcW w:type="dxa" w:w="3312"/>
+          </w:tcPr>
+          <w:p>
+            <w:r/>
+            <w:r>
+              <w:rPr>
+                <w:rFonts w:ascii="Calibri" w:hAnsi="Calibri"/>
+                <w:b w:val="0"/>
+                <w:sz w:val="20"/>
+              </w:rPr>
+              <w:t>Meter heuristic (10)</w:t>
+            </w:r>
+          </w:p>
+        </w:tc>
+        <w:tc>
+          <w:tcPr>
+            <w:tcW w:type="dxa" w:w="4176"/>
+          </w:tcPr>
+          <w:p>
+            <w:r/>
+            <w:r>
+              <w:rPr>
+                <w:rFonts w:ascii="Calibri" w:hAnsi="Calibri"/>
+                <w:b w:val="0"/>
+                <w:sz w:val="20"/>
+              </w:rPr>
+              <w:t>First GREEN opens #1, RESTARTs never open meters, cycle+gap = pass, retry loop = one verdict, flickers stay, abort+gap = fail, day reset + boot restore, 200-meter day boundary, millis-wrap + 50 k soak, mid-cycle gap defers to IDLE.</w:t>
+            </w:r>
+          </w:p>
+        </w:tc>
+        <w:tc>
+          <w:tcPr>
+            <w:tcW w:type="dxa" w:w="1296"/>
+          </w:tcPr>
+          <w:p>
+            <w:r/>
+            <w:r>
+              <w:rPr>
+                <w:rFonts w:ascii="Calibri" w:hAnsi="Calibri"/>
+                <w:b w:val="0"/>
+                <w:sz w:val="20"/>
+              </w:rPr>
+              <w:t>10 PASS</w:t>
             </w:r>
           </w:p>
         </w:tc>
@@ -3565,12 +3757,12 @@
         <w:pStyle w:val="Heading2"/>
       </w:pPr>
       <w:r>
-        <w:t>7.3 Week-long continuous run — SOAK PASS</w:t>
+        <w:t>7.3 Month-long continuous run — SOAK PASS</w:t>
       </w:r>
     </w:p>
     <w:p>
       <w:r>
-        <w:t>tools/soak_sim.cpp drives the real firmware logic through 8 simulated days: 691,040 polls, all answered, daily noise bursts rejected, silence gaps correctly red, the 32-bit millis() rollover crossed mid-run, and green-on-resume with no reset. Runs in 0.04 s as part of run_tests.sh.</w:t>
+        <w:t>tools/soak_sim.cpp drives the real firmware logic through 30 simulated days: 2,591,400 polls answered, 309,625 looped cycles, silence gaps correctly red, the 32-bit millis() rollover crossed mid-run, 30 NVS commits, and green-on-resume with no reset. Runs in under a second as part of run_tests.sh.</w:t>
       </w:r>
     </w:p>
     <w:p>
@@ -3603,6 +3795,14 @@
       </w:pPr>
       <w:r>
         <w:t>Carried-over v1.0 finding: reply checksums exclude the echoed command byte (FCDA, not FCD7) — so all canned replies are frozen literals, never recomputed at runtime.</w:t>
+      </w:r>
+    </w:p>
+    <w:p>
+      <w:pPr>
+        <w:pStyle w:val="ListBullet"/>
+      </w:pPr>
+      <w:r>
+        <w:t>7) v2.6 meter work: the first day-reset design read 0 all day until the first reseat (a seated unit now re-opens as #1 at once, empty bench stays 0); a boot must forget link edges or NVS totals double-count (begin() is total amnesia, totals overlay after); the emulator's STA-link switch never touched the bus LEDs, so the meter tests drove nothing until the dedicated /__bus control existed. All three are now covered by tests.</w:t>
       </w:r>
     </w:p>
     <w:p>
@@ -4037,7 +4237,41 @@
                 <w:b w:val="0"/>
                 <w:sz w:val="20"/>
               </w:rPr>
-              <w:t>Changed earlier? Ask who changed it. Else hold the box button 10 s (factory reset) → admin/admin123 back.</w:t>
+              <w:t>Changed earlier? Ask who changed it. Else hold the box button 10 s (factory reset) → admin123 back. (There is no login page — the password is asked only for reboot/reset/upload/saves.)</w:t>
+            </w:r>
+          </w:p>
+        </w:tc>
+      </w:tr>
+      <w:tr>
+        <w:tc>
+          <w:tcPr>
+            <w:tcW w:type="dxa" w:w="2304"/>
+          </w:tcPr>
+          <w:p>
+            <w:r/>
+            <w:r>
+              <w:rPr>
+                <w:rFonts w:ascii="Calibri" w:hAnsi="Calibri"/>
+                <w:b w:val="0"/>
+                <w:sz w:val="20"/>
+              </w:rPr>
+              <w:t>Meter count looks off</w:t>
+            </w:r>
+          </w:p>
+        </w:tc>
+        <w:tc>
+          <w:tcPr>
+            <w:tcW w:type="dxa" w:w="6624"/>
+          </w:tcPr>
+          <w:p>
+            <w:r/>
+            <w:r>
+              <w:rPr>
+                <w:rFonts w:ascii="Calibri" w:hAnsi="Calibri"/>
+                <w:b w:val="0"/>
+                <w:sz w:val="20"/>
+              </w:rPr>
+              <w:t>It is an estimate from link gaps, not a per-unit ID: a swap needs 3+ s of red before green returns; quick unplug-replug stays on the same meter. ‘New day (reset)’ clears the four numbers.</w:t>
             </w:r>
           </w:p>
         </w:tc>
@@ -4247,7 +4481,7 @@
                 <w:b w:val="0"/>
                 <w:sz w:val="20"/>
               </w:rPr>
-              <w:t>v2.4 program (frozen responder core).</w:t>
+              <w:t>v2.6 program (frozen responder core).</w:t>
             </w:r>
           </w:p>
         </w:tc>
@@ -4281,7 +4515,7 @@
                 <w:b w:val="0"/>
                 <w:sz w:val="20"/>
               </w:rPr>
-              <w:t>v2.4 relay bench + dashboard + update gates.</w:t>
+              <w:t>v2.6 relay bench + dashboard (meter estimate, round dots) + update gates.</w:t>
             </w:r>
           </w:p>
         </w:tc>
@@ -4315,7 +4549,7 @@
                 <w:b w:val="0"/>
                 <w:sz w:val="20"/>
               </w:rPr>
-              <w:t>2.3 (also baked into STATUS? replies).</w:t>
+              <w:t>2.6 (also baked into STATUS? replies).</w:t>
             </w:r>
           </w:p>
         </w:tc>
@@ -4349,7 +4583,7 @@
                 <w:b w:val="0"/>
                 <w:sz w:val="20"/>
               </w:rPr>
-              <w:t>Same v2.4 as an Arduino sketch + README (10 tabs).</w:t>
+              <w:t>Same v2.6 as an Arduino sketch + README (10 tabs).</w:t>
             </w:r>
           </w:p>
         </w:tc>
@@ -4367,7 +4601,7 @@
                 <w:b w:val="0"/>
                 <w:sz w:val="20"/>
               </w:rPr>
-              <w:t>firmware/*.bin + firmware-n16r8/*.bin</w:t>
+              <w:t>firmware/bms-tester-8mb.bin + firmware-n16r8/bms-tester-n16r8.bin</w:t>
             </w:r>
           </w:p>
         </w:tc>
@@ -4383,7 +4617,7 @@
                 <w:b w:val="0"/>
                 <w:sz w:val="20"/>
               </w:rPr>
-              <w:t>Ready-to-flash v2.4 binaries + flash READMEs with SHAs.</w:t>
+              <w:t>Ready-to-flash v2.6 merged images (one file per board) + separate files + flash READMEs with SHAs.</w:t>
             </w:r>
           </w:p>
         </w:tc>
@@ -4401,7 +4635,7 @@
                 <w:b w:val="0"/>
                 <w:sz w:val="20"/>
               </w:rPr>
-              <w:t>test/ (9 suites)</w:t>
+              <w:t>test/ (10 suites)</w:t>
             </w:r>
           </w:p>
         </w:tc>
@@ -4417,7 +4651,7 @@
                 <w:b w:val="0"/>
                 <w:sz w:val="20"/>
               </w:rPr>
-              <w:t>105 automated tests, all passing (incl. relay bench, OTA, website + 24 h sim).</w:t>
+              <w:t>152 automated tests, all passing (incl. meter heuristic, relay bench, OTA, website + 24 h sim).</w:t>
             </w:r>
           </w:p>
         </w:tc>
@@ -4451,7 +4685,75 @@
                 <w:b w:val="0"/>
                 <w:sz w:val="20"/>
               </w:rPr>
-              <w:t>8-day run: 691,040 polls answered, rollover crossed, no reset.</w:t>
+              <w:t>30-day run: 2,591,400 polls answered, rollover crossed, no reset.</w:t>
+            </w:r>
+          </w:p>
+        </w:tc>
+      </w:tr>
+      <w:tr>
+        <w:tc>
+          <w:tcPr>
+            <w:tcW w:type="dxa" w:w="3744"/>
+          </w:tcPr>
+          <w:p>
+            <w:r/>
+            <w:r>
+              <w:rPr>
+                <w:rFonts w:ascii="Calibri" w:hAnsi="Calibri"/>
+                <w:b w:val="0"/>
+                <w:sz w:val="20"/>
+              </w:rPr>
+              <w:t>tools/fw_emu/</w:t>
+            </w:r>
+          </w:p>
+        </w:tc>
+        <w:tc>
+          <w:tcPr>
+            <w:tcW w:type="dxa" w:w="5184"/>
+          </w:tcPr>
+          <w:p>
+            <w:r/>
+            <w:r>
+              <w:rPr>
+                <w:rFonts w:ascii="Calibri" w:hAnsi="Calibri"/>
+                <w:b w:val="0"/>
+                <w:sz w:val="20"/>
+              </w:rPr>
+              <w:t>Socket harness + drivers (62 checks) + 48 h run (10 checks) + /__bus control.</w:t>
+            </w:r>
+          </w:p>
+        </w:tc>
+      </w:tr>
+      <w:tr>
+        <w:tc>
+          <w:tcPr>
+            <w:tcW w:type="dxa" w:w="3744"/>
+          </w:tcPr>
+          <w:p>
+            <w:r/>
+            <w:r>
+              <w:rPr>
+                <w:rFonts w:ascii="Calibri" w:hAnsi="Calibri"/>
+                <w:b w:val="0"/>
+                <w:sz w:val="20"/>
+              </w:rPr>
+              <w:t>docs/CONFIG-SCHEMA.md</w:t>
+            </w:r>
+          </w:p>
+        </w:tc>
+        <w:tc>
+          <w:tcPr>
+            <w:tcW w:type="dxa" w:w="5184"/>
+          </w:tcPr>
+          <w:p>
+            <w:r/>
+            <w:r>
+              <w:rPr>
+                <w:rFonts w:ascii="Calibri" w:hAnsi="Calibri"/>
+                <w:b w:val="0"/>
+                <w:sz w:val="20"/>
+              </w:rPr>
+              <w:t>Sectioned config schema (v1+v2 backups) + meters.* rules.</w:t>
             </w:r>
           </w:p>
         </w:tc>
@@ -4791,7 +5093,7 @@
                 <w:b w:val="0"/>
                 <w:sz w:val="20"/>
               </w:rPr>
-              <w:t>Frozen v1.0 — untouched by v2.x work. Current release: v2.5.</w:t>
+              <w:t>Frozen v1.0 — untouched by v2.x work. Current release: v2.6.</w:t>
             </w:r>
           </w:p>
         </w:tc>
@@ -4808,7 +5110,7 @@
           <w:i/>
           <w:color w:val="595959"/>
         </w:rPr>
-        <w:t>— End of report v2.5. This document + the wiring table in §3 is all any electronics engineer needs to build, flash and maintain it. —</w:t>
+        <w:t>— End of report v2.6. This document + the wiring table in §3 is all any electronics engineer needs to build, flash and maintain it. —</w:t>
       </w:r>
     </w:p>
     <w:sectPr>
@@ -4834,7 +5136,7 @@
         <w:color w:val="595959"/>
         <w:sz w:val="18"/>
       </w:rPr>
-      <w:t xml:space="preserve">RS485 Connection Tester v2.5  —  Build &amp; Test Report   |   Page </w:t>
+      <w:t xml:space="preserve">RS485 Connection Tester v2.6  —  Build &amp; Test Report   |   Page </w:t>
     </w:r>
     <w:fldSimple w:instr="PAGE">
       <w:r/>

</xml_diff>